<commit_message>
TE4: audit fixes (single correct answer in Slip 1, label-in-name, numbered distractors, new Label 4 triangle, larger figure labels), audit notes, final support files and index
Co-Authored-By: Claude Opus 5.5 <noreply@anthropic.com>
Claude-Session: https://claude.ai/code/session_013Y8PfETWcMLvmUEpCdE8Wq
</commit_message>
<xml_diff>
--- a/support-materials/TE4/TE4_worked_examples.docx
+++ b/support-materials/TE4/TE4_worked_examples.docx
@@ -111,7 +111,7 @@
           <wp:inline distT="0" distB="0" distL="0" distR="0">
             <wp:extent cx="3762375" cy="2476500"/>
             <wp:effectExtent t="0" r="0" b="0" l="0"/>
-            <wp:docPr id="1" name="lb1" descr="A right triangle with vertices A, B, and C and sides labeled a, b, and c. Plotted data: a right triangle. Vertex A is at the bottom left, C at the bottom right, and B at the top right. A small square marks the corner at C, so the angle at C is 90°. Side b is the bottom side, joining A and C. Side a is the vertical side, joining C and B. Side c is the slanted side, joining A and B." title="A right triangle with vertices A, B, and C and sides labeled a, b, and c"/>
+            <wp:docPr id="1" name="lb1" descr="A right triangle with vertices A, B, and C and sides labeled a, b, and c. Plotted data: A right triangle. Vertex A is at the bottom left, C at the bottom right, and B at the top right. A small square marks the corner at C, so the angle at C is 90°. Side b is the bottom side, joining A and C. Side a is the vertical side, joining C and B. Side c is the slanted side, joining A and B." title="A right triangle with vertices A, B, and C and sides labeled a, b, and c"/>
             <wp:cNvGraphicFramePr>
               <a:graphicFrameLocks xmlns:a="http://schemas.openxmlformats.org/drawingml/2006/main" noChangeAspect="1"/>
             </wp:cNvGraphicFramePr>
@@ -165,7 +165,7 @@
           <w:sz w:val="22"/>
           <w:szCs w:val="22"/>
         </w:rPr>
-        <w:t xml:space="preserve">a right triangle. Vertex A is at the bottom left, C at the bottom right, and B at the top right. A small square marks the corner at C, so the angle at C is 90°. Side b is the bottom side, joining A and C. Side a is the vertical side, joining C and B. Side c is the slanted side, joining A and B.</w:t>
+        <w:t xml:space="preserve">A right triangle. Vertex A is at the bottom left, C at the bottom right, and B at the top right. A small square marks the corner at C, so the angle at C is 90°. Side b is the bottom side, joining A and C. Side a is the vertical side, joining C and B. Side c is the slanted side, joining A and B.</w:t>
       </w:r>
     </w:p>
     <w:p>
@@ -198,11 +198,7 @@
         <w:t xml:space="preserve">A.  </w:t>
       </w:r>
       <w:r>
-        <w:rPr>
-          <w:i/>
-          <w:iCs/>
-        </w:rPr>
-        <w:t xml:space="preserve">a</w:t>
+        <w:t xml:space="preserve">Side a</w:t>
       </w:r>
     </w:p>
     <w:p>
@@ -218,11 +214,7 @@
         <w:t xml:space="preserve">B.  </w:t>
       </w:r>
       <w:r>
-        <w:rPr>
-          <w:i/>
-          <w:iCs/>
-        </w:rPr>
-        <w:t xml:space="preserve">b</w:t>
+        <w:t xml:space="preserve">Side b</w:t>
       </w:r>
     </w:p>
     <w:p>
@@ -238,11 +230,7 @@
         <w:t xml:space="preserve">C.  </w:t>
       </w:r>
       <w:r>
-        <w:rPr>
-          <w:i/>
-          <w:iCs/>
-        </w:rPr>
-        <w:t xml:space="preserve">c</w:t>
+        <w:t xml:space="preserve">Side c</w:t>
       </w:r>
     </w:p>
     <w:p>
@@ -369,7 +357,7 @@
           <wp:inline distT="0" distB="0" distL="0" distR="0">
             <wp:extent cx="3771900" cy="2476500"/>
             <wp:effectExtent t="0" r="0" b="0" l="0"/>
-            <wp:docPr id="1" name="lb2" descr="A right triangle with vertices A, B, and C and sides labeled a, b, and c. Plotted data: a right triangle. Vertex A is at the bottom left, C at the bottom right, and B at the top right. A small square marks the corner at C, so the angle at C is 90°. Side b is the bottom side, joining A and C. Side a is the vertical side, joining C and B. Side c is the slanted side, joining A and B." title="A right triangle with vertices A, B, and C and sides labeled a, b, and c"/>
+            <wp:docPr id="1" name="lb2" descr="A right triangle with vertices A, B, and C and sides labeled a, b, and c. Plotted data: A right triangle. Vertex A is at the bottom left, C at the bottom right, and B at the top right. A small square marks the corner at C, so the angle at C is 90°. Side b is the bottom side, joining A and C. Side a is the vertical side, joining C and B. Side c is the slanted side, joining A and B." title="A right triangle with vertices A, B, and C and sides labeled a, b, and c"/>
             <wp:cNvGraphicFramePr>
               <a:graphicFrameLocks xmlns:a="http://schemas.openxmlformats.org/drawingml/2006/main" noChangeAspect="1"/>
             </wp:cNvGraphicFramePr>
@@ -423,7 +411,7 @@
           <w:sz w:val="22"/>
           <w:szCs w:val="22"/>
         </w:rPr>
-        <w:t xml:space="preserve">a right triangle. Vertex A is at the bottom left, C at the bottom right, and B at the top right. A small square marks the corner at C, so the angle at C is 90°. Side b is the bottom side, joining A and C. Side a is the vertical side, joining C and B. Side c is the slanted side, joining A and B.</w:t>
+        <w:t xml:space="preserve">A right triangle. Vertex A is at the bottom left, C at the bottom right, and B at the top right. A small square marks the corner at C, so the angle at C is 90°. Side b is the bottom side, joining A and C. Side a is the vertical side, joining C and B. Side c is the slanted side, joining A and B.</w:t>
       </w:r>
     </w:p>
     <w:p>
@@ -450,7 +438,7 @@
         <w:t xml:space="preserve">A</w:t>
       </w:r>
       <w:r>
-        <w:t xml:space="preserve">, the side across from it?</w:t>
+        <w:t xml:space="preserve">?</w:t>
       </w:r>
     </w:p>
     <w:p>
@@ -466,11 +454,7 @@
         <w:t xml:space="preserve">A.  </w:t>
       </w:r>
       <w:r>
-        <w:rPr>
-          <w:i/>
-          <w:iCs/>
-        </w:rPr>
-        <w:t xml:space="preserve">b</w:t>
+        <w:t xml:space="preserve">Side b</w:t>
       </w:r>
     </w:p>
     <w:p>
@@ -486,11 +470,7 @@
         <w:t xml:space="preserve">B.  </w:t>
       </w:r>
       <w:r>
-        <w:rPr>
-          <w:i/>
-          <w:iCs/>
-        </w:rPr>
-        <w:t xml:space="preserve">a</w:t>
+        <w:t xml:space="preserve">Side a</w:t>
       </w:r>
     </w:p>
     <w:p>
@@ -506,11 +486,7 @@
         <w:t xml:space="preserve">C.  </w:t>
       </w:r>
       <w:r>
-        <w:rPr>
-          <w:i/>
-          <w:iCs/>
-        </w:rPr>
-        <w:t xml:space="preserve">c</w:t>
+        <w:t xml:space="preserve">Side c</w:t>
       </w:r>
     </w:p>
     <w:p>
@@ -703,7 +679,7 @@
           <wp:inline distT="0" distB="0" distL="0" distR="0">
             <wp:extent cx="3771900" cy="2476500"/>
             <wp:effectExtent t="0" r="0" b="0" l="0"/>
-            <wp:docPr id="1" name="lb3" descr="A right triangle with vertices A, B, and C and sides labeled a, b, and c. Plotted data: a right triangle. Vertex A is at the bottom left, C at the bottom right, and B at the top right. A small square marks the corner at C, so the angle at C is 90°. Side b is the bottom side, joining A and C. Side a is the vertical side, joining C and B. Side c is the slanted side, joining A and B." title="A right triangle with vertices A, B, and C and sides labeled a, b, and c"/>
+            <wp:docPr id="1" name="lb3" descr="A right triangle with vertices A, B, and C and sides labeled a, b, and c. Plotted data: A right triangle. Vertex A is at the bottom left, C at the bottom right, and B at the top right. A small square marks the corner at C, so the angle at C is 90°. Side b is the bottom side, joining A and C. Side a is the vertical side, joining C and B. Side c is the slanted side, joining A and B." title="A right triangle with vertices A, B, and C and sides labeled a, b, and c"/>
             <wp:cNvGraphicFramePr>
               <a:graphicFrameLocks xmlns:a="http://schemas.openxmlformats.org/drawingml/2006/main" noChangeAspect="1"/>
             </wp:cNvGraphicFramePr>
@@ -757,7 +733,7 @@
           <w:sz w:val="22"/>
           <w:szCs w:val="22"/>
         </w:rPr>
-        <w:t xml:space="preserve">a right triangle. Vertex A is at the bottom left, C at the bottom right, and B at the top right. A small square marks the corner at C, so the angle at C is 90°. Side b is the bottom side, joining A and C. Side a is the vertical side, joining C and B. Side c is the slanted side, joining A and B.</w:t>
+        <w:t xml:space="preserve">A right triangle. Vertex A is at the bottom left, C at the bottom right, and B at the top right. A small square marks the corner at C, so the angle at C is 90°. Side b is the bottom side, joining A and C. Side a is the vertical side, joining C and B. Side c is the slanted side, joining A and B.</w:t>
       </w:r>
     </w:p>
     <w:p>
@@ -1026,7 +1002,7 @@
           <w:sz w:val="40"/>
           <w:szCs w:val="40"/>
         </w:rPr>
-        <w:t xml:space="preserve">,    A=35</w:t>
+        <w:t xml:space="preserve">,    A=50</w:t>
       </w:r>
       <w:r>
         <w:rPr>
@@ -1045,7 +1021,7 @@
           <w:sz w:val="40"/>
           <w:szCs w:val="40"/>
         </w:rPr>
-        <w:t xml:space="preserve">,    c=12</w:t>
+        <w:t xml:space="preserve">,    c=8</w:t>
       </w:r>
     </w:p>
     <w:p>
@@ -1092,7 +1068,7 @@
           <w:i/>
           <w:iCs/>
         </w:rPr>
-        <w:t xml:space="preserve">a=12</w:t>
+        <w:t xml:space="preserve">a=8</w:t>
       </w:r>
       <w:r>
         <w:t xml:space="preserve">sin</w:t>
@@ -1102,7 +1078,7 @@
           <w:i/>
           <w:iCs/>
         </w:rPr>
-        <w:t xml:space="preserve"> 35</w:t>
+        <w:t xml:space="preserve"> 50</w:t>
       </w:r>
       <w:r>
         <w:rPr>
@@ -1130,7 +1106,7 @@
           <w:i/>
           <w:iCs/>
         </w:rPr>
-        <w:t xml:space="preserve">a=12</w:t>
+        <w:t xml:space="preserve">a=8</w:t>
       </w:r>
       <w:r>
         <w:t xml:space="preserve">cos</w:t>
@@ -1140,7 +1116,7 @@
           <w:i/>
           <w:iCs/>
         </w:rPr>
-        <w:t xml:space="preserve"> 35</w:t>
+        <w:t xml:space="preserve"> 50</w:t>
       </w:r>
       <w:r>
         <w:rPr>
@@ -1168,7 +1144,7 @@
           <w:i/>
           <w:iCs/>
         </w:rPr>
-        <w:t xml:space="preserve">a=12/(</w:t>
+        <w:t xml:space="preserve">a=8/(</w:t>
       </w:r>
       <w:r>
         <w:t xml:space="preserve">sin</w:t>
@@ -1178,7 +1154,7 @@
           <w:i/>
           <w:iCs/>
         </w:rPr>
-        <w:t xml:space="preserve"> 35</w:t>
+        <w:t xml:space="preserve"> 50</w:t>
       </w:r>
       <w:r>
         <w:rPr>
@@ -1213,7 +1189,7 @@
           <w:i/>
           <w:iCs/>
         </w:rPr>
-        <w:t xml:space="preserve">a=12</w:t>
+        <w:t xml:space="preserve">a=8</w:t>
       </w:r>
       <w:r>
         <w:t xml:space="preserve">tan</w:t>
@@ -1223,7 +1199,7 @@
           <w:i/>
           <w:iCs/>
         </w:rPr>
-        <w:t xml:space="preserve"> 35</w:t>
+        <w:t xml:space="preserve"> 50</w:t>
       </w:r>
       <w:r>
         <w:rPr>
@@ -1275,7 +1251,7 @@
           <w:i/>
           <w:iCs/>
         </w:rPr>
-        <w:t xml:space="preserve">c=12</w:t>
+        <w:t xml:space="preserve">c=8</w:t>
       </w:r>
       <w:r>
         <w:t xml:space="preserve"> is the hypotenuse. Opposite and hypotenuse means sine: </w:t>
@@ -1288,7 +1264,7 @@
           <w:i/>
           <w:iCs/>
         </w:rPr>
-        <w:t xml:space="preserve"> 35</w:t>
+        <w:t xml:space="preserve"> 50</w:t>
       </w:r>
       <w:r>
         <w:rPr>
@@ -1303,10 +1279,10 @@
           <w:i/>
           <w:iCs/>
         </w:rPr>
-        <w:t xml:space="preserve">=a/12</w:t>
-      </w:r>
-      <w:r>
-        <w:t xml:space="preserve">. Multiply both sides by 12. Cosine would find </w:t>
+        <w:t xml:space="preserve">=a/8</w:t>
+      </w:r>
+      <w:r>
+        <w:t xml:space="preserve">. Multiply both sides by 8. Cosine would find </w:t>
       </w:r>
       <w:r>
         <w:rPr>
@@ -1325,7 +1301,7 @@
           <w:i/>
           <w:iCs/>
         </w:rPr>
-        <w:t xml:space="preserve">a=12</w:t>
+        <w:t xml:space="preserve">a=8</w:t>
       </w:r>
       <w:r>
         <w:rPr>
@@ -1341,7 +1317,7 @@
           <w:i/>
           <w:iCs/>
         </w:rPr>
-        <w:t xml:space="preserve"> 35</w:t>
+        <w:t xml:space="preserve"> 50</w:t>
       </w:r>
       <w:r>
         <w:rPr>
@@ -1463,11 +1439,7 @@
         <w:t xml:space="preserve">A.  </w:t>
       </w:r>
       <w:r>
-        <w:rPr>
-          <w:i/>
-          <w:iCs/>
-        </w:rPr>
-        <w:t xml:space="preserve">a≈ 9.8</w:t>
+        <w:t xml:space="preserve">about 9.8</w:t>
       </w:r>
     </w:p>
     <w:p>
@@ -1483,11 +1455,7 @@
         <w:t xml:space="preserve">B.  </w:t>
       </w:r>
       <w:r>
-        <w:rPr>
-          <w:i/>
-          <w:iCs/>
-        </w:rPr>
-        <w:t xml:space="preserve">a≈ 6.9</w:t>
+        <w:t xml:space="preserve">about 6.9</w:t>
       </w:r>
     </w:p>
     <w:p>
@@ -1503,11 +1471,7 @@
         <w:t xml:space="preserve">C.  </w:t>
       </w:r>
       <w:r>
-        <w:rPr>
-          <w:i/>
-          <w:iCs/>
-        </w:rPr>
-        <w:t xml:space="preserve">a≈ −5.1</w:t>
+        <w:t xml:space="preserve">about −5.1</w:t>
       </w:r>
     </w:p>
     <w:p>
@@ -1523,11 +1487,7 @@
         <w:t xml:space="preserve">D.  </w:t>
       </w:r>
       <w:r>
-        <w:rPr>
-          <w:i/>
-          <w:iCs/>
-        </w:rPr>
-        <w:t xml:space="preserve">a≈ 20.9</w:t>
+        <w:t xml:space="preserve">about 20.9</w:t>
       </w:r>
     </w:p>
     <w:p>
@@ -1798,11 +1758,7 @@
         <w:t xml:space="preserve">A.  </w:t>
       </w:r>
       <w:r>
-        <w:rPr>
-          <w:i/>
-          <w:iCs/>
-        </w:rPr>
-        <w:t xml:space="preserve">b≈ 3.7</w:t>
+        <w:t xml:space="preserve">about 3.7</w:t>
       </w:r>
     </w:p>
     <w:p>
@@ -1818,11 +1774,7 @@
         <w:t xml:space="preserve">B.  </w:t>
       </w:r>
       <w:r>
-        <w:rPr>
-          <w:i/>
-          <w:iCs/>
-        </w:rPr>
-        <w:t xml:space="preserve">b≈ 6.2</w:t>
+        <w:t xml:space="preserve">about 6.2</w:t>
       </w:r>
     </w:p>
     <w:p>
@@ -1838,11 +1790,7 @@
         <w:t xml:space="preserve">C.  </w:t>
       </w:r>
       <w:r>
-        <w:rPr>
-          <w:i/>
-          <w:iCs/>
-        </w:rPr>
-        <w:t xml:space="preserve">b≈ 14.9</w:t>
+        <w:t xml:space="preserve">about 14.9</w:t>
       </w:r>
     </w:p>
     <w:p>
@@ -1858,11 +1806,7 @@
         <w:t xml:space="preserve">D.  </w:t>
       </w:r>
       <w:r>
-        <w:rPr>
-          <w:i/>
-          <w:iCs/>
-        </w:rPr>
-        <w:t xml:space="preserve">b≈ 13.2</w:t>
+        <w:t xml:space="preserve">about 13.2</w:t>
       </w:r>
     </w:p>
     <w:p>
@@ -2141,11 +2085,7 @@
         <w:t xml:space="preserve">A.  </w:t>
       </w:r>
       <w:r>
-        <w:rPr>
-          <w:i/>
-          <w:iCs/>
-        </w:rPr>
-        <w:t xml:space="preserve">c≈ 16.0</w:t>
+        <w:t xml:space="preserve">about 16.0</w:t>
       </w:r>
     </w:p>
     <w:p>
@@ -2161,11 +2101,7 @@
         <w:t xml:space="preserve">B.  </w:t>
       </w:r>
       <w:r>
-        <w:rPr>
-          <w:i/>
-          <w:iCs/>
-        </w:rPr>
-        <w:t xml:space="preserve">c≈ 14.1</w:t>
+        <w:t xml:space="preserve">about 14.1</w:t>
       </w:r>
     </w:p>
     <w:p>
@@ -2181,11 +2117,7 @@
         <w:t xml:space="preserve">C.  </w:t>
       </w:r>
       <w:r>
-        <w:rPr>
-          <w:i/>
-          <w:iCs/>
-        </w:rPr>
-        <w:t xml:space="preserve">c≈ 43.9</w:t>
+        <w:t xml:space="preserve">about 43.9</w:t>
       </w:r>
     </w:p>
     <w:p>
@@ -2201,11 +2133,7 @@
         <w:t xml:space="preserve">D.  </w:t>
       </w:r>
       <w:r>
-        <w:rPr>
-          <w:i/>
-          <w:iCs/>
-        </w:rPr>
-        <w:t xml:space="preserve">c≈ 5.1</w:t>
+        <w:t xml:space="preserve">about 5.1</w:t>
       </w:r>
     </w:p>
     <w:p>
@@ -2446,11 +2374,7 @@
         <w:t xml:space="preserve">A.  </w:t>
       </w:r>
       <w:r>
-        <w:rPr>
-          <w:i/>
-          <w:iCs/>
-        </w:rPr>
-        <w:t xml:space="preserve">c≈ 5.0</w:t>
+        <w:t xml:space="preserve">about 5.0</w:t>
       </w:r>
     </w:p>
     <w:p>
@@ -2466,11 +2390,7 @@
         <w:t xml:space="preserve">B.  </w:t>
       </w:r>
       <w:r>
-        <w:rPr>
-          <w:i/>
-          <w:iCs/>
-        </w:rPr>
-        <w:t xml:space="preserve">c≈ 21.6</w:t>
+        <w:t xml:space="preserve">about 21.6</w:t>
       </w:r>
     </w:p>
     <w:p>
@@ -2486,11 +2406,7 @@
         <w:t xml:space="preserve">C.  </w:t>
       </w:r>
       <w:r>
-        <w:rPr>
-          <w:i/>
-          <w:iCs/>
-        </w:rPr>
-        <w:t xml:space="preserve">c≈ 24.2</w:t>
+        <w:t xml:space="preserve">about 24.2</w:t>
       </w:r>
     </w:p>
     <w:p>
@@ -2506,11 +2422,7 @@
         <w:t xml:space="preserve">D.  </w:t>
       </w:r>
       <w:r>
-        <w:rPr>
-          <w:i/>
-          <w:iCs/>
-        </w:rPr>
-        <w:t xml:space="preserve">c≈ 12.3</w:t>
+        <w:t xml:space="preserve">about 12.3</w:t>
       </w:r>
     </w:p>
     <w:p>
@@ -2740,11 +2652,7 @@
         <w:t xml:space="preserve">A.  </w:t>
       </w:r>
       <w:r>
-        <w:rPr>
-          <w:i/>
-          <w:iCs/>
-        </w:rPr>
-        <w:t xml:space="preserve">c=23</w:t>
+        <w:t xml:space="preserve">23</w:t>
       </w:r>
     </w:p>
     <w:p>
@@ -2760,11 +2668,7 @@
         <w:t xml:space="preserve">B.  </w:t>
       </w:r>
       <w:r>
-        <w:rPr>
-          <w:i/>
-          <w:iCs/>
-        </w:rPr>
-        <w:t xml:space="preserve">c=17</w:t>
+        <w:t xml:space="preserve">17</w:t>
       </w:r>
     </w:p>
     <w:p>
@@ -2780,11 +2684,7 @@
         <w:t xml:space="preserve">C.  </w:t>
       </w:r>
       <w:r>
-        <w:rPr>
-          <w:i/>
-          <w:iCs/>
-        </w:rPr>
-        <w:t xml:space="preserve">c≈ 12.7</w:t>
+        <w:t xml:space="preserve">about 12.7</w:t>
       </w:r>
     </w:p>
     <w:p>
@@ -2800,11 +2700,7 @@
         <w:t xml:space="preserve">D.  </w:t>
       </w:r>
       <w:r>
-        <w:rPr>
-          <w:i/>
-          <w:iCs/>
-        </w:rPr>
-        <w:t xml:space="preserve">c=7</w:t>
+        <w:t xml:space="preserve">7</w:t>
       </w:r>
     </w:p>
     <w:p>
@@ -2998,11 +2894,7 @@
         <w:t xml:space="preserve">A.  </w:t>
       </w:r>
       <w:r>
-        <w:rPr>
-          <w:i/>
-          <w:iCs/>
-        </w:rPr>
-        <w:t xml:space="preserve">b≈ 35.2</w:t>
+        <w:t xml:space="preserve">about 35.2</w:t>
       </w:r>
     </w:p>
     <w:p>
@@ -3018,11 +2910,7 @@
         <w:t xml:space="preserve">B.  </w:t>
       </w:r>
       <w:r>
-        <w:rPr>
-          <w:i/>
-          <w:iCs/>
-        </w:rPr>
-        <w:t xml:space="preserve">b=9</w:t>
+        <w:t xml:space="preserve">9</w:t>
       </w:r>
     </w:p>
     <w:p>
@@ -3038,11 +2926,7 @@
         <w:t xml:space="preserve">C.  </w:t>
       </w:r>
       <w:r>
-        <w:rPr>
-          <w:i/>
-          <w:iCs/>
-        </w:rPr>
-        <w:t xml:space="preserve">b=21</w:t>
+        <w:t xml:space="preserve">21</w:t>
       </w:r>
     </w:p>
     <w:p>
@@ -3058,11 +2942,7 @@
         <w:t xml:space="preserve">D.  </w:t>
       </w:r>
       <w:r>
-        <w:rPr>
-          <w:i/>
-          <w:iCs/>
-        </w:rPr>
-        <w:t xml:space="preserve">b=3</w:t>
+        <w:t xml:space="preserve">3</w:t>
       </w:r>
     </w:p>
     <w:p>
@@ -3266,19 +3146,7 @@
         <w:t xml:space="preserve">A.  </w:t>
       </w:r>
       <w:r>
-        <w:rPr>
-          <w:i/>
-          <w:iCs/>
-        </w:rPr>
-        <w:t xml:space="preserve">A≈ 61.9</w:t>
-      </w:r>
-      <w:r>
-        <w:rPr>
-          <w:i/>
-          <w:iCs/>
-          <w:vertAlign w:val="superscript"/>
-        </w:rPr>
-        <w:t xml:space="preserve">°</w:t>
+        <w:t xml:space="preserve">about 61.9°</w:t>
       </w:r>
     </w:p>
     <w:p>
@@ -3294,19 +3162,7 @@
         <w:t xml:space="preserve">B.  </w:t>
       </w:r>
       <w:r>
-        <w:rPr>
-          <w:i/>
-          <w:iCs/>
-        </w:rPr>
-        <w:t xml:space="preserve">A≈ 0.5</w:t>
-      </w:r>
-      <w:r>
-        <w:rPr>
-          <w:i/>
-          <w:iCs/>
-          <w:vertAlign w:val="superscript"/>
-        </w:rPr>
-        <w:t xml:space="preserve">°</w:t>
+        <w:t xml:space="preserve">about 0.5°</w:t>
       </w:r>
     </w:p>
     <w:p>
@@ -3322,19 +3178,7 @@
         <w:t xml:space="preserve">C.  </w:t>
       </w:r>
       <w:r>
-        <w:rPr>
-          <w:i/>
-          <w:iCs/>
-        </w:rPr>
-        <w:t xml:space="preserve">A≈ 32.2</w:t>
-      </w:r>
-      <w:r>
-        <w:rPr>
-          <w:i/>
-          <w:iCs/>
-          <w:vertAlign w:val="superscript"/>
-        </w:rPr>
-        <w:t xml:space="preserve">°</w:t>
+        <w:t xml:space="preserve">about 32.2°</w:t>
       </w:r>
     </w:p>
     <w:p>
@@ -3350,19 +3194,7 @@
         <w:t xml:space="preserve">D.  </w:t>
       </w:r>
       <w:r>
-        <w:rPr>
-          <w:i/>
-          <w:iCs/>
-        </w:rPr>
-        <w:t xml:space="preserve">A≈ 28.1</w:t>
-      </w:r>
-      <w:r>
-        <w:rPr>
-          <w:i/>
-          <w:iCs/>
-          <w:vertAlign w:val="superscript"/>
-        </w:rPr>
-        <w:t xml:space="preserve">°</w:t>
+        <w:t xml:space="preserve">about 28.1°</w:t>
       </w:r>
     </w:p>
     <w:p>
@@ -3580,19 +3412,7 @@
         <w:t xml:space="preserve">A.  </w:t>
       </w:r>
       <w:r>
-        <w:rPr>
-          <w:i/>
-          <w:iCs/>
-        </w:rPr>
-        <w:t xml:space="preserve">A≈ 16.3</w:t>
-      </w:r>
-      <w:r>
-        <w:rPr>
-          <w:i/>
-          <w:iCs/>
-          <w:vertAlign w:val="superscript"/>
-        </w:rPr>
-        <w:t xml:space="preserve">°</w:t>
+        <w:t xml:space="preserve">about 16.3°</w:t>
       </w:r>
     </w:p>
     <w:p>
@@ -3608,19 +3428,7 @@
         <w:t xml:space="preserve">B.  </w:t>
       </w:r>
       <w:r>
-        <w:rPr>
-          <w:i/>
-          <w:iCs/>
-        </w:rPr>
-        <w:t xml:space="preserve">A≈ 73.7</w:t>
-      </w:r>
-      <w:r>
-        <w:rPr>
-          <w:i/>
-          <w:iCs/>
-          <w:vertAlign w:val="superscript"/>
-        </w:rPr>
-        <w:t xml:space="preserve">°</w:t>
+        <w:t xml:space="preserve">about 73.7°</w:t>
       </w:r>
     </w:p>
     <w:p>
@@ -3636,19 +3444,7 @@
         <w:t xml:space="preserve">C.  </w:t>
       </w:r>
       <w:r>
-        <w:rPr>
-          <w:i/>
-          <w:iCs/>
-        </w:rPr>
-        <w:t xml:space="preserve">A≈ 43.8</w:t>
-      </w:r>
-      <w:r>
-        <w:rPr>
-          <w:i/>
-          <w:iCs/>
-          <w:vertAlign w:val="superscript"/>
-        </w:rPr>
-        <w:t xml:space="preserve">°</w:t>
+        <w:t xml:space="preserve">about 43.8°</w:t>
       </w:r>
     </w:p>
     <w:p>
@@ -3664,19 +3460,7 @@
         <w:t xml:space="preserve">D.  </w:t>
       </w:r>
       <w:r>
-        <w:rPr>
-          <w:i/>
-          <w:iCs/>
-        </w:rPr>
-        <w:t xml:space="preserve">A≈ 0.3</w:t>
-      </w:r>
-      <w:r>
-        <w:rPr>
-          <w:i/>
-          <w:iCs/>
-          <w:vertAlign w:val="superscript"/>
-        </w:rPr>
-        <w:t xml:space="preserve">°</w:t>
+        <w:t xml:space="preserve">about 0.3°</w:t>
       </w:r>
     </w:p>
     <w:p>
@@ -3978,7 +3762,7 @@
         <w:t xml:space="preserve">C.  </w:t>
       </w:r>
       <w:r>
-        <w:t xml:space="preserve">The 10 should be divided by the cosine of 40, not multiplied.</w:t>
+        <w:t xml:space="preserve">The 10 should be divided by the cosine of 40, about 13.1.</w:t>
       </w:r>
     </w:p>
     <w:p>
@@ -3994,7 +3778,7 @@
         <w:t xml:space="preserve">D.  </w:t>
       </w:r>
       <w:r>
-        <w:t xml:space="preserve">Angle B, which is 50 degrees, should have been used instead.</w:t>
+        <w:t xml:space="preserve">The angle should be 50 degrees, with sine: about 7.7.</w:t>
       </w:r>
     </w:p>
     <w:p>
@@ -4242,7 +4026,7 @@
         <w:t xml:space="preserve">A.  </w:t>
       </w:r>
       <w:r>
-        <w:t xml:space="preserve">The squares should be multiplied together, not added.</w:t>
+        <w:t xml:space="preserve">The 6 and 10 should be multiplied first: about 7.7.</w:t>
       </w:r>
     </w:p>
     <w:p>
@@ -4258,7 +4042,7 @@
         <w:t xml:space="preserve">B.  </w:t>
       </w:r>
       <w:r>
-        <w:t xml:space="preserve">The square root was not needed at the end.</w:t>
+        <w:t xml:space="preserve">No square root was needed, so b is 136.</w:t>
       </w:r>
     </w:p>
     <w:p>
@@ -4887,7 +4671,7 @@
         <w:t xml:space="preserve">A.  </w:t>
       </w:r>
       <w:r>
-        <w:t xml:space="preserve">Side a needs cosine here, not sine.</w:t>
+        <w:t xml:space="preserve">Side a needs cosine here: about 8.7.</w:t>
       </w:r>
     </w:p>
     <w:p>
@@ -4919,7 +4703,7 @@
         <w:t xml:space="preserve">C.  </w:t>
       </w:r>
       <w:r>
-        <w:t xml:space="preserve">The 10 should be divided by the sine instead.</w:t>
+        <w:t xml:space="preserve">The 10 should be divided by the sine: a is 20.</w:t>
       </w:r>
     </w:p>
     <w:p>

</xml_diff>

<commit_message>
TE4: labeled triangle for each item on the Angle-and-Side and Two-Sides tabs
Co-Authored-By: Claude Opus 5.5 <noreply@anthropic.com>
Claude-Session: https://claude.ai/code/session_013Y8PfETWcMLvmUEpCdE8Wq
</commit_message>
<xml_diff>
--- a/support-materials/TE4/TE4_worked_examples.docx
+++ b/support-materials/TE4/TE4_worked_examples.docx
@@ -1348,6 +1348,72 @@
     </w:p>
     <w:p>
       <w:pPr>
+        <w:spacing w:after="60" w:before="60"/>
+      </w:pPr>
+      <w:r>
+        <w:drawing>
+          <wp:inline distT="0" distB="0" distL="0" distR="0">
+            <wp:extent cx="4171950" cy="2476500"/>
+            <wp:effectExtent t="0" r="0" b="0" l="0"/>
+            <wp:docPr id="1" name="as1" descr="A right triangle marked with angle A = 35°, c = 12, and a = ?. Plotted data: Triangle ABC, not drawn to scale. Vertex A is at the bottom left, C at the bottom right, and B at the top right, with a square marking the 90° angle at C. Side b is the bottom side, side a is the vertical side, and side c is the slanted side. Angle A is marked 35°. Side c is marked 12. Side a is marked with a question mark." title="A right triangle marked with angle A = 35°, c = 12, and a = ?"/>
+            <wp:cNvGraphicFramePr>
+              <a:graphicFrameLocks xmlns:a="http://schemas.openxmlformats.org/drawingml/2006/main" noChangeAspect="1"/>
+            </wp:cNvGraphicFramePr>
+            <a:graphic xmlns:a="http://schemas.openxmlformats.org/drawingml/2006/main">
+              <a:graphicData uri="http://schemas.openxmlformats.org/drawingml/2006/picture">
+                <pic:pic xmlns:pic="http://schemas.openxmlformats.org/drawingml/2006/picture">
+                  <pic:nvPicPr>
+                    <pic:cNvPr id="0" name="" descr=""/>
+                    <pic:cNvPicPr>
+                      <a:picLocks noChangeAspect="1" noChangeArrowheads="1"/>
+                    </pic:cNvPicPr>
+                  </pic:nvPicPr>
+                  <pic:blipFill>
+                    <a:blip r:embed="rId12" cstate="none"/>
+                    <a:srcRect/>
+                    <a:stretch>
+                      <a:fillRect/>
+                    </a:stretch>
+                  </pic:blipFill>
+                  <pic:spPr bwMode="auto">
+                    <a:xfrm>
+                      <a:off x="0" y="0"/>
+                      <a:ext cx="4171950" cy="2476500"/>
+                    </a:xfrm>
+                    <a:prstGeom prst="rect">
+                      <a:avLst/>
+                    </a:prstGeom>
+                  </pic:spPr>
+                </pic:pic>
+              </a:graphicData>
+            </a:graphic>
+          </wp:inline>
+        </w:drawing>
+      </w:r>
+    </w:p>
+    <w:p>
+      <w:pPr>
+        <w:spacing w:after="120" w:before="80" w:line="300"/>
+      </w:pPr>
+      <w:r>
+        <w:rPr>
+          <w:b/>
+          <w:bCs/>
+          <w:sz w:val="22"/>
+          <w:szCs w:val="22"/>
+        </w:rPr>
+        <w:t xml:space="preserve">Plotted data: </w:t>
+      </w:r>
+      <w:r>
+        <w:rPr>
+          <w:sz w:val="22"/>
+          <w:szCs w:val="22"/>
+        </w:rPr>
+        <w:t xml:space="preserve">Triangle ABC, not drawn to scale. Vertex A is at the bottom left, C at the bottom right, and B at the top right, with a square marking the 90° angle at C. Side b is the bottom side, side a is the vertical side, and side c is the slanted side. Angle A is marked 35°. Side c is marked 12. Side a is marked with a question mark.</w:t>
+      </w:r>
+    </w:p>
+    <w:p>
+      <w:pPr>
         <w:spacing w:after="200" w:before="200"/>
         <w:jc w:val="center"/>
       </w:pPr>
@@ -1667,6 +1733,72 @@
     </w:p>
     <w:p>
       <w:pPr>
+        <w:spacing w:after="60" w:before="60"/>
+      </w:pPr>
+      <w:r>
+        <w:drawing>
+          <wp:inline distT="0" distB="0" distL="0" distR="0">
+            <wp:extent cx="4171950" cy="2476500"/>
+            <wp:effectExtent t="0" r="0" b="0" l="0"/>
+            <wp:docPr id="1" name="as2" descr="A right triangle marked with angle B = 62°, a = 7, and b = ?. Plotted data: Triangle ABC, not drawn to scale. Vertex A is at the bottom left, C at the bottom right, and B at the top right, with a square marking the 90° angle at C. Side b is the bottom side, side a is the vertical side, and side c is the slanted side. Angle B is marked 62°. Side a is marked 7. Side b is marked with a question mark." title="A right triangle marked with angle B = 62°, a = 7, and b = ?"/>
+            <wp:cNvGraphicFramePr>
+              <a:graphicFrameLocks xmlns:a="http://schemas.openxmlformats.org/drawingml/2006/main" noChangeAspect="1"/>
+            </wp:cNvGraphicFramePr>
+            <a:graphic xmlns:a="http://schemas.openxmlformats.org/drawingml/2006/main">
+              <a:graphicData uri="http://schemas.openxmlformats.org/drawingml/2006/picture">
+                <pic:pic xmlns:pic="http://schemas.openxmlformats.org/drawingml/2006/picture">
+                  <pic:nvPicPr>
+                    <pic:cNvPr id="0" name="" descr=""/>
+                    <pic:cNvPicPr>
+                      <a:picLocks noChangeAspect="1" noChangeArrowheads="1"/>
+                    </pic:cNvPicPr>
+                  </pic:nvPicPr>
+                  <pic:blipFill>
+                    <a:blip r:embed="rId13" cstate="none"/>
+                    <a:srcRect/>
+                    <a:stretch>
+                      <a:fillRect/>
+                    </a:stretch>
+                  </pic:blipFill>
+                  <pic:spPr bwMode="auto">
+                    <a:xfrm>
+                      <a:off x="0" y="0"/>
+                      <a:ext cx="4171950" cy="2476500"/>
+                    </a:xfrm>
+                    <a:prstGeom prst="rect">
+                      <a:avLst/>
+                    </a:prstGeom>
+                  </pic:spPr>
+                </pic:pic>
+              </a:graphicData>
+            </a:graphic>
+          </wp:inline>
+        </w:drawing>
+      </w:r>
+    </w:p>
+    <w:p>
+      <w:pPr>
+        <w:spacing w:after="120" w:before="80" w:line="300"/>
+      </w:pPr>
+      <w:r>
+        <w:rPr>
+          <w:b/>
+          <w:bCs/>
+          <w:sz w:val="22"/>
+          <w:szCs w:val="22"/>
+        </w:rPr>
+        <w:t xml:space="preserve">Plotted data: </w:t>
+      </w:r>
+      <w:r>
+        <w:rPr>
+          <w:sz w:val="22"/>
+          <w:szCs w:val="22"/>
+        </w:rPr>
+        <w:t xml:space="preserve">Triangle ABC, not drawn to scale. Vertex A is at the bottom left, C at the bottom right, and B at the top right, with a square marking the 90° angle at C. Side b is the bottom side, side a is the vertical side, and side c is the slanted side. Angle B is marked 62°. Side a is marked 7. Side b is marked with a question mark.</w:t>
+      </w:r>
+    </w:p>
+    <w:p>
+      <w:pPr>
         <w:spacing w:after="200" w:before="200"/>
         <w:jc w:val="center"/>
       </w:pPr>
@@ -1994,6 +2126,72 @@
     </w:p>
     <w:p>
       <w:pPr>
+        <w:spacing w:after="60" w:before="60"/>
+      </w:pPr>
+      <w:r>
+        <w:drawing>
+          <wp:inline distT="0" distB="0" distL="0" distR="0">
+            <wp:extent cx="4171950" cy="2476500"/>
+            <wp:effectExtent t="0" r="0" b="0" l="0"/>
+            <wp:docPr id="1" name="as3" descr="A right triangle marked with angle A = 20°, b = 15, and c = ?. Plotted data: Triangle ABC, not drawn to scale. Vertex A is at the bottom left, C at the bottom right, and B at the top right, with a square marking the 90° angle at C. Side b is the bottom side, side a is the vertical side, and side c is the slanted side. Angle A is marked 20°. Side b is marked 15. Side c is marked with a question mark." title="A right triangle marked with angle A = 20°, b = 15, and c = ?"/>
+            <wp:cNvGraphicFramePr>
+              <a:graphicFrameLocks xmlns:a="http://schemas.openxmlformats.org/drawingml/2006/main" noChangeAspect="1"/>
+            </wp:cNvGraphicFramePr>
+            <a:graphic xmlns:a="http://schemas.openxmlformats.org/drawingml/2006/main">
+              <a:graphicData uri="http://schemas.openxmlformats.org/drawingml/2006/picture">
+                <pic:pic xmlns:pic="http://schemas.openxmlformats.org/drawingml/2006/picture">
+                  <pic:nvPicPr>
+                    <pic:cNvPr id="0" name="" descr=""/>
+                    <pic:cNvPicPr>
+                      <a:picLocks noChangeAspect="1" noChangeArrowheads="1"/>
+                    </pic:cNvPicPr>
+                  </pic:nvPicPr>
+                  <pic:blipFill>
+                    <a:blip r:embed="rId14" cstate="none"/>
+                    <a:srcRect/>
+                    <a:stretch>
+                      <a:fillRect/>
+                    </a:stretch>
+                  </pic:blipFill>
+                  <pic:spPr bwMode="auto">
+                    <a:xfrm>
+                      <a:off x="0" y="0"/>
+                      <a:ext cx="4171950" cy="2476500"/>
+                    </a:xfrm>
+                    <a:prstGeom prst="rect">
+                      <a:avLst/>
+                    </a:prstGeom>
+                  </pic:spPr>
+                </pic:pic>
+              </a:graphicData>
+            </a:graphic>
+          </wp:inline>
+        </w:drawing>
+      </w:r>
+    </w:p>
+    <w:p>
+      <w:pPr>
+        <w:spacing w:after="120" w:before="80" w:line="300"/>
+      </w:pPr>
+      <w:r>
+        <w:rPr>
+          <w:b/>
+          <w:bCs/>
+          <w:sz w:val="22"/>
+          <w:szCs w:val="22"/>
+        </w:rPr>
+        <w:t xml:space="preserve">Plotted data: </w:t>
+      </w:r>
+      <w:r>
+        <w:rPr>
+          <w:sz w:val="22"/>
+          <w:szCs w:val="22"/>
+        </w:rPr>
+        <w:t xml:space="preserve">Triangle ABC, not drawn to scale. Vertex A is at the bottom left, C at the bottom right, and B at the top right, with a square marking the 90° angle at C. Side b is the bottom side, side a is the vertical side, and side c is the slanted side. Angle A is marked 20°. Side b is marked 15. Side c is marked with a question mark.</w:t>
+      </w:r>
+    </w:p>
+    <w:p>
+      <w:pPr>
         <w:spacing w:after="200" w:before="200"/>
         <w:jc w:val="center"/>
       </w:pPr>
@@ -2283,6 +2481,72 @@
     </w:p>
     <w:p>
       <w:pPr>
+        <w:spacing w:after="60" w:before="60"/>
+      </w:pPr>
+      <w:r>
+        <w:drawing>
+          <wp:inline distT="0" distB="0" distL="0" distR="0">
+            <wp:extent cx="4191000" cy="2476500"/>
+            <wp:effectExtent t="0" r="0" b="0" l="0"/>
+            <wp:docPr id="1" name="as4" descr="A right triangle marked with angle A = 27°, a = 11, and c = ?. Plotted data: Triangle ABC, not drawn to scale. Vertex A is at the bottom left, C at the bottom right, and B at the top right, with a square marking the 90° angle at C. Side b is the bottom side, side a is the vertical side, and side c is the slanted side. Angle A is marked 27°. Side a is marked 11. Side c is marked with a question mark." title="A right triangle marked with angle A = 27°, a = 11, and c = ?"/>
+            <wp:cNvGraphicFramePr>
+              <a:graphicFrameLocks xmlns:a="http://schemas.openxmlformats.org/drawingml/2006/main" noChangeAspect="1"/>
+            </wp:cNvGraphicFramePr>
+            <a:graphic xmlns:a="http://schemas.openxmlformats.org/drawingml/2006/main">
+              <a:graphicData uri="http://schemas.openxmlformats.org/drawingml/2006/picture">
+                <pic:pic xmlns:pic="http://schemas.openxmlformats.org/drawingml/2006/picture">
+                  <pic:nvPicPr>
+                    <pic:cNvPr id="0" name="" descr=""/>
+                    <pic:cNvPicPr>
+                      <a:picLocks noChangeAspect="1" noChangeArrowheads="1"/>
+                    </pic:cNvPicPr>
+                  </pic:nvPicPr>
+                  <pic:blipFill>
+                    <a:blip r:embed="rId15" cstate="none"/>
+                    <a:srcRect/>
+                    <a:stretch>
+                      <a:fillRect/>
+                    </a:stretch>
+                  </pic:blipFill>
+                  <pic:spPr bwMode="auto">
+                    <a:xfrm>
+                      <a:off x="0" y="0"/>
+                      <a:ext cx="4191000" cy="2476500"/>
+                    </a:xfrm>
+                    <a:prstGeom prst="rect">
+                      <a:avLst/>
+                    </a:prstGeom>
+                  </pic:spPr>
+                </pic:pic>
+              </a:graphicData>
+            </a:graphic>
+          </wp:inline>
+        </w:drawing>
+      </w:r>
+    </w:p>
+    <w:p>
+      <w:pPr>
+        <w:spacing w:after="120" w:before="80" w:line="300"/>
+      </w:pPr>
+      <w:r>
+        <w:rPr>
+          <w:b/>
+          <w:bCs/>
+          <w:sz w:val="22"/>
+          <w:szCs w:val="22"/>
+        </w:rPr>
+        <w:t xml:space="preserve">Plotted data: </w:t>
+      </w:r>
+      <w:r>
+        <w:rPr>
+          <w:sz w:val="22"/>
+          <w:szCs w:val="22"/>
+        </w:rPr>
+        <w:t xml:space="preserve">Triangle ABC, not drawn to scale. Vertex A is at the bottom left, C at the bottom right, and B at the top right, with a square marking the 90° angle at C. Side b is the bottom side, side a is the vertical side, and side c is the slanted side. Angle A is marked 27°. Side a is marked 11. Side c is marked with a question mark.</w:t>
+      </w:r>
+    </w:p>
+    <w:p>
+      <w:pPr>
         <w:spacing w:after="200" w:before="200"/>
         <w:jc w:val="center"/>
       </w:pPr>
@@ -2580,6 +2844,72 @@
     </w:p>
     <w:p>
       <w:pPr>
+        <w:spacing w:after="60" w:before="60"/>
+      </w:pPr>
+      <w:r>
+        <w:drawing>
+          <wp:inline distT="0" distB="0" distL="0" distR="0">
+            <wp:extent cx="4171950" cy="2476500"/>
+            <wp:effectExtent t="0" r="0" b="0" l="0"/>
+            <wp:docPr id="1" name="ts1" descr="A right triangle marked with a = 8, b = 15, and c = ?. Plotted data: Triangle ABC, not drawn to scale. Vertex A is at the bottom left, C at the bottom right, and B at the top right, with a square marking the 90° angle at C. Side b is the bottom side, side a is the vertical side, and side c is the slanted side. Side a is marked 8 and side b is marked 15. Side c is marked with a question mark." title="A right triangle marked with a = 8, b = 15, and c = ?"/>
+            <wp:cNvGraphicFramePr>
+              <a:graphicFrameLocks xmlns:a="http://schemas.openxmlformats.org/drawingml/2006/main" noChangeAspect="1"/>
+            </wp:cNvGraphicFramePr>
+            <a:graphic xmlns:a="http://schemas.openxmlformats.org/drawingml/2006/main">
+              <a:graphicData uri="http://schemas.openxmlformats.org/drawingml/2006/picture">
+                <pic:pic xmlns:pic="http://schemas.openxmlformats.org/drawingml/2006/picture">
+                  <pic:nvPicPr>
+                    <pic:cNvPr id="0" name="" descr=""/>
+                    <pic:cNvPicPr>
+                      <a:picLocks noChangeAspect="1" noChangeArrowheads="1"/>
+                    </pic:cNvPicPr>
+                  </pic:nvPicPr>
+                  <pic:blipFill>
+                    <a:blip r:embed="rId16" cstate="none"/>
+                    <a:srcRect/>
+                    <a:stretch>
+                      <a:fillRect/>
+                    </a:stretch>
+                  </pic:blipFill>
+                  <pic:spPr bwMode="auto">
+                    <a:xfrm>
+                      <a:off x="0" y="0"/>
+                      <a:ext cx="4171950" cy="2476500"/>
+                    </a:xfrm>
+                    <a:prstGeom prst="rect">
+                      <a:avLst/>
+                    </a:prstGeom>
+                  </pic:spPr>
+                </pic:pic>
+              </a:graphicData>
+            </a:graphic>
+          </wp:inline>
+        </w:drawing>
+      </w:r>
+    </w:p>
+    <w:p>
+      <w:pPr>
+        <w:spacing w:after="120" w:before="80" w:line="300"/>
+      </w:pPr>
+      <w:r>
+        <w:rPr>
+          <w:b/>
+          <w:bCs/>
+          <w:sz w:val="22"/>
+          <w:szCs w:val="22"/>
+        </w:rPr>
+        <w:t xml:space="preserve">Plotted data: </w:t>
+      </w:r>
+      <w:r>
+        <w:rPr>
+          <w:sz w:val="22"/>
+          <w:szCs w:val="22"/>
+        </w:rPr>
+        <w:t xml:space="preserve">Triangle ABC, not drawn to scale. Vertex A is at the bottom left, C at the bottom right, and B at the top right, with a square marking the 90° angle at C. Side b is the bottom side, side a is the vertical side, and side c is the slanted side. Side a is marked 8 and side b is marked 15. Side c is marked with a question mark.</w:t>
+      </w:r>
+    </w:p>
+    <w:p>
+      <w:pPr>
         <w:spacing w:after="200" w:before="200"/>
         <w:jc w:val="center"/>
       </w:pPr>
@@ -2822,6 +3152,72 @@
     </w:p>
     <w:p>
       <w:pPr>
+        <w:spacing w:after="60" w:before="60"/>
+      </w:pPr>
+      <w:r>
+        <w:drawing>
+          <wp:inline distT="0" distB="0" distL="0" distR="0">
+            <wp:extent cx="4191000" cy="2476500"/>
+            <wp:effectExtent t="0" r="0" b="0" l="0"/>
+            <wp:docPr id="1" name="ts2" descr="A right triangle marked with a = 20, c = 29, and b = ?. Plotted data: Triangle ABC, not drawn to scale. Vertex A is at the bottom left, C at the bottom right, and B at the top right, with a square marking the 90° angle at C. Side b is the bottom side, side a is the vertical side, and side c is the slanted side. Side a is marked 20 and side c is marked 29. Side b is marked with a question mark." title="A right triangle marked with a = 20, c = 29, and b = ?"/>
+            <wp:cNvGraphicFramePr>
+              <a:graphicFrameLocks xmlns:a="http://schemas.openxmlformats.org/drawingml/2006/main" noChangeAspect="1"/>
+            </wp:cNvGraphicFramePr>
+            <a:graphic xmlns:a="http://schemas.openxmlformats.org/drawingml/2006/main">
+              <a:graphicData uri="http://schemas.openxmlformats.org/drawingml/2006/picture">
+                <pic:pic xmlns:pic="http://schemas.openxmlformats.org/drawingml/2006/picture">
+                  <pic:nvPicPr>
+                    <pic:cNvPr id="0" name="" descr=""/>
+                    <pic:cNvPicPr>
+                      <a:picLocks noChangeAspect="1" noChangeArrowheads="1"/>
+                    </pic:cNvPicPr>
+                  </pic:nvPicPr>
+                  <pic:blipFill>
+                    <a:blip r:embed="rId17" cstate="none"/>
+                    <a:srcRect/>
+                    <a:stretch>
+                      <a:fillRect/>
+                    </a:stretch>
+                  </pic:blipFill>
+                  <pic:spPr bwMode="auto">
+                    <a:xfrm>
+                      <a:off x="0" y="0"/>
+                      <a:ext cx="4191000" cy="2476500"/>
+                    </a:xfrm>
+                    <a:prstGeom prst="rect">
+                      <a:avLst/>
+                    </a:prstGeom>
+                  </pic:spPr>
+                </pic:pic>
+              </a:graphicData>
+            </a:graphic>
+          </wp:inline>
+        </w:drawing>
+      </w:r>
+    </w:p>
+    <w:p>
+      <w:pPr>
+        <w:spacing w:after="120" w:before="80" w:line="300"/>
+      </w:pPr>
+      <w:r>
+        <w:rPr>
+          <w:b/>
+          <w:bCs/>
+          <w:sz w:val="22"/>
+          <w:szCs w:val="22"/>
+        </w:rPr>
+        <w:t xml:space="preserve">Plotted data: </w:t>
+      </w:r>
+      <w:r>
+        <w:rPr>
+          <w:sz w:val="22"/>
+          <w:szCs w:val="22"/>
+        </w:rPr>
+        <w:t xml:space="preserve">Triangle ABC, not drawn to scale. Vertex A is at the bottom left, C at the bottom right, and B at the top right, with a square marking the 90° angle at C. Side b is the bottom side, side a is the vertical side, and side c is the slanted side. Side a is marked 20 and side c is marked 29. Side b is marked with a question mark.</w:t>
+      </w:r>
+    </w:p>
+    <w:p>
+      <w:pPr>
         <w:spacing w:after="200" w:before="200"/>
         <w:jc w:val="center"/>
       </w:pPr>
@@ -3074,6 +3470,72 @@
     </w:p>
     <w:p>
       <w:pPr>
+        <w:spacing w:after="60" w:before="60"/>
+      </w:pPr>
+      <w:r>
+        <w:drawing>
+          <wp:inline distT="0" distB="0" distL="0" distR="0">
+            <wp:extent cx="4171950" cy="2476500"/>
+            <wp:effectExtent t="0" r="0" b="0" l="0"/>
+            <wp:docPr id="1" name="ts3" descr="A right triangle marked with a = 8, b = 15, and angle A = ?. Plotted data: Triangle ABC, not drawn to scale. Vertex A is at the bottom left, C at the bottom right, and B at the top right, with a square marking the 90° angle at C. Side b is the bottom side, side a is the vertical side, and side c is the slanted side. Side a is marked 8 and side b is marked 15. Angle A is marked with a question mark." title="A right triangle marked with a = 8, b = 15, and angle A = ?"/>
+            <wp:cNvGraphicFramePr>
+              <a:graphicFrameLocks xmlns:a="http://schemas.openxmlformats.org/drawingml/2006/main" noChangeAspect="1"/>
+            </wp:cNvGraphicFramePr>
+            <a:graphic xmlns:a="http://schemas.openxmlformats.org/drawingml/2006/main">
+              <a:graphicData uri="http://schemas.openxmlformats.org/drawingml/2006/picture">
+                <pic:pic xmlns:pic="http://schemas.openxmlformats.org/drawingml/2006/picture">
+                  <pic:nvPicPr>
+                    <pic:cNvPr id="0" name="" descr=""/>
+                    <pic:cNvPicPr>
+                      <a:picLocks noChangeAspect="1" noChangeArrowheads="1"/>
+                    </pic:cNvPicPr>
+                  </pic:nvPicPr>
+                  <pic:blipFill>
+                    <a:blip r:embed="rId18" cstate="none"/>
+                    <a:srcRect/>
+                    <a:stretch>
+                      <a:fillRect/>
+                    </a:stretch>
+                  </pic:blipFill>
+                  <pic:spPr bwMode="auto">
+                    <a:xfrm>
+                      <a:off x="0" y="0"/>
+                      <a:ext cx="4171950" cy="2476500"/>
+                    </a:xfrm>
+                    <a:prstGeom prst="rect">
+                      <a:avLst/>
+                    </a:prstGeom>
+                  </pic:spPr>
+                </pic:pic>
+              </a:graphicData>
+            </a:graphic>
+          </wp:inline>
+        </w:drawing>
+      </w:r>
+    </w:p>
+    <w:p>
+      <w:pPr>
+        <w:spacing w:after="120" w:before="80" w:line="300"/>
+      </w:pPr>
+      <w:r>
+        <w:rPr>
+          <w:b/>
+          <w:bCs/>
+          <w:sz w:val="22"/>
+          <w:szCs w:val="22"/>
+        </w:rPr>
+        <w:t xml:space="preserve">Plotted data: </w:t>
+      </w:r>
+      <w:r>
+        <w:rPr>
+          <w:sz w:val="22"/>
+          <w:szCs w:val="22"/>
+        </w:rPr>
+        <w:t xml:space="preserve">Triangle ABC, not drawn to scale. Vertex A is at the bottom left, C at the bottom right, and B at the top right, with a square marking the 90° angle at C. Side b is the bottom side, side a is the vertical side, and side c is the slanted side. Side a is marked 8 and side b is marked 15. Angle A is marked with a question mark.</w:t>
+      </w:r>
+    </w:p>
+    <w:p>
+      <w:pPr>
         <w:spacing w:after="200" w:before="200"/>
         <w:jc w:val="center"/>
       </w:pPr>
@@ -3336,6 +3798,72 @@
       </w:pPr>
       <w:r>
         <w:t xml:space="preserve">Example 12: Two Sides 4</w:t>
+      </w:r>
+    </w:p>
+    <w:p>
+      <w:pPr>
+        <w:spacing w:after="60" w:before="60"/>
+      </w:pPr>
+      <w:r>
+        <w:drawing>
+          <wp:inline distT="0" distB="0" distL="0" distR="0">
+            <wp:extent cx="4171950" cy="2476500"/>
+            <wp:effectExtent t="0" r="0" b="0" l="0"/>
+            <wp:docPr id="1" name="ts4" descr="A right triangle marked with b = 24, c = 25, and angle A = ?. Plotted data: Triangle ABC, not drawn to scale. Vertex A is at the bottom left, C at the bottom right, and B at the top right, with a square marking the 90° angle at C. Side b is the bottom side, side a is the vertical side, and side c is the slanted side. Side b is marked 24 and side c is marked 25. Angle A is marked with a question mark." title="A right triangle marked with b = 24, c = 25, and angle A = ?"/>
+            <wp:cNvGraphicFramePr>
+              <a:graphicFrameLocks xmlns:a="http://schemas.openxmlformats.org/drawingml/2006/main" noChangeAspect="1"/>
+            </wp:cNvGraphicFramePr>
+            <a:graphic xmlns:a="http://schemas.openxmlformats.org/drawingml/2006/main">
+              <a:graphicData uri="http://schemas.openxmlformats.org/drawingml/2006/picture">
+                <pic:pic xmlns:pic="http://schemas.openxmlformats.org/drawingml/2006/picture">
+                  <pic:nvPicPr>
+                    <pic:cNvPr id="0" name="" descr=""/>
+                    <pic:cNvPicPr>
+                      <a:picLocks noChangeAspect="1" noChangeArrowheads="1"/>
+                    </pic:cNvPicPr>
+                  </pic:nvPicPr>
+                  <pic:blipFill>
+                    <a:blip r:embed="rId19" cstate="none"/>
+                    <a:srcRect/>
+                    <a:stretch>
+                      <a:fillRect/>
+                    </a:stretch>
+                  </pic:blipFill>
+                  <pic:spPr bwMode="auto">
+                    <a:xfrm>
+                      <a:off x="0" y="0"/>
+                      <a:ext cx="4171950" cy="2476500"/>
+                    </a:xfrm>
+                    <a:prstGeom prst="rect">
+                      <a:avLst/>
+                    </a:prstGeom>
+                  </pic:spPr>
+                </pic:pic>
+              </a:graphicData>
+            </a:graphic>
+          </wp:inline>
+        </w:drawing>
+      </w:r>
+    </w:p>
+    <w:p>
+      <w:pPr>
+        <w:spacing w:after="120" w:before="80" w:line="300"/>
+      </w:pPr>
+      <w:r>
+        <w:rPr>
+          <w:b/>
+          <w:bCs/>
+          <w:sz w:val="22"/>
+          <w:szCs w:val="22"/>
+        </w:rPr>
+        <w:t xml:space="preserve">Plotted data: </w:t>
+      </w:r>
+      <w:r>
+        <w:rPr>
+          <w:sz w:val="22"/>
+          <w:szCs w:val="22"/>
+        </w:rPr>
+        <w:t xml:space="preserve">Triangle ABC, not drawn to scale. Vertex A is at the bottom left, C at the bottom right, and B at the top right, with a square marking the 90° angle at C. Side b is the bottom side, side a is the vertical side, and side c is the slanted side. Side b is marked 24 and side c is marked 25. Angle A is marked with a question mark.</w:t>
       </w:r>
     </w:p>
     <w:p>

</xml_diff>

<commit_message>
TE4: re-audit before recording (slip format and spoilers, distractor origins, B-arc direction, full-solve/whole-number/inverse-sine coverage, CheckIt a-b swap note, speak lines); doc tool prints degree signs on the line and labels non-graph figures
Co-Authored-By: Claude Opus 5.5 <noreply@anthropic.com>
Claude-Session: https://claude.ai/code/session_013Y8PfETWcMLvmUEpCdE8Wq
</commit_message>
<xml_diff>
--- a/support-materials/TE4/TE4_worked_examples.docx
+++ b/support-materials/TE4/TE4_worked_examples.docx
@@ -111,7 +111,7 @@
           <wp:inline distT="0" distB="0" distL="0" distR="0">
             <wp:extent cx="3762375" cy="2476500"/>
             <wp:effectExtent t="0" r="0" b="0" l="0"/>
-            <wp:docPr id="1" name="lb1" descr="A right triangle with vertices A, B, and C and sides labeled a, b, and c. Plotted data: A right triangle. Vertex A is at the bottom left, C at the bottom right, and B at the top right. A small square marks the corner at C, so the angle at C is 90°. Side b is the bottom side, joining A and C. Side a is the vertical side, joining C and B. Side c is the slanted side, joining A and B." title="A right triangle with vertices A, B, and C and sides labeled a, b, and c"/>
+            <wp:docPr id="1" name="lb1" descr="A right triangle with vertices A, B, and C and sides labeled a, b, and c. Figure: A right triangle. Vertex A is at the bottom left, C at the bottom right, and B at the top right. A small square marks the corner at C, so the angle at C is 90°. Side b is the bottom side, joining A and C. Side a is the vertical side, joining C and B. Side c is the slanted side, joining A and B." title="A right triangle with vertices A, B, and C and sides labeled a, b, and c"/>
             <wp:cNvGraphicFramePr>
               <a:graphicFrameLocks xmlns:a="http://schemas.openxmlformats.org/drawingml/2006/main" noChangeAspect="1"/>
             </wp:cNvGraphicFramePr>
@@ -158,7 +158,7 @@
           <w:sz w:val="22"/>
           <w:szCs w:val="22"/>
         </w:rPr>
-        <w:t xml:space="preserve">Plotted data: </w:t>
+        <w:t xml:space="preserve">Figure: </w:t>
       </w:r>
       <w:r>
         <w:rPr>
@@ -313,7 +313,37 @@
         <w:t xml:space="preserve">B</w:t>
       </w:r>
       <w:r>
-        <w:t xml:space="preserve">. It is always the longest side. </w:t>
+        <w:t xml:space="preserve">. It is always the longest side. Sides </w:t>
+      </w:r>
+      <w:r>
+        <w:rPr>
+          <w:i/>
+          <w:iCs/>
+        </w:rPr>
+        <w:t xml:space="preserve">a</w:t>
+      </w:r>
+      <w:r>
+        <w:t xml:space="preserve"> and </w:t>
+      </w:r>
+      <w:r>
+        <w:rPr>
+          <w:i/>
+          <w:iCs/>
+        </w:rPr>
+        <w:t xml:space="preserve">b</w:t>
+      </w:r>
+      <w:r>
+        <w:t xml:space="preserve"> are the legs, the two sides that meet at the right angle; and the hypotenuse never changes with angle </w:t>
+      </w:r>
+      <w:r>
+        <w:rPr>
+          <w:i/>
+          <w:iCs/>
+        </w:rPr>
+        <w:t xml:space="preserve">A</w:t>
+      </w:r>
+      <w:r>
+        <w:t xml:space="preserve">, because it is fixed by the right angle. </w:t>
       </w:r>
       <w:r>
         <w:rPr>
@@ -357,7 +387,7 @@
           <wp:inline distT="0" distB="0" distL="0" distR="0">
             <wp:extent cx="3771900" cy="2476500"/>
             <wp:effectExtent t="0" r="0" b="0" l="0"/>
-            <wp:docPr id="1" name="lb2" descr="A right triangle with vertices A, B, and C and sides labeled a, b, and c. Plotted data: A right triangle. Vertex A is at the bottom left, C at the bottom right, and B at the top right. A small square marks the corner at C, so the angle at C is 90°. Side b is the bottom side, joining A and C. Side a is the vertical side, joining C and B. Side c is the slanted side, joining A and B." title="A right triangle with vertices A, B, and C and sides labeled a, b, and c"/>
+            <wp:docPr id="1" name="lb2" descr="A right triangle with vertices A, B, and C and sides labeled a, b, and c. Figure: A right triangle. Vertex A is at the bottom left, C at the bottom right, and B at the top right. A small square marks the corner at C, so the angle at C is 90°. Side b is the bottom side, joining A and C. Side a is the vertical side, joining C and B. Side c is the slanted side, joining A and B." title="A right triangle with vertices A, B, and C and sides labeled a, b, and c"/>
             <wp:cNvGraphicFramePr>
               <a:graphicFrameLocks xmlns:a="http://schemas.openxmlformats.org/drawingml/2006/main" noChangeAspect="1"/>
             </wp:cNvGraphicFramePr>
@@ -404,7 +434,7 @@
           <w:sz w:val="22"/>
           <w:szCs w:val="22"/>
         </w:rPr>
-        <w:t xml:space="preserve">Plotted data: </w:t>
+        <w:t xml:space="preserve">Figure: </w:t>
       </w:r>
       <w:r>
         <w:rPr>
@@ -470,23 +500,23 @@
         <w:t xml:space="preserve">B.  </w:t>
       </w:r>
       <w:r>
+        <w:t xml:space="preserve">Side c</w:t>
+      </w:r>
+    </w:p>
+    <w:p>
+      <w:pPr>
+        <w:spacing w:after="40" w:before="20"/>
+        <w:ind w:left="360"/>
+      </w:pPr>
+      <w:r>
+        <w:rPr>
+          <w:b/>
+          <w:bCs/>
+        </w:rPr>
+        <w:t xml:space="preserve">C.  </w:t>
+      </w:r>
+      <w:r>
         <w:t xml:space="preserve">Side a</w:t>
-      </w:r>
-    </w:p>
-    <w:p>
-      <w:pPr>
-        <w:spacing w:after="40" w:before="20"/>
-        <w:ind w:left="360"/>
-      </w:pPr>
-      <w:r>
-        <w:rPr>
-          <w:b/>
-          <w:bCs/>
-        </w:rPr>
-        <w:t xml:space="preserve">C.  </w:t>
-      </w:r>
-      <w:r>
-        <w:t xml:space="preserve">Side c</w:t>
       </w:r>
     </w:p>
     <w:p>
@@ -619,7 +649,7 @@
         <w:t xml:space="preserve">A</w:t>
       </w:r>
       <w:r>
-        <w:t xml:space="preserve">. </w:t>
+        <w:t xml:space="preserve">. Every acute angle has an opposite side. </w:t>
       </w:r>
       <w:r>
         <w:rPr>
@@ -679,7 +709,7 @@
           <wp:inline distT="0" distB="0" distL="0" distR="0">
             <wp:extent cx="3771900" cy="2476500"/>
             <wp:effectExtent t="0" r="0" b="0" l="0"/>
-            <wp:docPr id="1" name="lb3" descr="A right triangle with vertices A, B, and C and sides labeled a, b, and c. Plotted data: A right triangle. Vertex A is at the bottom left, C at the bottom right, and B at the top right. A small square marks the corner at C, so the angle at C is 90°. Side b is the bottom side, joining A and C. Side a is the vertical side, joining C and B. Side c is the slanted side, joining A and B." title="A right triangle with vertices A, B, and C and sides labeled a, b, and c"/>
+            <wp:docPr id="1" name="lb3" descr="A right triangle with vertices A, B, and C and sides labeled a, b, and c. Figure: A right triangle. Vertex A is at the bottom left, C at the bottom right, and B at the top right. A small square marks the corner at C, so the angle at C is 90°. Side b is the bottom side, joining A and C. Side a is the vertical side, joining C and B. Side c is the slanted side, joining A and B." title="A right triangle with vertices A, B, and C and sides labeled a, b, and c"/>
             <wp:cNvGraphicFramePr>
               <a:graphicFrameLocks xmlns:a="http://schemas.openxmlformats.org/drawingml/2006/main" noChangeAspect="1"/>
             </wp:cNvGraphicFramePr>
@@ -726,7 +756,7 @@
           <w:sz w:val="22"/>
           <w:szCs w:val="22"/>
         </w:rPr>
-        <w:t xml:space="preserve">Plotted data: </w:t>
+        <w:t xml:space="preserve">Figure: </w:t>
       </w:r>
       <w:r>
         <w:rPr>
@@ -913,7 +943,7 @@
         <w:t xml:space="preserve"> A</w:t>
       </w:r>
       <w:r>
-        <w:t xml:space="preserve">, and </w:t>
+        <w:t xml:space="preserve">; </w:t>
       </w:r>
       <w:r>
         <w:rPr>
@@ -927,6 +957,29 @@
       </w:r>
       <w:r>
         <w:t xml:space="preserve">tan</w:t>
+      </w:r>
+      <w:r>
+        <w:rPr>
+          <w:i/>
+          <w:iCs/>
+        </w:rPr>
+        <w:t xml:space="preserve"> A</w:t>
+      </w:r>
+      <w:r>
+        <w:t xml:space="preserve">; and </w:t>
+      </w:r>
+      <w:r>
+        <w:rPr>
+          <w:i/>
+          <w:iCs/>
+        </w:rPr>
+        <w:t xml:space="preserve">c/a</w:t>
+      </w:r>
+      <w:r>
+        <w:t xml:space="preserve"> is upside down, the reciprocal of </w:t>
+      </w:r>
+      <w:r>
+        <w:t xml:space="preserve">sin</w:t>
       </w:r>
       <w:r>
         <w:rPr>
@@ -983,45 +1036,7 @@
           <w:sz w:val="40"/>
           <w:szCs w:val="40"/>
         </w:rPr>
-        <w:t xml:space="preserve">C=90</w:t>
-      </w:r>
-      <w:r>
-        <w:rPr>
-          <w:i/>
-          <w:iCs/>
-          <w:sz w:val="40"/>
-          <w:szCs w:val="40"/>
-          <w:vertAlign w:val="superscript"/>
-        </w:rPr>
-        <w:t xml:space="preserve">°</w:t>
-      </w:r>
-      <w:r>
-        <w:rPr>
-          <w:i/>
-          <w:iCs/>
-          <w:sz w:val="40"/>
-          <w:szCs w:val="40"/>
-        </w:rPr>
-        <w:t xml:space="preserve">,    A=50</w:t>
-      </w:r>
-      <w:r>
-        <w:rPr>
-          <w:i/>
-          <w:iCs/>
-          <w:sz w:val="40"/>
-          <w:szCs w:val="40"/>
-          <w:vertAlign w:val="superscript"/>
-        </w:rPr>
-        <w:t xml:space="preserve">°</w:t>
-      </w:r>
-      <w:r>
-        <w:rPr>
-          <w:i/>
-          <w:iCs/>
-          <w:sz w:val="40"/>
-          <w:szCs w:val="40"/>
-        </w:rPr>
-        <w:t xml:space="preserve">,    c=8</w:t>
+        <w:t xml:space="preserve">C=90°,    A=50°,    c=8</w:t>
       </w:r>
     </w:p>
     <w:p>
@@ -1068,7 +1083,7 @@
           <w:i/>
           <w:iCs/>
         </w:rPr>
-        <w:t xml:space="preserve">a=8</w:t>
+        <w:t xml:space="preserve">a=8 </w:t>
       </w:r>
       <w:r>
         <w:t xml:space="preserve">sin</w:t>
@@ -1078,15 +1093,7 @@
           <w:i/>
           <w:iCs/>
         </w:rPr>
-        <w:t xml:space="preserve"> 50</w:t>
-      </w:r>
-      <w:r>
-        <w:rPr>
-          <w:i/>
-          <w:iCs/>
-          <w:vertAlign w:val="superscript"/>
-        </w:rPr>
-        <w:t xml:space="preserve">°</w:t>
+        <w:t xml:space="preserve"> 50°</w:t>
       </w:r>
     </w:p>
     <w:p>
@@ -1106,7 +1113,7 @@
           <w:i/>
           <w:iCs/>
         </w:rPr>
-        <w:t xml:space="preserve">a=8</w:t>
+        <w:t xml:space="preserve">a=8 </w:t>
       </w:r>
       <w:r>
         <w:t xml:space="preserve">cos</w:t>
@@ -1116,15 +1123,7 @@
           <w:i/>
           <w:iCs/>
         </w:rPr>
-        <w:t xml:space="preserve"> 50</w:t>
-      </w:r>
-      <w:r>
-        <w:rPr>
-          <w:i/>
-          <w:iCs/>
-          <w:vertAlign w:val="superscript"/>
-        </w:rPr>
-        <w:t xml:space="preserve">°</w:t>
+        <w:t xml:space="preserve"> 50°</w:t>
       </w:r>
     </w:p>
     <w:p>
@@ -1154,22 +1153,7 @@
           <w:i/>
           <w:iCs/>
         </w:rPr>
-        <w:t xml:space="preserve"> 50</w:t>
-      </w:r>
-      <w:r>
-        <w:rPr>
-          <w:i/>
-          <w:iCs/>
-          <w:vertAlign w:val="superscript"/>
-        </w:rPr>
-        <w:t xml:space="preserve">°</w:t>
-      </w:r>
-      <w:r>
-        <w:rPr>
-          <w:i/>
-          <w:iCs/>
-        </w:rPr>
-        <w:t xml:space="preserve">)</w:t>
+        <w:t xml:space="preserve"> 50°)</w:t>
       </w:r>
     </w:p>
     <w:p>
@@ -1189,7 +1173,7 @@
           <w:i/>
           <w:iCs/>
         </w:rPr>
-        <w:t xml:space="preserve">a=8</w:t>
+        <w:t xml:space="preserve">a=8 </w:t>
       </w:r>
       <w:r>
         <w:t xml:space="preserve">tan</w:t>
@@ -1199,15 +1183,7 @@
           <w:i/>
           <w:iCs/>
         </w:rPr>
-        <w:t xml:space="preserve"> 50</w:t>
-      </w:r>
-      <w:r>
-        <w:rPr>
-          <w:i/>
-          <w:iCs/>
-          <w:vertAlign w:val="superscript"/>
-        </w:rPr>
-        <w:t xml:space="preserve">°</w:t>
+        <w:t xml:space="preserve"> 50°</w:t>
       </w:r>
     </w:p>
     <w:p>
@@ -1264,22 +1240,7 @@
           <w:i/>
           <w:iCs/>
         </w:rPr>
-        <w:t xml:space="preserve"> 50</w:t>
-      </w:r>
-      <w:r>
-        <w:rPr>
-          <w:i/>
-          <w:iCs/>
-          <w:vertAlign w:val="superscript"/>
-        </w:rPr>
-        <w:t xml:space="preserve">°</w:t>
-      </w:r>
-      <w:r>
-        <w:rPr>
-          <w:i/>
-          <w:iCs/>
-        </w:rPr>
-        <w:t xml:space="preserve">=a/8</w:t>
+        <w:t xml:space="preserve"> 50°=a/8</w:t>
       </w:r>
       <w:r>
         <w:t xml:space="preserve">. Multiply both sides by 8. Cosine would find </w:t>
@@ -1292,42 +1253,45 @@
         <w:t xml:space="preserve">b</w:t>
       </w:r>
       <w:r>
-        <w:t xml:space="preserve">, the adjacent side. </w:t>
-      </w:r>
-      <w:r>
-        <w:rPr>
-          <w:b/>
-          <w:bCs/>
-          <w:i/>
-          <w:iCs/>
-        </w:rPr>
-        <w:t xml:space="preserve">a=8</w:t>
-      </w:r>
-      <w:r>
-        <w:rPr>
-          <w:b/>
-          <w:bCs/>
-        </w:rPr>
+        <w:t xml:space="preserve">, the adjacent side; dividing by </w:t>
+      </w:r>
+      <w:r>
         <w:t xml:space="preserve">sin</w:t>
       </w:r>
       <w:r>
         <w:rPr>
-          <w:b/>
-          <w:bCs/>
-          <w:i/>
-          <w:iCs/>
-        </w:rPr>
-        <w:t xml:space="preserve"> 50</w:t>
-      </w:r>
-      <w:r>
-        <w:rPr>
-          <w:b/>
-          <w:bCs/>
-          <w:i/>
-          <w:iCs/>
-          <w:vertAlign w:val="superscript"/>
-        </w:rPr>
-        <w:t xml:space="preserve">°</w:t>
+          <w:i/>
+          <w:iCs/>
+        </w:rPr>
+        <w:t xml:space="preserve"> 50°</w:t>
+      </w:r>
+      <w:r>
+        <w:t xml:space="preserve"> is for when the hypotenuse is the unknown; and tangent pairs the opposite side with the adjacent side, not the hypotenuse. </w:t>
+      </w:r>
+      <w:r>
+        <w:rPr>
+          <w:b/>
+          <w:bCs/>
+          <w:i/>
+          <w:iCs/>
+        </w:rPr>
+        <w:t xml:space="preserve">a=8 </w:t>
+      </w:r>
+      <w:r>
+        <w:rPr>
+          <w:b/>
+          <w:bCs/>
+        </w:rPr>
+        <w:t xml:space="preserve">sin</w:t>
+      </w:r>
+      <w:r>
+        <w:rPr>
+          <w:b/>
+          <w:bCs/>
+          <w:i/>
+          <w:iCs/>
+        </w:rPr>
+        <w:t xml:space="preserve"> 50°</w:t>
       </w:r>
       <w:r>
         <w:rPr>
@@ -1343,7 +1307,7 @@
         <w:pageBreakBefore/>
       </w:pPr>
       <w:r>
-        <w:t xml:space="preserve">Example 5: Angle and Side 1</w:t>
+        <w:t xml:space="preserve">Example 5: Solve the Triangle</w:t>
       </w:r>
     </w:p>
     <w:p>
@@ -1355,7 +1319,7 @@
           <wp:inline distT="0" distB="0" distL="0" distR="0">
             <wp:extent cx="4171950" cy="2476500"/>
             <wp:effectExtent t="0" r="0" b="0" l="0"/>
-            <wp:docPr id="1" name="as1" descr="A right triangle marked with angle A = 35°, c = 12, and a = ?. Plotted data: Triangle ABC, not drawn to scale. Vertex A is at the bottom left, C at the bottom right, and B at the top right, with a square marking the 90° angle at C. Side b is the bottom side, side a is the vertical side, and side c is the slanted side. Angle A is marked 35°. Side c is marked 12. Side a is marked with a question mark." title="A right triangle marked with angle A = 35°, c = 12, and a = ?"/>
+            <wp:docPr id="1" name="as1" descr="A right triangle marked with angle A = 35°, c = 12, and a, b and B unknown. Figure: Triangle ABC, not drawn to scale. Vertex A is at the bottom left, C at the bottom right, and B at the top right, with a square marking the 90° angle at C. Side b is the bottom side, side a is the vertical side, and side c is the slanted side. Angle A is marked 35°. Side c is marked 12. Sides a and b and angle B are marked with question marks." title="A right triangle marked with angle A = 35°, c = 12, and a, b and B unknown"/>
             <wp:cNvGraphicFramePr>
               <a:graphicFrameLocks xmlns:a="http://schemas.openxmlformats.org/drawingml/2006/main" noChangeAspect="1"/>
             </wp:cNvGraphicFramePr>
@@ -1402,14 +1366,14 @@
           <w:sz w:val="22"/>
           <w:szCs w:val="22"/>
         </w:rPr>
-        <w:t xml:space="preserve">Plotted data: </w:t>
+        <w:t xml:space="preserve">Figure: </w:t>
       </w:r>
       <w:r>
         <w:rPr>
           <w:sz w:val="22"/>
           <w:szCs w:val="22"/>
         </w:rPr>
-        <w:t xml:space="preserve">Triangle ABC, not drawn to scale. Vertex A is at the bottom left, C at the bottom right, and B at the top right, with a square marking the 90° angle at C. Side b is the bottom side, side a is the vertical side, and side c is the slanted side. Angle A is marked 35°. Side c is marked 12. Side a is marked with a question mark.</w:t>
+        <w:t xml:space="preserve">Triangle ABC, not drawn to scale. Vertex A is at the bottom left, C at the bottom right, and B at the top right, with a square marking the 90° angle at C. Side b is the bottom side, side a is the vertical side, and side c is the slanted side. Angle A is marked 35°. Side c is marked 12. Sides a and b and angle B are marked with question marks.</w:t>
       </w:r>
     </w:p>
     <w:p>
@@ -1424,45 +1388,7 @@
           <w:sz w:val="40"/>
           <w:szCs w:val="40"/>
         </w:rPr>
-        <w:t xml:space="preserve">C=90</w:t>
-      </w:r>
-      <w:r>
-        <w:rPr>
-          <w:i/>
-          <w:iCs/>
-          <w:sz w:val="40"/>
-          <w:szCs w:val="40"/>
-          <w:vertAlign w:val="superscript"/>
-        </w:rPr>
-        <w:t xml:space="preserve">°</w:t>
-      </w:r>
-      <w:r>
-        <w:rPr>
-          <w:i/>
-          <w:iCs/>
-          <w:sz w:val="40"/>
-          <w:szCs w:val="40"/>
-        </w:rPr>
-        <w:t xml:space="preserve">,    A=35</w:t>
-      </w:r>
-      <w:r>
-        <w:rPr>
-          <w:i/>
-          <w:iCs/>
-          <w:sz w:val="40"/>
-          <w:szCs w:val="40"/>
-          <w:vertAlign w:val="superscript"/>
-        </w:rPr>
-        <w:t xml:space="preserve">°</w:t>
-      </w:r>
-      <w:r>
-        <w:rPr>
-          <w:i/>
-          <w:iCs/>
-          <w:sz w:val="40"/>
-          <w:szCs w:val="40"/>
-        </w:rPr>
-        <w:t xml:space="preserve">,    c=12</w:t>
+        <w:t xml:space="preserve">C=90°,    A=35°,    c=12</w:t>
       </w:r>
     </w:p>
     <w:p>
@@ -1479,17 +1405,7 @@
         <w:spacing w:after="120" w:before="80" w:line="300"/>
       </w:pPr>
       <w:r>
-        <w:t xml:space="preserve">Find side </w:t>
-      </w:r>
-      <w:r>
-        <w:rPr>
-          <w:i/>
-          <w:iCs/>
-        </w:rPr>
-        <w:t xml:space="preserve">a</w:t>
-      </w:r>
-      <w:r>
-        <w:t xml:space="preserve">.</w:t>
+        <w:t xml:space="preserve">Like CheckIt, solve the triangle: find every missing part, with sides to the nearest tenth. Which is the complete solution?</w:t>
       </w:r>
     </w:p>
     <w:p>
@@ -1505,7 +1421,7 @@
         <w:t xml:space="preserve">A.  </w:t>
       </w:r>
       <w:r>
-        <w:t xml:space="preserve">about 9.8</w:t>
+        <w:t xml:space="preserve">B = 55°, a ≈ 9.8, b ≈ 6.9</w:t>
       </w:r>
     </w:p>
     <w:p>
@@ -1521,7 +1437,7 @@
         <w:t xml:space="preserve">B.  </w:t>
       </w:r>
       <w:r>
-        <w:t xml:space="preserve">about 6.9</w:t>
+        <w:t xml:space="preserve">B = 55°, a ≈ 6.9, b ≈ 9.8</w:t>
       </w:r>
     </w:p>
     <w:p>
@@ -1537,7 +1453,7 @@
         <w:t xml:space="preserve">C.  </w:t>
       </w:r>
       <w:r>
-        <w:t xml:space="preserve">about −5.1</w:t>
+        <w:t xml:space="preserve">B = 145°, a ≈ 6.9, b ≈ 9.8</w:t>
       </w:r>
     </w:p>
     <w:p>
@@ -1553,7 +1469,7 @@
         <w:t xml:space="preserve">D.  </w:t>
       </w:r>
       <w:r>
-        <w:t xml:space="preserve">about 20.9</w:t>
+        <w:t xml:space="preserve">B = 55°, a ≈ −5.1, b ≈ −10.8</w:t>
       </w:r>
     </w:p>
     <w:p>
@@ -1570,7 +1486,17 @@
         <w:spacing w:after="120" w:before="80" w:line="300"/>
       </w:pPr>
       <w:r>
-        <w:t xml:space="preserve">Side </w:t>
+        <w:t xml:space="preserve">The acute angles add to 90°: </w:t>
+      </w:r>
+      <w:r>
+        <w:rPr>
+          <w:i/>
+          <w:iCs/>
+        </w:rPr>
+        <w:t xml:space="preserve">B=90°−35°=55°</w:t>
+      </w:r>
+      <w:r>
+        <w:t xml:space="preserve">. Side </w:t>
       </w:r>
       <w:r>
         <w:rPr>
@@ -1590,24 +1516,14 @@
         <w:t xml:space="preserve">A</w:t>
       </w:r>
       <w:r>
-        <w:t xml:space="preserve">, and </w:t>
-      </w:r>
-      <w:r>
-        <w:rPr>
-          <w:i/>
-          <w:iCs/>
-        </w:rPr>
-        <w:t xml:space="preserve">c</w:t>
-      </w:r>
-      <w:r>
-        <w:t xml:space="preserve"> is the hypotenuse, so use sine: </w:t>
-      </w:r>
-      <w:r>
-        <w:rPr>
-          <w:i/>
-          <w:iCs/>
-        </w:rPr>
-        <w:t xml:space="preserve">a=12</w:t>
+        <w:t xml:space="preserve">, so use sine: </w:t>
+      </w:r>
+      <w:r>
+        <w:rPr>
+          <w:i/>
+          <w:iCs/>
+        </w:rPr>
+        <w:t xml:space="preserve">a=12 </w:t>
       </w:r>
       <w:r>
         <w:t xml:space="preserve">sin</w:t>
@@ -1617,7 +1533,57 @@
           <w:i/>
           <w:iCs/>
         </w:rPr>
-        <w:t xml:space="preserve"> 35</w:t>
+        <w:t xml:space="preserve"> 35°≈ 6.88</w:t>
+      </w:r>
+      <w:r>
+        <w:t xml:space="preserve">. Side </w:t>
+      </w:r>
+      <w:r>
+        <w:rPr>
+          <w:i/>
+          <w:iCs/>
+        </w:rPr>
+        <w:t xml:space="preserve">b</w:t>
+      </w:r>
+      <w:r>
+        <w:t xml:space="preserve"> is adjacent to </w:t>
+      </w:r>
+      <w:r>
+        <w:rPr>
+          <w:i/>
+          <w:iCs/>
+        </w:rPr>
+        <w:t xml:space="preserve">A</w:t>
+      </w:r>
+      <w:r>
+        <w:t xml:space="preserve">, so use cosine: </w:t>
+      </w:r>
+      <w:r>
+        <w:rPr>
+          <w:i/>
+          <w:iCs/>
+        </w:rPr>
+        <w:t xml:space="preserve">b=12 </w:t>
+      </w:r>
+      <w:r>
+        <w:t xml:space="preserve">cos</w:t>
+      </w:r>
+      <w:r>
+        <w:rPr>
+          <w:i/>
+          <w:iCs/>
+        </w:rPr>
+        <w:t xml:space="preserve"> 35°≈ 9.83</w:t>
+      </w:r>
+      <w:r>
+        <w:t xml:space="preserve">. Check: </w:t>
+      </w:r>
+      <w:r>
+        <w:rPr>
+          <w:i/>
+          <w:iCs/>
+        </w:rPr>
+        <w:t xml:space="preserve">6.9</w:t>
       </w:r>
       <w:r>
         <w:rPr>
@@ -1625,17 +1591,50 @@
           <w:iCs/>
           <w:vertAlign w:val="superscript"/>
         </w:rPr>
-        <w:t xml:space="preserve">°</w:t>
-      </w:r>
-      <w:r>
-        <w:rPr>
-          <w:i/>
-          <w:iCs/>
-        </w:rPr>
-        <w:t xml:space="preserve">≈ 6.88</w:t>
-      </w:r>
-      <w:r>
-        <w:t xml:space="preserve">. The answer 9.8 uses cosine, which gives </w:t>
+        <w:t xml:space="preserve">2</w:t>
+      </w:r>
+      <w:r>
+        <w:rPr>
+          <w:i/>
+          <w:iCs/>
+        </w:rPr>
+        <w:t xml:space="preserve">+9.8</w:t>
+      </w:r>
+      <w:r>
+        <w:rPr>
+          <w:i/>
+          <w:iCs/>
+          <w:vertAlign w:val="superscript"/>
+        </w:rPr>
+        <w:t xml:space="preserve">2</w:t>
+      </w:r>
+      <w:r>
+        <w:rPr>
+          <w:i/>
+          <w:iCs/>
+        </w:rPr>
+        <w:t xml:space="preserve">≈ 144=12</w:t>
+      </w:r>
+      <w:r>
+        <w:rPr>
+          <w:i/>
+          <w:iCs/>
+          <w:vertAlign w:val="superscript"/>
+        </w:rPr>
+        <w:t xml:space="preserve">2</w:t>
+      </w:r>
+      <w:r>
+        <w:t xml:space="preserve">. The first list swaps </w:t>
+      </w:r>
+      <w:r>
+        <w:rPr>
+          <w:i/>
+          <w:iCs/>
+        </w:rPr>
+        <w:t xml:space="preserve">a</w:t>
+      </w:r>
+      <w:r>
+        <w:t xml:space="preserve"> and </w:t>
       </w:r>
       <w:r>
         <w:rPr>
@@ -1645,65 +1644,33 @@
         <w:t xml:space="preserve">b</w:t>
       </w:r>
       <w:r>
-        <w:t xml:space="preserve">. The answer </w:t>
-      </w:r>
-      <w:r>
-        <w:rPr>
-          <w:i/>
-          <w:iCs/>
-        </w:rPr>
-        <w:t xml:space="preserve">−5.1</w:t>
-      </w:r>
-      <w:r>
-        <w:t xml:space="preserve"> comes from a calculator in radian mode; a side length can never be negative. The answer 20.9 divides by sine instead of multiplying. Then </w:t>
-      </w:r>
-      <w:r>
-        <w:rPr>
-          <w:i/>
-          <w:iCs/>
-        </w:rPr>
-        <w:t xml:space="preserve">B=90</w:t>
-      </w:r>
-      <w:r>
-        <w:rPr>
-          <w:i/>
-          <w:iCs/>
-          <w:vertAlign w:val="superscript"/>
-        </w:rPr>
-        <w:t xml:space="preserve">°</w:t>
-      </w:r>
-      <w:r>
-        <w:rPr>
-          <w:i/>
-          <w:iCs/>
-        </w:rPr>
-        <w:t xml:space="preserve">−35</w:t>
-      </w:r>
-      <w:r>
-        <w:rPr>
-          <w:i/>
-          <w:iCs/>
-          <w:vertAlign w:val="superscript"/>
-        </w:rPr>
-        <w:t xml:space="preserve">°</w:t>
-      </w:r>
-      <w:r>
-        <w:rPr>
-          <w:i/>
-          <w:iCs/>
-        </w:rPr>
-        <w:t xml:space="preserve">=55</w:t>
-      </w:r>
-      <w:r>
-        <w:rPr>
-          <w:i/>
-          <w:iCs/>
-          <w:vertAlign w:val="superscript"/>
-        </w:rPr>
-        <w:t xml:space="preserve">°</w:t>
-      </w:r>
-      <w:r>
-        <w:t xml:space="preserve">. </w:t>
+        <w:t xml:space="preserve"> (CheckIt's own answer key can do this too; see the Quick Summary); </w:t>
+      </w:r>
+      <w:r>
+        <w:rPr>
+          <w:i/>
+          <w:iCs/>
+        </w:rPr>
+        <w:t xml:space="preserve">145°</w:t>
+      </w:r>
+      <w:r>
+        <w:t xml:space="preserve"> subtracts from 180°, forgetting that the right angle already uses 90°; and the negative sides come from a calculator in radian mode. </w:t>
+      </w:r>
+      <w:r>
+        <w:rPr>
+          <w:b/>
+          <w:bCs/>
+          <w:i/>
+          <w:iCs/>
+        </w:rPr>
+        <w:t xml:space="preserve">B=55°</w:t>
+      </w:r>
+      <w:r>
+        <w:rPr>
+          <w:b/>
+          <w:bCs/>
+        </w:rPr>
+        <w:t xml:space="preserve">, </w:t>
       </w:r>
       <w:r>
         <w:rPr>
@@ -1713,6 +1680,22 @@
           <w:iCs/>
         </w:rPr>
         <w:t xml:space="preserve">a≈ 6.9</w:t>
+      </w:r>
+      <w:r>
+        <w:rPr>
+          <w:b/>
+          <w:bCs/>
+        </w:rPr>
+        <w:t xml:space="preserve">, </w:t>
+      </w:r>
+      <w:r>
+        <w:rPr>
+          <w:b/>
+          <w:bCs/>
+          <w:i/>
+          <w:iCs/>
+        </w:rPr>
+        <w:t xml:space="preserve">b≈ 9.8</w:t>
       </w:r>
       <w:r>
         <w:rPr>
@@ -1740,7 +1723,7 @@
           <wp:inline distT="0" distB="0" distL="0" distR="0">
             <wp:extent cx="4171950" cy="2476500"/>
             <wp:effectExtent t="0" r="0" b="0" l="0"/>
-            <wp:docPr id="1" name="as2" descr="A right triangle marked with angle B = 62°, a = 7, and b = ?. Plotted data: Triangle ABC, not drawn to scale. Vertex A is at the bottom left, C at the bottom right, and B at the top right, with a square marking the 90° angle at C. Side b is the bottom side, side a is the vertical side, and side c is the slanted side. Angle B is marked 62°. Side a is marked 7. Side b is marked with a question mark." title="A right triangle marked with angle B = 62°, a = 7, and b = ?"/>
+            <wp:docPr id="1" name="as2" descr="A right triangle marked with angle B = 62°, a = 7, and b = ?. Figure: Triangle ABC, not drawn to scale. Vertex A is at the bottom left, C at the bottom right, and B at the top right, with a square marking the 90° angle at C. Side b is the bottom side, side a is the vertical side, and side c is the slanted side. Angle B is marked 62°. Side a is marked 7. Side b is marked with a question mark." title="A right triangle marked with angle B = 62°, a = 7, and b = ?"/>
             <wp:cNvGraphicFramePr>
               <a:graphicFrameLocks xmlns:a="http://schemas.openxmlformats.org/drawingml/2006/main" noChangeAspect="1"/>
             </wp:cNvGraphicFramePr>
@@ -1787,7 +1770,7 @@
           <w:sz w:val="22"/>
           <w:szCs w:val="22"/>
         </w:rPr>
-        <w:t xml:space="preserve">Plotted data: </w:t>
+        <w:t xml:space="preserve">Figure: </w:t>
       </w:r>
       <w:r>
         <w:rPr>
@@ -1809,45 +1792,7 @@
           <w:sz w:val="40"/>
           <w:szCs w:val="40"/>
         </w:rPr>
-        <w:t xml:space="preserve">C=90</w:t>
-      </w:r>
-      <w:r>
-        <w:rPr>
-          <w:i/>
-          <w:iCs/>
-          <w:sz w:val="40"/>
-          <w:szCs w:val="40"/>
-          <w:vertAlign w:val="superscript"/>
-        </w:rPr>
-        <w:t xml:space="preserve">°</w:t>
-      </w:r>
-      <w:r>
-        <w:rPr>
-          <w:i/>
-          <w:iCs/>
-          <w:sz w:val="40"/>
-          <w:szCs w:val="40"/>
-        </w:rPr>
-        <w:t xml:space="preserve">,    B=62</w:t>
-      </w:r>
-      <w:r>
-        <w:rPr>
-          <w:i/>
-          <w:iCs/>
-          <w:sz w:val="40"/>
-          <w:szCs w:val="40"/>
-          <w:vertAlign w:val="superscript"/>
-        </w:rPr>
-        <w:t xml:space="preserve">°</w:t>
-      </w:r>
-      <w:r>
-        <w:rPr>
-          <w:i/>
-          <w:iCs/>
-          <w:sz w:val="40"/>
-          <w:szCs w:val="40"/>
-        </w:rPr>
-        <w:t xml:space="preserve">,    a=7</w:t>
+        <w:t xml:space="preserve">C=90°,    B=62°,    a=7</w:t>
       </w:r>
     </w:p>
     <w:p>
@@ -2015,22 +1960,7 @@
           <w:i/>
           <w:iCs/>
         </w:rPr>
-        <w:t xml:space="preserve"> 62</w:t>
-      </w:r>
-      <w:r>
-        <w:rPr>
-          <w:i/>
-          <w:iCs/>
-          <w:vertAlign w:val="superscript"/>
-        </w:rPr>
-        <w:t xml:space="preserve">°</w:t>
-      </w:r>
-      <w:r>
-        <w:rPr>
-          <w:i/>
-          <w:iCs/>
-        </w:rPr>
-        <w:t xml:space="preserve">=b/7</w:t>
+        <w:t xml:space="preserve"> 62°=b/7</w:t>
       </w:r>
       <w:r>
         <w:t xml:space="preserve">, so </w:t>
@@ -2040,7 +1970,7 @@
           <w:i/>
           <w:iCs/>
         </w:rPr>
-        <w:t xml:space="preserve">b=7</w:t>
+        <w:t xml:space="preserve">b=7 </w:t>
       </w:r>
       <w:r>
         <w:t xml:space="preserve">tan</w:t>
@@ -2050,22 +1980,7 @@
           <w:i/>
           <w:iCs/>
         </w:rPr>
-        <w:t xml:space="preserve"> 62</w:t>
-      </w:r>
-      <w:r>
-        <w:rPr>
-          <w:i/>
-          <w:iCs/>
-          <w:vertAlign w:val="superscript"/>
-        </w:rPr>
-        <w:t xml:space="preserve">°</w:t>
-      </w:r>
-      <w:r>
-        <w:rPr>
-          <w:i/>
-          <w:iCs/>
-        </w:rPr>
-        <w:t xml:space="preserve">≈ 13.17</w:t>
+        <w:t xml:space="preserve"> 62°≈ 13.17</w:t>
       </w:r>
       <w:r>
         <w:t xml:space="preserve">. The answer 3.7 uses angle </w:t>
@@ -2075,18 +1990,60 @@
           <w:i/>
           <w:iCs/>
         </w:rPr>
-        <w:t xml:space="preserve">A=28</w:t>
-      </w:r>
-      <w:r>
-        <w:rPr>
-          <w:i/>
-          <w:iCs/>
-          <w:vertAlign w:val="superscript"/>
-        </w:rPr>
-        <w:t xml:space="preserve">°</w:t>
-      </w:r>
-      <w:r>
-        <w:t xml:space="preserve"> instead, and 14.9 is the hypotenuse </w:t>
+        <w:t xml:space="preserve">A=28°</w:t>
+      </w:r>
+      <w:r>
+        <w:t xml:space="preserve"> instead, </w:t>
+      </w:r>
+      <w:r>
+        <w:rPr>
+          <w:i/>
+          <w:iCs/>
+        </w:rPr>
+        <w:t xml:space="preserve">7 </w:t>
+      </w:r>
+      <w:r>
+        <w:t xml:space="preserve">tan</w:t>
+      </w:r>
+      <w:r>
+        <w:rPr>
+          <w:i/>
+          <w:iCs/>
+        </w:rPr>
+        <w:t xml:space="preserve"> 28°</w:t>
+      </w:r>
+      <w:r>
+        <w:t xml:space="preserve">; 6.2 is </w:t>
+      </w:r>
+      <w:r>
+        <w:rPr>
+          <w:i/>
+          <w:iCs/>
+        </w:rPr>
+        <w:t xml:space="preserve">7 </w:t>
+      </w:r>
+      <w:r>
+        <w:t xml:space="preserve">sin</w:t>
+      </w:r>
+      <w:r>
+        <w:rPr>
+          <w:i/>
+          <w:iCs/>
+        </w:rPr>
+        <w:t xml:space="preserve"> 62°</w:t>
+      </w:r>
+      <w:r>
+        <w:t xml:space="preserve">, which treats side </w:t>
+      </w:r>
+      <w:r>
+        <w:rPr>
+          <w:i/>
+          <w:iCs/>
+        </w:rPr>
+        <w:t xml:space="preserve">a</w:t>
+      </w:r>
+      <w:r>
+        <w:t xml:space="preserve"> as the hypotenuse; and 14.9 is the hypotenuse </w:t>
       </w:r>
       <w:r>
         <w:rPr>
@@ -2133,7 +2090,7 @@
           <wp:inline distT="0" distB="0" distL="0" distR="0">
             <wp:extent cx="4171950" cy="2476500"/>
             <wp:effectExtent t="0" r="0" b="0" l="0"/>
-            <wp:docPr id="1" name="as3" descr="A right triangle marked with angle A = 20°, b = 15, and c = ?. Plotted data: Triangle ABC, not drawn to scale. Vertex A is at the bottom left, C at the bottom right, and B at the top right, with a square marking the 90° angle at C. Side b is the bottom side, side a is the vertical side, and side c is the slanted side. Angle A is marked 20°. Side b is marked 15. Side c is marked with a question mark." title="A right triangle marked with angle A = 20°, b = 15, and c = ?"/>
+            <wp:docPr id="1" name="as3" descr="A right triangle marked with angle A = 20°, b = 15, and c = ?. Figure: Triangle ABC, not drawn to scale. Vertex A is at the bottom left, C at the bottom right, and B at the top right, with a square marking the 90° angle at C. Side b is the bottom side, side a is the vertical side, and side c is the slanted side. Angle A is marked 20°. Side b is marked 15. Side c is marked with a question mark." title="A right triangle marked with angle A = 20°, b = 15, and c = ?"/>
             <wp:cNvGraphicFramePr>
               <a:graphicFrameLocks xmlns:a="http://schemas.openxmlformats.org/drawingml/2006/main" noChangeAspect="1"/>
             </wp:cNvGraphicFramePr>
@@ -2180,7 +2137,7 @@
           <w:sz w:val="22"/>
           <w:szCs w:val="22"/>
         </w:rPr>
-        <w:t xml:space="preserve">Plotted data: </w:t>
+        <w:t xml:space="preserve">Figure: </w:t>
       </w:r>
       <w:r>
         <w:rPr>
@@ -2202,45 +2159,7 @@
           <w:sz w:val="40"/>
           <w:szCs w:val="40"/>
         </w:rPr>
-        <w:t xml:space="preserve">C=90</w:t>
-      </w:r>
-      <w:r>
-        <w:rPr>
-          <w:i/>
-          <w:iCs/>
-          <w:sz w:val="40"/>
-          <w:szCs w:val="40"/>
-          <w:vertAlign w:val="superscript"/>
-        </w:rPr>
-        <w:t xml:space="preserve">°</w:t>
-      </w:r>
-      <w:r>
-        <w:rPr>
-          <w:i/>
-          <w:iCs/>
-          <w:sz w:val="40"/>
-          <w:szCs w:val="40"/>
-        </w:rPr>
-        <w:t xml:space="preserve">,    A=20</w:t>
-      </w:r>
-      <w:r>
-        <w:rPr>
-          <w:i/>
-          <w:iCs/>
-          <w:sz w:val="40"/>
-          <w:szCs w:val="40"/>
-          <w:vertAlign w:val="superscript"/>
-        </w:rPr>
-        <w:t xml:space="preserve">°</w:t>
-      </w:r>
-      <w:r>
-        <w:rPr>
-          <w:i/>
-          <w:iCs/>
-          <w:sz w:val="40"/>
-          <w:szCs w:val="40"/>
-        </w:rPr>
-        <w:t xml:space="preserve">,    b=15</w:t>
+        <w:t xml:space="preserve">C=90°,    A=20°,    b=15</w:t>
       </w:r>
     </w:p>
     <w:p>
@@ -2388,22 +2307,7 @@
           <w:i/>
           <w:iCs/>
         </w:rPr>
-        <w:t xml:space="preserve"> 20</w:t>
-      </w:r>
-      <w:r>
-        <w:rPr>
-          <w:i/>
-          <w:iCs/>
-          <w:vertAlign w:val="superscript"/>
-        </w:rPr>
-        <w:t xml:space="preserve">°</w:t>
-      </w:r>
-      <w:r>
-        <w:rPr>
-          <w:i/>
-          <w:iCs/>
-        </w:rPr>
-        <w:t xml:space="preserve">=15/c</w:t>
+        <w:t xml:space="preserve"> 20°=15/c</w:t>
       </w:r>
       <w:r>
         <w:t xml:space="preserve">. The unknown is on the bottom, so </w:t>
@@ -2423,22 +2327,7 @@
           <w:i/>
           <w:iCs/>
         </w:rPr>
-        <w:t xml:space="preserve"> 20</w:t>
-      </w:r>
-      <w:r>
-        <w:rPr>
-          <w:i/>
-          <w:iCs/>
-          <w:vertAlign w:val="superscript"/>
-        </w:rPr>
-        <w:t xml:space="preserve">°</w:t>
-      </w:r>
-      <w:r>
-        <w:rPr>
-          <w:i/>
-          <w:iCs/>
-        </w:rPr>
-        <w:t xml:space="preserve">)≈ 15.96</w:t>
+        <w:t xml:space="preserve"> 20°≈ 15.96)</w:t>
       </w:r>
       <w:r>
         <w:t xml:space="preserve">. The answer 14.1 multiplies instead of dividing, and it is shorter than </w:t>
@@ -2451,7 +2340,53 @@
         <w:t xml:space="preserve">b</w:t>
       </w:r>
       <w:r>
-        <w:t xml:space="preserve">, which cannot happen for a hypotenuse. The answer 43.9 uses sine. </w:t>
+        <w:t xml:space="preserve">, which cannot happen for a hypotenuse. The answer 43.9 divides by </w:t>
+      </w:r>
+      <w:r>
+        <w:t xml:space="preserve">sin</w:t>
+      </w:r>
+      <w:r>
+        <w:rPr>
+          <w:i/>
+          <w:iCs/>
+        </w:rPr>
+        <w:t xml:space="preserve"> 20°</w:t>
+      </w:r>
+      <w:r>
+        <w:t xml:space="preserve"> instead of </w:t>
+      </w:r>
+      <w:r>
+        <w:t xml:space="preserve">cos</w:t>
+      </w:r>
+      <w:r>
+        <w:rPr>
+          <w:i/>
+          <w:iCs/>
+        </w:rPr>
+        <w:t xml:space="preserve"> 20°</w:t>
+      </w:r>
+      <w:r>
+        <w:t xml:space="preserve">, and 5.1 is </w:t>
+      </w:r>
+      <w:r>
+        <w:rPr>
+          <w:i/>
+          <w:iCs/>
+        </w:rPr>
+        <w:t xml:space="preserve">15 </w:t>
+      </w:r>
+      <w:r>
+        <w:t xml:space="preserve">sin</w:t>
+      </w:r>
+      <w:r>
+        <w:rPr>
+          <w:i/>
+          <w:iCs/>
+        </w:rPr>
+        <w:t xml:space="preserve"> 20°</w:t>
+      </w:r>
+      <w:r>
+        <w:t xml:space="preserve">, which uses sine and multiplies. </w:t>
       </w:r>
       <w:r>
         <w:rPr>
@@ -2488,7 +2423,7 @@
           <wp:inline distT="0" distB="0" distL="0" distR="0">
             <wp:extent cx="4191000" cy="2476500"/>
             <wp:effectExtent t="0" r="0" b="0" l="0"/>
-            <wp:docPr id="1" name="as4" descr="A right triangle marked with angle A = 27°, a = 11, and c = ?. Plotted data: Triangle ABC, not drawn to scale. Vertex A is at the bottom left, C at the bottom right, and B at the top right, with a square marking the 90° angle at C. Side b is the bottom side, side a is the vertical side, and side c is the slanted side. Angle A is marked 27°. Side a is marked 11. Side c is marked with a question mark." title="A right triangle marked with angle A = 27°, a = 11, and c = ?"/>
+            <wp:docPr id="1" name="as4" descr="A right triangle marked with angle A = 28.1°, b = 15, and a = ?. Figure: Triangle ABC, not drawn to scale. Vertex A is at the bottom left, C at the bottom right, and B at the top right, with a square marking the 90° angle at C. Side b is the bottom side, side a is the vertical side, and side c is the slanted side. Angle A is marked 28.1°. Side b is marked 15. Side a is marked with a question mark." title="A right triangle marked with angle A = 28.1°, b = 15, and a = ?"/>
             <wp:cNvGraphicFramePr>
               <a:graphicFrameLocks xmlns:a="http://schemas.openxmlformats.org/drawingml/2006/main" noChangeAspect="1"/>
             </wp:cNvGraphicFramePr>
@@ -2535,14 +2470,14 @@
           <w:sz w:val="22"/>
           <w:szCs w:val="22"/>
         </w:rPr>
-        <w:t xml:space="preserve">Plotted data: </w:t>
+        <w:t xml:space="preserve">Figure: </w:t>
       </w:r>
       <w:r>
         <w:rPr>
           <w:sz w:val="22"/>
           <w:szCs w:val="22"/>
         </w:rPr>
-        <w:t xml:space="preserve">Triangle ABC, not drawn to scale. Vertex A is at the bottom left, C at the bottom right, and B at the top right, with a square marking the 90° angle at C. Side b is the bottom side, side a is the vertical side, and side c is the slanted side. Angle A is marked 27°. Side a is marked 11. Side c is marked with a question mark.</w:t>
+        <w:t xml:space="preserve">Triangle ABC, not drawn to scale. Vertex A is at the bottom left, C at the bottom right, and B at the top right, with a square marking the 90° angle at C. Side b is the bottom side, side a is the vertical side, and side c is the slanted side. Angle A is marked 28.1°. Side b is marked 15. Side a is marked with a question mark.</w:t>
       </w:r>
     </w:p>
     <w:p>
@@ -2557,45 +2492,7 @@
           <w:sz w:val="40"/>
           <w:szCs w:val="40"/>
         </w:rPr>
-        <w:t xml:space="preserve">C=90</w:t>
-      </w:r>
-      <w:r>
-        <w:rPr>
-          <w:i/>
-          <w:iCs/>
-          <w:sz w:val="40"/>
-          <w:szCs w:val="40"/>
-          <w:vertAlign w:val="superscript"/>
-        </w:rPr>
-        <w:t xml:space="preserve">°</w:t>
-      </w:r>
-      <w:r>
-        <w:rPr>
-          <w:i/>
-          <w:iCs/>
-          <w:sz w:val="40"/>
-          <w:szCs w:val="40"/>
-        </w:rPr>
-        <w:t xml:space="preserve">,    A=27</w:t>
-      </w:r>
-      <w:r>
-        <w:rPr>
-          <w:i/>
-          <w:iCs/>
-          <w:sz w:val="40"/>
-          <w:szCs w:val="40"/>
-          <w:vertAlign w:val="superscript"/>
-        </w:rPr>
-        <w:t xml:space="preserve">°</w:t>
-      </w:r>
-      <w:r>
-        <w:rPr>
-          <w:i/>
-          <w:iCs/>
-          <w:sz w:val="40"/>
-          <w:szCs w:val="40"/>
-        </w:rPr>
-        <w:t xml:space="preserve">,    a=11</w:t>
+        <w:t xml:space="preserve">C=90°,    A=28.1°,    b=15</w:t>
       </w:r>
     </w:p>
     <w:p>
@@ -2619,10 +2516,10 @@
           <w:i/>
           <w:iCs/>
         </w:rPr>
-        <w:t xml:space="preserve">c</w:t>
-      </w:r>
-      <w:r>
-        <w:t xml:space="preserve">.</w:t>
+        <w:t xml:space="preserve">a</w:t>
+      </w:r>
+      <w:r>
+        <w:t xml:space="preserve">, to the nearest whole number.</w:t>
       </w:r>
     </w:p>
     <w:p>
@@ -2638,7 +2535,7 @@
         <w:t xml:space="preserve">A.  </w:t>
       </w:r>
       <w:r>
-        <w:t xml:space="preserve">about 5.0</w:t>
+        <w:t xml:space="preserve">7</w:t>
       </w:r>
     </w:p>
     <w:p>
@@ -2654,7 +2551,7 @@
         <w:t xml:space="preserve">B.  </w:t>
       </w:r>
       <w:r>
-        <w:t xml:space="preserve">about 21.6</w:t>
+        <w:t xml:space="preserve">8</w:t>
       </w:r>
     </w:p>
     <w:p>
@@ -2670,7 +2567,7 @@
         <w:t xml:space="preserve">C.  </w:t>
       </w:r>
       <w:r>
-        <w:t xml:space="preserve">about 24.2</w:t>
+        <w:t xml:space="preserve">28</w:t>
       </w:r>
     </w:p>
     <w:p>
@@ -2686,7 +2583,7 @@
         <w:t xml:space="preserve">D.  </w:t>
       </w:r>
       <w:r>
-        <w:t xml:space="preserve">about 12.3</w:t>
+        <w:t xml:space="preserve">13</w:t>
       </w:r>
     </w:p>
     <w:p>
@@ -2723,7 +2620,44 @@
         <w:t xml:space="preserve">A</w:t>
       </w:r>
       <w:r>
-        <w:t xml:space="preserve">, so use sine: </w:t>
+        <w:t xml:space="preserve"> and </w:t>
+      </w:r>
+      <w:r>
+        <w:rPr>
+          <w:i/>
+          <w:iCs/>
+        </w:rPr>
+        <w:t xml:space="preserve">b</w:t>
+      </w:r>
+      <w:r>
+        <w:t xml:space="preserve"> is adjacent, so use tangent: </w:t>
+      </w:r>
+      <w:r>
+        <w:rPr>
+          <w:i/>
+          <w:iCs/>
+        </w:rPr>
+        <w:t xml:space="preserve">a=15 </w:t>
+      </w:r>
+      <w:r>
+        <w:t xml:space="preserve">tan</w:t>
+      </w:r>
+      <w:r>
+        <w:rPr>
+          <w:i/>
+          <w:iCs/>
+        </w:rPr>
+        <w:t xml:space="preserve"> 28.1°≈ 8.01</w:t>
+      </w:r>
+      <w:r>
+        <w:t xml:space="preserve">, which rounds to 8. On CheckIt, an angle given to the tenth of a degree usually means the sides are whole numbers. 7 is </w:t>
+      </w:r>
+      <w:r>
+        <w:rPr>
+          <w:i/>
+          <w:iCs/>
+        </w:rPr>
+        <w:t xml:space="preserve">15 </w:t>
       </w:r>
       <w:r>
         <w:t xml:space="preserve">sin</w:t>
@@ -2733,60 +2667,10 @@
           <w:i/>
           <w:iCs/>
         </w:rPr>
-        <w:t xml:space="preserve"> 27</w:t>
-      </w:r>
-      <w:r>
-        <w:rPr>
-          <w:i/>
-          <w:iCs/>
-          <w:vertAlign w:val="superscript"/>
-        </w:rPr>
-        <w:t xml:space="preserve">°</w:t>
-      </w:r>
-      <w:r>
-        <w:rPr>
-          <w:i/>
-          <w:iCs/>
-        </w:rPr>
-        <w:t xml:space="preserve">=11/c</w:t>
-      </w:r>
-      <w:r>
-        <w:t xml:space="preserve">, and </w:t>
-      </w:r>
-      <w:r>
-        <w:rPr>
-          <w:i/>
-          <w:iCs/>
-        </w:rPr>
-        <w:t xml:space="preserve">c=11/(</w:t>
-      </w:r>
-      <w:r>
-        <w:t xml:space="preserve">sin</w:t>
-      </w:r>
-      <w:r>
-        <w:rPr>
-          <w:i/>
-          <w:iCs/>
-        </w:rPr>
-        <w:t xml:space="preserve"> 27</w:t>
-      </w:r>
-      <w:r>
-        <w:rPr>
-          <w:i/>
-          <w:iCs/>
-          <w:vertAlign w:val="superscript"/>
-        </w:rPr>
-        <w:t xml:space="preserve">°</w:t>
-      </w:r>
-      <w:r>
-        <w:rPr>
-          <w:i/>
-          <w:iCs/>
-        </w:rPr>
-        <w:t xml:space="preserve">)≈ 24.23</w:t>
-      </w:r>
-      <w:r>
-        <w:t xml:space="preserve">. The answer 21.6 is side </w:t>
+        <w:t xml:space="preserve"> 28.1°</w:t>
+      </w:r>
+      <w:r>
+        <w:t xml:space="preserve">, which treats </w:t>
       </w:r>
       <w:r>
         <w:rPr>
@@ -2796,22 +2680,44 @@
         <w:t xml:space="preserve">b</w:t>
       </w:r>
       <w:r>
-        <w:t xml:space="preserve">, from tangent. The answer 5.0 multiplies instead of dividing, and 12.3 uses cosine. The other angle is </w:t>
-      </w:r>
-      <w:r>
-        <w:rPr>
-          <w:i/>
-          <w:iCs/>
-        </w:rPr>
-        <w:t xml:space="preserve">B=63</w:t>
-      </w:r>
-      <w:r>
-        <w:rPr>
-          <w:i/>
-          <w:iCs/>
-          <w:vertAlign w:val="superscript"/>
-        </w:rPr>
-        <w:t xml:space="preserve">°</w:t>
+        <w:t xml:space="preserve"> as the hypotenuse; 28 is </w:t>
+      </w:r>
+      <w:r>
+        <w:rPr>
+          <w:i/>
+          <w:iCs/>
+        </w:rPr>
+        <w:t xml:space="preserve">15/(</w:t>
+      </w:r>
+      <w:r>
+        <w:t xml:space="preserve">tan</w:t>
+      </w:r>
+      <w:r>
+        <w:rPr>
+          <w:i/>
+          <w:iCs/>
+        </w:rPr>
+        <w:t xml:space="preserve"> 28.1°)</w:t>
+      </w:r>
+      <w:r>
+        <w:t xml:space="preserve">, dividing instead of multiplying; and 13 is </w:t>
+      </w:r>
+      <w:r>
+        <w:rPr>
+          <w:i/>
+          <w:iCs/>
+        </w:rPr>
+        <w:t xml:space="preserve">15 </w:t>
+      </w:r>
+      <w:r>
+        <w:t xml:space="preserve">cos</w:t>
+      </w:r>
+      <w:r>
+        <w:rPr>
+          <w:i/>
+          <w:iCs/>
+        </w:rPr>
+        <w:t xml:space="preserve"> 28.1°</w:t>
       </w:r>
       <w:r>
         <w:t xml:space="preserve">. </w:t>
@@ -2823,7 +2729,7 @@
           <w:i/>
           <w:iCs/>
         </w:rPr>
-        <w:t xml:space="preserve">c≈ 24.2</w:t>
+        <w:t xml:space="preserve">a=8</w:t>
       </w:r>
       <w:r>
         <w:rPr>
@@ -2851,7 +2757,7 @@
           <wp:inline distT="0" distB="0" distL="0" distR="0">
             <wp:extent cx="4171950" cy="2476500"/>
             <wp:effectExtent t="0" r="0" b="0" l="0"/>
-            <wp:docPr id="1" name="ts1" descr="A right triangle marked with a = 8, b = 15, and c = ?. Plotted data: Triangle ABC, not drawn to scale. Vertex A is at the bottom left, C at the bottom right, and B at the top right, with a square marking the 90° angle at C. Side b is the bottom side, side a is the vertical side, and side c is the slanted side. Side a is marked 8 and side b is marked 15. Side c is marked with a question mark." title="A right triangle marked with a = 8, b = 15, and c = ?"/>
+            <wp:docPr id="1" name="ts1" descr="A right triangle marked with a = 6.9, c = 12, and angle A = ?. Figure: Triangle ABC, not drawn to scale. Vertex A is at the bottom left, C at the bottom right, and B at the top right, with a square marking the 90° angle at C. Side b is the bottom side, side a is the vertical side, and side c is the slanted side. Side a is marked 6.9 and side c is marked 12. Angle A is marked with a question mark." title="A right triangle marked with a = 6.9, c = 12, and angle A = ?"/>
             <wp:cNvGraphicFramePr>
               <a:graphicFrameLocks xmlns:a="http://schemas.openxmlformats.org/drawingml/2006/main" noChangeAspect="1"/>
             </wp:cNvGraphicFramePr>
@@ -2898,14 +2804,14 @@
           <w:sz w:val="22"/>
           <w:szCs w:val="22"/>
         </w:rPr>
-        <w:t xml:space="preserve">Plotted data: </w:t>
+        <w:t xml:space="preserve">Figure: </w:t>
       </w:r>
       <w:r>
         <w:rPr>
           <w:sz w:val="22"/>
           <w:szCs w:val="22"/>
         </w:rPr>
-        <w:t xml:space="preserve">Triangle ABC, not drawn to scale. Vertex A is at the bottom left, C at the bottom right, and B at the top right, with a square marking the 90° angle at C. Side b is the bottom side, side a is the vertical side, and side c is the slanted side. Side a is marked 8 and side b is marked 15. Side c is marked with a question mark.</w:t>
+        <w:t xml:space="preserve">Triangle ABC, not drawn to scale. Vertex A is at the bottom left, C at the bottom right, and B at the top right, with a square marking the 90° angle at C. Side b is the bottom side, side a is the vertical side, and side c is the slanted side. Side a is marked 6.9 and side c is marked 12. Angle A is marked with a question mark.</w:t>
       </w:r>
     </w:p>
     <w:p>
@@ -2920,26 +2826,7 @@
           <w:sz w:val="40"/>
           <w:szCs w:val="40"/>
         </w:rPr>
-        <w:t xml:space="preserve">C=90</w:t>
-      </w:r>
-      <w:r>
-        <w:rPr>
-          <w:i/>
-          <w:iCs/>
-          <w:sz w:val="40"/>
-          <w:szCs w:val="40"/>
-          <w:vertAlign w:val="superscript"/>
-        </w:rPr>
-        <w:t xml:space="preserve">°</w:t>
-      </w:r>
-      <w:r>
-        <w:rPr>
-          <w:i/>
-          <w:iCs/>
-          <w:sz w:val="40"/>
-          <w:szCs w:val="40"/>
-        </w:rPr>
-        <w:t xml:space="preserve">,    a=8,    b=15</w:t>
+        <w:t xml:space="preserve">C=90°,    a=6.9,    c=12</w:t>
       </w:r>
     </w:p>
     <w:p>
@@ -2956,17 +2843,17 @@
         <w:spacing w:after="120" w:before="80" w:line="300"/>
       </w:pPr>
       <w:r>
-        <w:t xml:space="preserve">Find side </w:t>
-      </w:r>
-      <w:r>
-        <w:rPr>
-          <w:i/>
-          <w:iCs/>
-        </w:rPr>
-        <w:t xml:space="preserve">c</w:t>
-      </w:r>
-      <w:r>
-        <w:t xml:space="preserve">.</w:t>
+        <w:t xml:space="preserve">Find angle </w:t>
+      </w:r>
+      <w:r>
+        <w:rPr>
+          <w:i/>
+          <w:iCs/>
+        </w:rPr>
+        <w:t xml:space="preserve">A</w:t>
+      </w:r>
+      <w:r>
+        <w:t xml:space="preserve">, to the nearest degree.</w:t>
       </w:r>
     </w:p>
     <w:p>
@@ -2982,7 +2869,7 @@
         <w:t xml:space="preserve">A.  </w:t>
       </w:r>
       <w:r>
-        <w:t xml:space="preserve">23</w:t>
+        <w:t xml:space="preserve">55°</w:t>
       </w:r>
     </w:p>
     <w:p>
@@ -2998,7 +2885,7 @@
         <w:t xml:space="preserve">B.  </w:t>
       </w:r>
       <w:r>
-        <w:t xml:space="preserve">17</w:t>
+        <w:t xml:space="preserve">30°</w:t>
       </w:r>
     </w:p>
     <w:p>
@@ -3014,7 +2901,7 @@
         <w:t xml:space="preserve">C.  </w:t>
       </w:r>
       <w:r>
-        <w:t xml:space="preserve">about 12.7</w:t>
+        <w:t xml:space="preserve">35°</w:t>
       </w:r>
     </w:p>
     <w:p>
@@ -3030,7 +2917,7 @@
         <w:t xml:space="preserve">D.  </w:t>
       </w:r>
       <w:r>
-        <w:t xml:space="preserve">7</w:t>
+        <w:t xml:space="preserve">0.6°</w:t>
       </w:r>
     </w:p>
     <w:p>
@@ -3047,7 +2934,27 @@
         <w:spacing w:after="120" w:before="80" w:line="300"/>
       </w:pPr>
       <w:r>
-        <w:t xml:space="preserve">Both legs are known, so add their squares: </w:t>
+        <w:t xml:space="preserve">Side </w:t>
+      </w:r>
+      <w:r>
+        <w:rPr>
+          <w:i/>
+          <w:iCs/>
+        </w:rPr>
+        <w:t xml:space="preserve">a</w:t>
+      </w:r>
+      <w:r>
+        <w:t xml:space="preserve"> is opposite </w:t>
+      </w:r>
+      <w:r>
+        <w:rPr>
+          <w:i/>
+          <w:iCs/>
+        </w:rPr>
+        <w:t xml:space="preserve">A</w:t>
+      </w:r>
+      <w:r>
+        <w:t xml:space="preserve">, and </w:t>
       </w:r>
       <w:r>
         <w:rPr>
@@ -3057,81 +2964,67 @@
         <w:t xml:space="preserve">c</w:t>
       </w:r>
       <w:r>
+        <w:t xml:space="preserve"> is the hypotenuse, so </w:t>
+      </w:r>
+      <w:r>
+        <w:t xml:space="preserve">sin</w:t>
+      </w:r>
+      <w:r>
+        <w:rPr>
+          <w:i/>
+          <w:iCs/>
+        </w:rPr>
+        <w:t xml:space="preserve"> A=6.9/12</w:t>
+      </w:r>
+      <w:r>
+        <w:t xml:space="preserve">. Use inverse sine: </w:t>
+      </w:r>
+      <w:r>
+        <w:rPr>
+          <w:i/>
+          <w:iCs/>
+        </w:rPr>
+        <w:t xml:space="preserve">A=</w:t>
+      </w:r>
+      <w:r>
+        <w:t xml:space="preserve">sin</w:t>
+      </w:r>
+      <w:r>
         <w:rPr>
           <w:i/>
           <w:iCs/>
           <w:vertAlign w:val="superscript"/>
         </w:rPr>
-        <w:t xml:space="preserve">2</w:t>
-      </w:r>
-      <w:r>
-        <w:rPr>
-          <w:i/>
-          <w:iCs/>
-        </w:rPr>
-        <w:t xml:space="preserve">=8</w:t>
-      </w:r>
-      <w:r>
-        <w:rPr>
-          <w:i/>
-          <w:iCs/>
-          <w:vertAlign w:val="superscript"/>
-        </w:rPr>
-        <w:t xml:space="preserve">2</w:t>
-      </w:r>
-      <w:r>
-        <w:rPr>
-          <w:i/>
-          <w:iCs/>
-        </w:rPr>
-        <w:t xml:space="preserve">+15</w:t>
-      </w:r>
-      <w:r>
-        <w:rPr>
-          <w:i/>
-          <w:iCs/>
-          <w:vertAlign w:val="superscript"/>
-        </w:rPr>
-        <w:t xml:space="preserve">2</w:t>
-      </w:r>
-      <w:r>
-        <w:rPr>
-          <w:i/>
-          <w:iCs/>
-        </w:rPr>
-        <w:t xml:space="preserve">=64+225=289</w:t>
-      </w:r>
-      <w:r>
-        <w:t xml:space="preserve">, and </w:t>
-      </w:r>
-      <w:r>
-        <w:rPr>
-          <w:i/>
-          <w:iCs/>
-        </w:rPr>
-        <w:t xml:space="preserve">c=√289=17</w:t>
-      </w:r>
-      <w:r>
-        <w:t xml:space="preserve">. Adding the sides themselves gives 23. The answer 12.7 subtracts the squares, which is only right when </w:t>
-      </w:r>
-      <w:r>
-        <w:rPr>
-          <w:i/>
-          <w:iCs/>
-        </w:rPr>
-        <w:t xml:space="preserve">c</w:t>
-      </w:r>
-      <w:r>
-        <w:t xml:space="preserve"> is one of the known sides. </w:t>
-      </w:r>
-      <w:r>
-        <w:rPr>
-          <w:b/>
-          <w:bCs/>
-          <w:i/>
-          <w:iCs/>
-        </w:rPr>
-        <w:t xml:space="preserve">c=17</w:t>
+        <w:t xml:space="preserve">−1</w:t>
+      </w:r>
+      <w:r>
+        <w:rPr>
+          <w:i/>
+          <w:iCs/>
+        </w:rPr>
+        <w:t xml:space="preserve">(6.9/12)≈ 35.1°</w:t>
+      </w:r>
+      <w:r>
+        <w:t xml:space="preserve">, which rounds to 35°. On CheckIt, decimal sides like 6.9 usually come with angles to the nearest degree. 55° uses inverse cosine, which gives angle </w:t>
+      </w:r>
+      <w:r>
+        <w:rPr>
+          <w:i/>
+          <w:iCs/>
+        </w:rPr>
+        <w:t xml:space="preserve">B</w:t>
+      </w:r>
+      <w:r>
+        <w:t xml:space="preserve">; 30° uses inverse tangent, but 12 is the hypotenuse, not the adjacent side; and 0.6 is the angle in radians, from radian mode. </w:t>
+      </w:r>
+      <w:r>
+        <w:rPr>
+          <w:b/>
+          <w:bCs/>
+          <w:i/>
+          <w:iCs/>
+        </w:rPr>
+        <w:t xml:space="preserve">A≈ 35°</w:t>
       </w:r>
       <w:r>
         <w:rPr>
@@ -3159,7 +3052,7 @@
           <wp:inline distT="0" distB="0" distL="0" distR="0">
             <wp:extent cx="4191000" cy="2476500"/>
             <wp:effectExtent t="0" r="0" b="0" l="0"/>
-            <wp:docPr id="1" name="ts2" descr="A right triangle marked with a = 20, c = 29, and b = ?. Plotted data: Triangle ABC, not drawn to scale. Vertex A is at the bottom left, C at the bottom right, and B at the top right, with a square marking the 90° angle at C. Side b is the bottom side, side a is the vertical side, and side c is the slanted side. Side a is marked 20 and side c is marked 29. Side b is marked with a question mark." title="A right triangle marked with a = 20, c = 29, and b = ?"/>
+            <wp:docPr id="1" name="ts2" descr="A right triangle marked with a = 20, c = 29, and b = ?. Figure: Triangle ABC, not drawn to scale. Vertex A is at the bottom left, C at the bottom right, and B at the top right, with a square marking the 90° angle at C. Side b is the bottom side, side a is the vertical side, and side c is the slanted side. Side a is marked 20 and side c is marked 29. Side b is marked with a question mark." title="A right triangle marked with a = 20, c = 29, and b = ?"/>
             <wp:cNvGraphicFramePr>
               <a:graphicFrameLocks xmlns:a="http://schemas.openxmlformats.org/drawingml/2006/main" noChangeAspect="1"/>
             </wp:cNvGraphicFramePr>
@@ -3206,7 +3099,7 @@
           <w:sz w:val="22"/>
           <w:szCs w:val="22"/>
         </w:rPr>
-        <w:t xml:space="preserve">Plotted data: </w:t>
+        <w:t xml:space="preserve">Figure: </w:t>
       </w:r>
       <w:r>
         <w:rPr>
@@ -3228,26 +3121,7 @@
           <w:sz w:val="40"/>
           <w:szCs w:val="40"/>
         </w:rPr>
-        <w:t xml:space="preserve">C=90</w:t>
-      </w:r>
-      <w:r>
-        <w:rPr>
-          <w:i/>
-          <w:iCs/>
-          <w:sz w:val="40"/>
-          <w:szCs w:val="40"/>
-          <w:vertAlign w:val="superscript"/>
-        </w:rPr>
-        <w:t xml:space="preserve">°</w:t>
-      </w:r>
-      <w:r>
-        <w:rPr>
-          <w:i/>
-          <w:iCs/>
-          <w:sz w:val="40"/>
-          <w:szCs w:val="40"/>
-        </w:rPr>
-        <w:t xml:space="preserve">,    a=20,    c=29</w:t>
+        <w:t xml:space="preserve">C=90°,    a=20,    c=29</w:t>
       </w:r>
     </w:p>
     <w:p>
@@ -3440,7 +3314,17 @@
         <w:t xml:space="preserve">b=21</w:t>
       </w:r>
       <w:r>
-        <w:t xml:space="preserve">. The answer 35.2 adds the squares, which would make a leg longer than the hypotenuse. The answer 9 subtracts the sides without squaring. </w:t>
+        <w:t xml:space="preserve">. The answer 35.2 adds the squares, which would make a leg longer than the hypotenuse. The answer 9 subtracts the sides without squaring, and 3 is </w:t>
+      </w:r>
+      <w:r>
+        <w:rPr>
+          <w:i/>
+          <w:iCs/>
+        </w:rPr>
+        <w:t xml:space="preserve">√(29−20)</w:t>
+      </w:r>
+      <w:r>
+        <w:t xml:space="preserve">, which subtracts the sides before taking the root. </w:t>
       </w:r>
       <w:r>
         <w:rPr>
@@ -3477,7 +3361,7 @@
           <wp:inline distT="0" distB="0" distL="0" distR="0">
             <wp:extent cx="4171950" cy="2476500"/>
             <wp:effectExtent t="0" r="0" b="0" l="0"/>
-            <wp:docPr id="1" name="ts3" descr="A right triangle marked with a = 8, b = 15, and angle A = ?. Plotted data: Triangle ABC, not drawn to scale. Vertex A is at the bottom left, C at the bottom right, and B at the top right, with a square marking the 90° angle at C. Side b is the bottom side, side a is the vertical side, and side c is the slanted side. Side a is marked 8 and side b is marked 15. Angle A is marked with a question mark." title="A right triangle marked with a = 8, b = 15, and angle A = ?"/>
+            <wp:docPr id="1" name="ts3" descr="A right triangle marked with a = 8, b = 15, and angle A = ?. Figure: Triangle ABC, not drawn to scale. Vertex A is at the bottom left, C at the bottom right, and B at the top right, with a square marking the 90° angle at C. Side b is the bottom side, side a is the vertical side, and side c is the slanted side. Side a is marked 8 and side b is marked 15. Angle A is marked with a question mark." title="A right triangle marked with a = 8, b = 15, and angle A = ?"/>
             <wp:cNvGraphicFramePr>
               <a:graphicFrameLocks xmlns:a="http://schemas.openxmlformats.org/drawingml/2006/main" noChangeAspect="1"/>
             </wp:cNvGraphicFramePr>
@@ -3524,7 +3408,7 @@
           <w:sz w:val="22"/>
           <w:szCs w:val="22"/>
         </w:rPr>
-        <w:t xml:space="preserve">Plotted data: </w:t>
+        <w:t xml:space="preserve">Figure: </w:t>
       </w:r>
       <w:r>
         <w:rPr>
@@ -3546,26 +3430,7 @@
           <w:sz w:val="40"/>
           <w:szCs w:val="40"/>
         </w:rPr>
-        <w:t xml:space="preserve">C=90</w:t>
-      </w:r>
-      <w:r>
-        <w:rPr>
-          <w:i/>
-          <w:iCs/>
-          <w:sz w:val="40"/>
-          <w:szCs w:val="40"/>
-          <w:vertAlign w:val="superscript"/>
-        </w:rPr>
-        <w:t xml:space="preserve">°</w:t>
-      </w:r>
-      <w:r>
-        <w:rPr>
-          <w:i/>
-          <w:iCs/>
-          <w:sz w:val="40"/>
-          <w:szCs w:val="40"/>
-        </w:rPr>
-        <w:t xml:space="preserve">,    a=8,    b=15</w:t>
+        <w:t xml:space="preserve">C=90°,    a=8,    b=15</w:t>
       </w:r>
     </w:p>
     <w:p>
@@ -3741,7 +3606,23 @@
           <w:i/>
           <w:iCs/>
         </w:rPr>
-        <w:t xml:space="preserve">(8/15)≈ 28.07</w:t>
+        <w:t xml:space="preserve">(8/15)≈ 28.07°</w:t>
+      </w:r>
+      <w:r>
+        <w:t xml:space="preserve">. The answer 61.9 is angle </w:t>
+      </w:r>
+      <w:r>
+        <w:rPr>
+          <w:i/>
+          <w:iCs/>
+        </w:rPr>
+        <w:t xml:space="preserve">B</w:t>
+      </w:r>
+      <w:r>
+        <w:t xml:space="preserve">, from flipping the ratio. The answer 0.5 is the ratio itself, not an angle. The answer 32.2 is </w:t>
+      </w:r>
+      <w:r>
+        <w:t xml:space="preserve">sin</w:t>
       </w:r>
       <w:r>
         <w:rPr>
@@ -3749,39 +3630,26 @@
           <w:iCs/>
           <w:vertAlign w:val="superscript"/>
         </w:rPr>
-        <w:t xml:space="preserve">°</w:t>
-      </w:r>
-      <w:r>
-        <w:t xml:space="preserve">. The answer 61.9 is angle </w:t>
-      </w:r>
-      <w:r>
-        <w:rPr>
-          <w:i/>
-          <w:iCs/>
-        </w:rPr>
-        <w:t xml:space="preserve">B</w:t>
-      </w:r>
-      <w:r>
-        <w:t xml:space="preserve">, from flipping the ratio. The answer 0.5 is the ratio itself, not an angle. The answer 32.2 uses inverse sine with the wrong sides. </w:t>
-      </w:r>
-      <w:r>
-        <w:rPr>
-          <w:b/>
-          <w:bCs/>
-          <w:i/>
-          <w:iCs/>
-        </w:rPr>
-        <w:t xml:space="preserve">A≈ 28.1</w:t>
-      </w:r>
-      <w:r>
-        <w:rPr>
-          <w:b/>
-          <w:bCs/>
-          <w:i/>
-          <w:iCs/>
-          <w:vertAlign w:val="superscript"/>
-        </w:rPr>
-        <w:t xml:space="preserve">°</w:t>
+        <w:t xml:space="preserve">−1</w:t>
+      </w:r>
+      <w:r>
+        <w:rPr>
+          <w:i/>
+          <w:iCs/>
+        </w:rPr>
+        <w:t xml:space="preserve">(8/15)</w:t>
+      </w:r>
+      <w:r>
+        <w:t xml:space="preserve">, which treats 15 as the hypotenuse. </w:t>
+      </w:r>
+      <w:r>
+        <w:rPr>
+          <w:b/>
+          <w:bCs/>
+          <w:i/>
+          <w:iCs/>
+        </w:rPr>
+        <w:t xml:space="preserve">A≈ 28.1°</w:t>
       </w:r>
       <w:r>
         <w:rPr>
@@ -3809,7 +3677,7 @@
           <wp:inline distT="0" distB="0" distL="0" distR="0">
             <wp:extent cx="4171950" cy="2476500"/>
             <wp:effectExtent t="0" r="0" b="0" l="0"/>
-            <wp:docPr id="1" name="ts4" descr="A right triangle marked with b = 24, c = 25, and angle A = ?. Plotted data: Triangle ABC, not drawn to scale. Vertex A is at the bottom left, C at the bottom right, and B at the top right, with a square marking the 90° angle at C. Side b is the bottom side, side a is the vertical side, and side c is the slanted side. Side b is marked 24 and side c is marked 25. Angle A is marked with a question mark." title="A right triangle marked with b = 24, c = 25, and angle A = ?"/>
+            <wp:docPr id="1" name="ts4" descr="A right triangle marked with b = 24, c = 25, and angle A = ?. Figure: Triangle ABC, not drawn to scale. Vertex A is at the bottom left, C at the bottom right, and B at the top right, with a square marking the 90° angle at C. Side b is the bottom side, side a is the vertical side, and side c is the slanted side. Side b is marked 24 and side c is marked 25. Angle A is marked with a question mark." title="A right triangle marked with b = 24, c = 25, and angle A = ?"/>
             <wp:cNvGraphicFramePr>
               <a:graphicFrameLocks xmlns:a="http://schemas.openxmlformats.org/drawingml/2006/main" noChangeAspect="1"/>
             </wp:cNvGraphicFramePr>
@@ -3856,7 +3724,7 @@
           <w:sz w:val="22"/>
           <w:szCs w:val="22"/>
         </w:rPr>
-        <w:t xml:space="preserve">Plotted data: </w:t>
+        <w:t xml:space="preserve">Figure: </w:t>
       </w:r>
       <w:r>
         <w:rPr>
@@ -3878,7 +3746,517 @@
           <w:sz w:val="40"/>
           <w:szCs w:val="40"/>
         </w:rPr>
-        <w:t xml:space="preserve">C=90</w:t>
+        <w:t xml:space="preserve">C=90°,    b=24,    c=25</w:t>
+      </w:r>
+    </w:p>
+    <w:p>
+      <w:pPr>
+        <w:pStyle w:val="Heading3"/>
+        <w:keepNext/>
+      </w:pPr>
+      <w:r>
+        <w:t xml:space="preserve">Question</w:t>
+      </w:r>
+    </w:p>
+    <w:p>
+      <w:pPr>
+        <w:spacing w:after="120" w:before="80" w:line="300"/>
+      </w:pPr>
+      <w:r>
+        <w:t xml:space="preserve">Find angle </w:t>
+      </w:r>
+      <w:r>
+        <w:rPr>
+          <w:i/>
+          <w:iCs/>
+        </w:rPr>
+        <w:t xml:space="preserve">A</w:t>
+      </w:r>
+      <w:r>
+        <w:t xml:space="preserve">, to the nearest tenth of a degree.</w:t>
+      </w:r>
+    </w:p>
+    <w:p>
+      <w:pPr>
+        <w:spacing w:after="40" w:before="20"/>
+        <w:ind w:left="360"/>
+      </w:pPr>
+      <w:r>
+        <w:rPr>
+          <w:b/>
+          <w:bCs/>
+        </w:rPr>
+        <w:t xml:space="preserve">A.  </w:t>
+      </w:r>
+      <w:r>
+        <w:t xml:space="preserve">about 16.3°</w:t>
+      </w:r>
+    </w:p>
+    <w:p>
+      <w:pPr>
+        <w:spacing w:after="40" w:before="20"/>
+        <w:ind w:left="360"/>
+      </w:pPr>
+      <w:r>
+        <w:rPr>
+          <w:b/>
+          <w:bCs/>
+        </w:rPr>
+        <w:t xml:space="preserve">B.  </w:t>
+      </w:r>
+      <w:r>
+        <w:t xml:space="preserve">about 73.7°</w:t>
+      </w:r>
+    </w:p>
+    <w:p>
+      <w:pPr>
+        <w:spacing w:after="40" w:before="20"/>
+        <w:ind w:left="360"/>
+      </w:pPr>
+      <w:r>
+        <w:rPr>
+          <w:b/>
+          <w:bCs/>
+        </w:rPr>
+        <w:t xml:space="preserve">C.  </w:t>
+      </w:r>
+      <w:r>
+        <w:t xml:space="preserve">about 43.8°</w:t>
+      </w:r>
+    </w:p>
+    <w:p>
+      <w:pPr>
+        <w:spacing w:after="40" w:before="20"/>
+        <w:ind w:left="360"/>
+      </w:pPr>
+      <w:r>
+        <w:rPr>
+          <w:b/>
+          <w:bCs/>
+        </w:rPr>
+        <w:t xml:space="preserve">D.  </w:t>
+      </w:r>
+      <w:r>
+        <w:t xml:space="preserve">about 0.3°</w:t>
+      </w:r>
+    </w:p>
+    <w:p>
+      <w:pPr>
+        <w:pStyle w:val="Heading3"/>
+        <w:keepNext/>
+      </w:pPr>
+      <w:r>
+        <w:t xml:space="preserve">Answer and reasoning</w:t>
+      </w:r>
+    </w:p>
+    <w:p>
+      <w:pPr>
+        <w:spacing w:after="120" w:before="80" w:line="300"/>
+      </w:pPr>
+      <w:r>
+        <w:t xml:space="preserve">Side </w:t>
+      </w:r>
+      <w:r>
+        <w:rPr>
+          <w:i/>
+          <w:iCs/>
+        </w:rPr>
+        <w:t xml:space="preserve">b</w:t>
+      </w:r>
+      <w:r>
+        <w:t xml:space="preserve"> is adjacent to </w:t>
+      </w:r>
+      <w:r>
+        <w:rPr>
+          <w:i/>
+          <w:iCs/>
+        </w:rPr>
+        <w:t xml:space="preserve">A</w:t>
+      </w:r>
+      <w:r>
+        <w:t xml:space="preserve">, and </w:t>
+      </w:r>
+      <w:r>
+        <w:rPr>
+          <w:i/>
+          <w:iCs/>
+        </w:rPr>
+        <w:t xml:space="preserve">c</w:t>
+      </w:r>
+      <w:r>
+        <w:t xml:space="preserve"> is the hypotenuse, so </w:t>
+      </w:r>
+      <w:r>
+        <w:t xml:space="preserve">cos</w:t>
+      </w:r>
+      <w:r>
+        <w:rPr>
+          <w:i/>
+          <w:iCs/>
+        </w:rPr>
+        <w:t xml:space="preserve"> A=24/25</w:t>
+      </w:r>
+      <w:r>
+        <w:t xml:space="preserve"> and </w:t>
+      </w:r>
+      <w:r>
+        <w:rPr>
+          <w:i/>
+          <w:iCs/>
+        </w:rPr>
+        <w:t xml:space="preserve">A=</w:t>
+      </w:r>
+      <w:r>
+        <w:t xml:space="preserve">cos</w:t>
+      </w:r>
+      <w:r>
+        <w:rPr>
+          <w:i/>
+          <w:iCs/>
+          <w:vertAlign w:val="superscript"/>
+        </w:rPr>
+        <w:t xml:space="preserve">−1</w:t>
+      </w:r>
+      <w:r>
+        <w:rPr>
+          <w:i/>
+          <w:iCs/>
+        </w:rPr>
+        <w:t xml:space="preserve">(24/25)≈ 16.26°</w:t>
+      </w:r>
+      <w:r>
+        <w:t xml:space="preserve">. The answer 73.7 uses inverse sine, which gives angle </w:t>
+      </w:r>
+      <w:r>
+        <w:rPr>
+          <w:i/>
+          <w:iCs/>
+        </w:rPr>
+        <w:t xml:space="preserve">B</w:t>
+      </w:r>
+      <w:r>
+        <w:t xml:space="preserve">. The answer 43.8 uses inverse tangent with the hypotenuse. The answer 0.3 comes from radian mode. </w:t>
+      </w:r>
+      <w:r>
+        <w:rPr>
+          <w:b/>
+          <w:bCs/>
+          <w:i/>
+          <w:iCs/>
+        </w:rPr>
+        <w:t xml:space="preserve">A≈ 16.3°</w:t>
+      </w:r>
+      <w:r>
+        <w:rPr>
+          <w:b/>
+          <w:bCs/>
+        </w:rPr>
+        <w:t xml:space="preserve">.</w:t>
+      </w:r>
+    </w:p>
+    <w:p>
+      <w:pPr>
+        <w:pStyle w:val="Heading2"/>
+        <w:pageBreakBefore/>
+      </w:pPr>
+      <w:r>
+        <w:t xml:space="preserve">Example 13: Slip 1</w:t>
+      </w:r>
+    </w:p>
+    <w:p>
+      <w:pPr>
+        <w:spacing w:after="200" w:before="200"/>
+        <w:jc w:val="center"/>
+      </w:pPr>
+      <w:r>
+        <w:rPr>
+          <w:i/>
+          <w:iCs/>
+          <w:sz w:val="40"/>
+          <w:szCs w:val="40"/>
+        </w:rPr>
+        <w:t xml:space="preserve">a=10 </w:t>
+      </w:r>
+      <w:r>
+        <w:rPr>
+          <w:sz w:val="40"/>
+          <w:szCs w:val="40"/>
+        </w:rPr>
+        <w:t xml:space="preserve">sin</w:t>
+      </w:r>
+      <w:r>
+        <w:rPr>
+          <w:i/>
+          <w:iCs/>
+          <w:sz w:val="40"/>
+          <w:szCs w:val="40"/>
+        </w:rPr>
+        <w:t xml:space="preserve"> 40°≈ 6.4</w:t>
+      </w:r>
+    </w:p>
+    <w:p>
+      <w:pPr>
+        <w:pStyle w:val="Heading3"/>
+        <w:keepNext/>
+      </w:pPr>
+      <w:r>
+        <w:t xml:space="preserve">Question</w:t>
+      </w:r>
+    </w:p>
+    <w:p>
+      <w:pPr>
+        <w:spacing w:after="120" w:before="80" w:line="300"/>
+      </w:pPr>
+      <w:r>
+        <w:t xml:space="preserve">In a right triangle, </w:t>
+      </w:r>
+      <w:r>
+        <w:rPr>
+          <w:i/>
+          <w:iCs/>
+        </w:rPr>
+        <w:t xml:space="preserve">C=90°</w:t>
+      </w:r>
+      <w:r>
+        <w:t xml:space="preserve">, </w:t>
+      </w:r>
+      <w:r>
+        <w:rPr>
+          <w:i/>
+          <w:iCs/>
+        </w:rPr>
+        <w:t xml:space="preserve">A=40°</w:t>
+      </w:r>
+      <w:r>
+        <w:t xml:space="preserve">, and </w:t>
+      </w:r>
+      <w:r>
+        <w:rPr>
+          <w:i/>
+          <w:iCs/>
+        </w:rPr>
+        <w:t xml:space="preserve">b=10</w:t>
+      </w:r>
+      <w:r>
+        <w:t xml:space="preserve">. A student wrote this line. What is the mistake, if any?</w:t>
+      </w:r>
+    </w:p>
+    <w:p>
+      <w:pPr>
+        <w:spacing w:after="40" w:before="20"/>
+        <w:ind w:left="360"/>
+      </w:pPr>
+      <w:r>
+        <w:rPr>
+          <w:b/>
+          <w:bCs/>
+        </w:rPr>
+        <w:t xml:space="preserve">A.  </w:t>
+      </w:r>
+      <w:r>
+        <w:t xml:space="preserve">There is no mistake.</w:t>
+      </w:r>
+    </w:p>
+    <w:p>
+      <w:pPr>
+        <w:spacing w:after="40" w:before="20"/>
+        <w:ind w:left="360"/>
+      </w:pPr>
+      <w:r>
+        <w:rPr>
+          <w:b/>
+          <w:bCs/>
+        </w:rPr>
+        <w:t xml:space="preserve">B.  </w:t>
+      </w:r>
+      <w:r>
+        <w:t xml:space="preserve">Side b is a leg, so use tangent: about 8.4.</w:t>
+      </w:r>
+    </w:p>
+    <w:p>
+      <w:pPr>
+        <w:spacing w:after="40" w:before="20"/>
+        <w:ind w:left="360"/>
+      </w:pPr>
+      <w:r>
+        <w:rPr>
+          <w:b/>
+          <w:bCs/>
+        </w:rPr>
+        <w:t xml:space="preserve">C.  </w:t>
+      </w:r>
+      <w:r>
+        <w:t xml:space="preserve">It needs cosine instead, so a is about 7.7 here.</w:t>
+      </w:r>
+    </w:p>
+    <w:p>
+      <w:pPr>
+        <w:spacing w:after="40" w:before="20"/>
+        <w:ind w:left="360"/>
+      </w:pPr>
+      <w:r>
+        <w:rPr>
+          <w:b/>
+          <w:bCs/>
+        </w:rPr>
+        <w:t xml:space="preserve">D.  </w:t>
+      </w:r>
+      <w:r>
+        <w:t xml:space="preserve">Divide 10 by the sine of 40°, so a is about 15.6.</w:t>
+      </w:r>
+    </w:p>
+    <w:p>
+      <w:pPr>
+        <w:pStyle w:val="Heading3"/>
+        <w:keepNext/>
+      </w:pPr>
+      <w:r>
+        <w:t xml:space="preserve">Answer and reasoning</w:t>
+      </w:r>
+    </w:p>
+    <w:p>
+      <w:pPr>
+        <w:spacing w:after="120" w:before="80" w:line="300"/>
+      </w:pPr>
+      <w:r>
+        <w:t xml:space="preserve">The 10 is side </w:t>
+      </w:r>
+      <w:r>
+        <w:rPr>
+          <w:i/>
+          <w:iCs/>
+        </w:rPr>
+        <w:t xml:space="preserve">b</w:t>
+      </w:r>
+      <w:r>
+        <w:t xml:space="preserve">, the leg next to </w:t>
+      </w:r>
+      <w:r>
+        <w:rPr>
+          <w:i/>
+          <w:iCs/>
+        </w:rPr>
+        <w:t xml:space="preserve">A</w:t>
+      </w:r>
+      <w:r>
+        <w:t xml:space="preserve">, not the hypotenuse. Opposite and adjacent means tangent: </w:t>
+      </w:r>
+      <w:r>
+        <w:rPr>
+          <w:i/>
+          <w:iCs/>
+        </w:rPr>
+        <w:t xml:space="preserve">a=10 </w:t>
+      </w:r>
+      <w:r>
+        <w:t xml:space="preserve">tan</w:t>
+      </w:r>
+      <w:r>
+        <w:rPr>
+          <w:i/>
+          <w:iCs/>
+        </w:rPr>
+        <w:t xml:space="preserve"> 40°≈ 8.4</w:t>
+      </w:r>
+      <w:r>
+        <w:t xml:space="preserve">. Cosine pairs the adjacent side with the hypotenuse, and so does sine with the opposite side, so neither works without </w:t>
+      </w:r>
+      <w:r>
+        <w:rPr>
+          <w:i/>
+          <w:iCs/>
+        </w:rPr>
+        <w:t xml:space="preserve">c</w:t>
+      </w:r>
+      <w:r>
+        <w:t xml:space="preserve">: </w:t>
+      </w:r>
+      <w:r>
+        <w:rPr>
+          <w:i/>
+          <w:iCs/>
+        </w:rPr>
+        <w:t xml:space="preserve">10 </w:t>
+      </w:r>
+      <w:r>
+        <w:t xml:space="preserve">cos</w:t>
+      </w:r>
+      <w:r>
+        <w:rPr>
+          <w:i/>
+          <w:iCs/>
+        </w:rPr>
+        <w:t xml:space="preserve"> 40°≈ 7.7</w:t>
+      </w:r>
+      <w:r>
+        <w:t xml:space="preserve"> and </w:t>
+      </w:r>
+      <w:r>
+        <w:rPr>
+          <w:i/>
+          <w:iCs/>
+        </w:rPr>
+        <w:t xml:space="preserve">10/(</w:t>
+      </w:r>
+      <w:r>
+        <w:t xml:space="preserve">sin</w:t>
+      </w:r>
+      <w:r>
+        <w:rPr>
+          <w:i/>
+          <w:iCs/>
+        </w:rPr>
+        <w:t xml:space="preserve"> 40°≈ 15.6)</w:t>
+      </w:r>
+      <w:r>
+        <w:t xml:space="preserve"> both treat 10 as something it is not. </w:t>
+      </w:r>
+      <w:r>
+        <w:rPr>
+          <w:b/>
+          <w:bCs/>
+        </w:rPr>
+        <w:t xml:space="preserve">The correct value is </w:t>
+      </w:r>
+      <w:r>
+        <w:rPr>
+          <w:b/>
+          <w:bCs/>
+          <w:i/>
+          <w:iCs/>
+        </w:rPr>
+        <w:t xml:space="preserve">a≈ 8.4</w:t>
+      </w:r>
+      <w:r>
+        <w:rPr>
+          <w:b/>
+          <w:bCs/>
+        </w:rPr>
+        <w:t xml:space="preserve">.</w:t>
+      </w:r>
+    </w:p>
+    <w:p>
+      <w:pPr>
+        <w:pStyle w:val="Heading2"/>
+        <w:pageBreakBefore/>
+      </w:pPr>
+      <w:r>
+        <w:t xml:space="preserve">Example 14: Slip 2</w:t>
+      </w:r>
+    </w:p>
+    <w:p>
+      <w:pPr>
+        <w:spacing w:after="200" w:before="200"/>
+        <w:jc w:val="center"/>
+      </w:pPr>
+      <w:r>
+        <w:rPr>
+          <w:i/>
+          <w:iCs/>
+          <w:sz w:val="40"/>
+          <w:szCs w:val="40"/>
+        </w:rPr>
+        <w:t xml:space="preserve">b=√(6</w:t>
       </w:r>
       <w:r>
         <w:rPr>
@@ -3888,7 +4266,7 @@
           <w:szCs w:val="40"/>
           <w:vertAlign w:val="superscript"/>
         </w:rPr>
-        <w:t xml:space="preserve">°</w:t>
+        <w:t xml:space="preserve">2</w:t>
       </w:r>
       <w:r>
         <w:rPr>
@@ -3897,270 +4275,7 @@
           <w:sz w:val="40"/>
           <w:szCs w:val="40"/>
         </w:rPr>
-        <w:t xml:space="preserve">,    b=24,    c=25</w:t>
-      </w:r>
-    </w:p>
-    <w:p>
-      <w:pPr>
-        <w:pStyle w:val="Heading3"/>
-        <w:keepNext/>
-      </w:pPr>
-      <w:r>
-        <w:t xml:space="preserve">Question</w:t>
-      </w:r>
-    </w:p>
-    <w:p>
-      <w:pPr>
-        <w:spacing w:after="120" w:before="80" w:line="300"/>
-      </w:pPr>
-      <w:r>
-        <w:t xml:space="preserve">Find angle </w:t>
-      </w:r>
-      <w:r>
-        <w:rPr>
-          <w:i/>
-          <w:iCs/>
-        </w:rPr>
-        <w:t xml:space="preserve">A</w:t>
-      </w:r>
-      <w:r>
-        <w:t xml:space="preserve">, to the nearest tenth of a degree.</w:t>
-      </w:r>
-    </w:p>
-    <w:p>
-      <w:pPr>
-        <w:spacing w:after="40" w:before="20"/>
-        <w:ind w:left="360"/>
-      </w:pPr>
-      <w:r>
-        <w:rPr>
-          <w:b/>
-          <w:bCs/>
-        </w:rPr>
-        <w:t xml:space="preserve">A.  </w:t>
-      </w:r>
-      <w:r>
-        <w:t xml:space="preserve">about 16.3°</w:t>
-      </w:r>
-    </w:p>
-    <w:p>
-      <w:pPr>
-        <w:spacing w:after="40" w:before="20"/>
-        <w:ind w:left="360"/>
-      </w:pPr>
-      <w:r>
-        <w:rPr>
-          <w:b/>
-          <w:bCs/>
-        </w:rPr>
-        <w:t xml:space="preserve">B.  </w:t>
-      </w:r>
-      <w:r>
-        <w:t xml:space="preserve">about 73.7°</w:t>
-      </w:r>
-    </w:p>
-    <w:p>
-      <w:pPr>
-        <w:spacing w:after="40" w:before="20"/>
-        <w:ind w:left="360"/>
-      </w:pPr>
-      <w:r>
-        <w:rPr>
-          <w:b/>
-          <w:bCs/>
-        </w:rPr>
-        <w:t xml:space="preserve">C.  </w:t>
-      </w:r>
-      <w:r>
-        <w:t xml:space="preserve">about 43.8°</w:t>
-      </w:r>
-    </w:p>
-    <w:p>
-      <w:pPr>
-        <w:spacing w:after="40" w:before="20"/>
-        <w:ind w:left="360"/>
-      </w:pPr>
-      <w:r>
-        <w:rPr>
-          <w:b/>
-          <w:bCs/>
-        </w:rPr>
-        <w:t xml:space="preserve">D.  </w:t>
-      </w:r>
-      <w:r>
-        <w:t xml:space="preserve">about 0.3°</w:t>
-      </w:r>
-    </w:p>
-    <w:p>
-      <w:pPr>
-        <w:pStyle w:val="Heading3"/>
-        <w:keepNext/>
-      </w:pPr>
-      <w:r>
-        <w:t xml:space="preserve">Answer and reasoning</w:t>
-      </w:r>
-    </w:p>
-    <w:p>
-      <w:pPr>
-        <w:spacing w:after="120" w:before="80" w:line="300"/>
-      </w:pPr>
-      <w:r>
-        <w:t xml:space="preserve">Side </w:t>
-      </w:r>
-      <w:r>
-        <w:rPr>
-          <w:i/>
-          <w:iCs/>
-        </w:rPr>
-        <w:t xml:space="preserve">b</w:t>
-      </w:r>
-      <w:r>
-        <w:t xml:space="preserve"> is adjacent to </w:t>
-      </w:r>
-      <w:r>
-        <w:rPr>
-          <w:i/>
-          <w:iCs/>
-        </w:rPr>
-        <w:t xml:space="preserve">A</w:t>
-      </w:r>
-      <w:r>
-        <w:t xml:space="preserve">, and </w:t>
-      </w:r>
-      <w:r>
-        <w:rPr>
-          <w:i/>
-          <w:iCs/>
-        </w:rPr>
-        <w:t xml:space="preserve">c</w:t>
-      </w:r>
-      <w:r>
-        <w:t xml:space="preserve"> is the hypotenuse, so </w:t>
-      </w:r>
-      <w:r>
-        <w:t xml:space="preserve">cos</w:t>
-      </w:r>
-      <w:r>
-        <w:rPr>
-          <w:i/>
-          <w:iCs/>
-        </w:rPr>
-        <w:t xml:space="preserve"> A=24/25</w:t>
-      </w:r>
-      <w:r>
-        <w:t xml:space="preserve"> and </w:t>
-      </w:r>
-      <w:r>
-        <w:rPr>
-          <w:i/>
-          <w:iCs/>
-        </w:rPr>
-        <w:t xml:space="preserve">A=</w:t>
-      </w:r>
-      <w:r>
-        <w:t xml:space="preserve">cos</w:t>
-      </w:r>
-      <w:r>
-        <w:rPr>
-          <w:i/>
-          <w:iCs/>
-          <w:vertAlign w:val="superscript"/>
-        </w:rPr>
-        <w:t xml:space="preserve">−1</w:t>
-      </w:r>
-      <w:r>
-        <w:rPr>
-          <w:i/>
-          <w:iCs/>
-        </w:rPr>
-        <w:t xml:space="preserve">(24/25)≈ 16.26</w:t>
-      </w:r>
-      <w:r>
-        <w:rPr>
-          <w:i/>
-          <w:iCs/>
-          <w:vertAlign w:val="superscript"/>
-        </w:rPr>
-        <w:t xml:space="preserve">°</w:t>
-      </w:r>
-      <w:r>
-        <w:t xml:space="preserve">. The answer 73.7 uses inverse sine, which gives angle </w:t>
-      </w:r>
-      <w:r>
-        <w:rPr>
-          <w:i/>
-          <w:iCs/>
-        </w:rPr>
-        <w:t xml:space="preserve">B</w:t>
-      </w:r>
-      <w:r>
-        <w:t xml:space="preserve">. The answer 43.8 uses inverse tangent with the hypotenuse. The answer 0.3 comes from radian mode. </w:t>
-      </w:r>
-      <w:r>
-        <w:rPr>
-          <w:b/>
-          <w:bCs/>
-          <w:i/>
-          <w:iCs/>
-        </w:rPr>
-        <w:t xml:space="preserve">A≈ 16.3</w:t>
-      </w:r>
-      <w:r>
-        <w:rPr>
-          <w:b/>
-          <w:bCs/>
-          <w:i/>
-          <w:iCs/>
-          <w:vertAlign w:val="superscript"/>
-        </w:rPr>
-        <w:t xml:space="preserve">°</w:t>
-      </w:r>
-      <w:r>
-        <w:rPr>
-          <w:b/>
-          <w:bCs/>
-        </w:rPr>
-        <w:t xml:space="preserve">.</w:t>
-      </w:r>
-    </w:p>
-    <w:p>
-      <w:pPr>
-        <w:pStyle w:val="Heading2"/>
-        <w:pageBreakBefore/>
-      </w:pPr>
-      <w:r>
-        <w:t xml:space="preserve">Example 13: Slip 1</w:t>
-      </w:r>
-    </w:p>
-    <w:p>
-      <w:pPr>
-        <w:spacing w:after="200" w:before="200"/>
-        <w:jc w:val="center"/>
-      </w:pPr>
-      <w:r>
-        <w:rPr>
-          <w:i/>
-          <w:iCs/>
-          <w:sz w:val="40"/>
-          <w:szCs w:val="40"/>
-        </w:rPr>
-        <w:t xml:space="preserve">a=10</w:t>
-      </w:r>
-      <w:r>
-        <w:rPr>
-          <w:sz w:val="40"/>
-          <w:szCs w:val="40"/>
-        </w:rPr>
-        <w:t xml:space="preserve">cos</w:t>
-      </w:r>
-      <w:r>
-        <w:rPr>
-          <w:i/>
-          <w:iCs/>
-          <w:sz w:val="40"/>
-          <w:szCs w:val="40"/>
-        </w:rPr>
-        <w:t xml:space="preserve"> 40</w:t>
+        <w:t xml:space="preserve">+10</w:t>
       </w:r>
       <w:r>
         <w:rPr>
@@ -4170,7 +4285,7 @@
           <w:szCs w:val="40"/>
           <w:vertAlign w:val="superscript"/>
         </w:rPr>
-        <w:t xml:space="preserve">°</w:t>
+        <w:t xml:space="preserve">2</w:t>
       </w:r>
       <w:r>
         <w:rPr>
@@ -4179,7 +4294,7 @@
           <w:sz w:val="40"/>
           <w:szCs w:val="40"/>
         </w:rPr>
-        <w:t xml:space="preserve">≈ 7.7</w:t>
+        <w:t xml:space="preserve">)≈ 11.7</w:t>
       </w:r>
     </w:p>
     <w:p>
@@ -4203,15 +4318,7 @@
           <w:i/>
           <w:iCs/>
         </w:rPr>
-        <w:t xml:space="preserve">C=90</w:t>
-      </w:r>
-      <w:r>
-        <w:rPr>
-          <w:i/>
-          <w:iCs/>
-          <w:vertAlign w:val="superscript"/>
-        </w:rPr>
-        <w:t xml:space="preserve">°</w:t>
+        <w:t xml:space="preserve">C=90°</w:t>
       </w:r>
       <w:r>
         <w:t xml:space="preserve">, </w:t>
@@ -4221,15 +4328,7 @@
           <w:i/>
           <w:iCs/>
         </w:rPr>
-        <w:t xml:space="preserve">A=40</w:t>
-      </w:r>
-      <w:r>
-        <w:rPr>
-          <w:i/>
-          <w:iCs/>
-          <w:vertAlign w:val="superscript"/>
-        </w:rPr>
-        <w:t xml:space="preserve">°</w:t>
+        <w:t xml:space="preserve">a=6</w:t>
       </w:r>
       <w:r>
         <w:t xml:space="preserve">, and </w:t>
@@ -4274,7 +4373,7 @@
         <w:t xml:space="preserve">B.  </w:t>
       </w:r>
       <w:r>
-        <w:t xml:space="preserve">Side a is opposite angle A, so it needs sine, about 6.4.</w:t>
+        <w:t xml:space="preserve">The 6 and 10 should be multiplied first: about 7.7.</w:t>
       </w:r>
     </w:p>
     <w:p>
@@ -4290,7 +4389,7 @@
         <w:t xml:space="preserve">C.  </w:t>
       </w:r>
       <w:r>
-        <w:t xml:space="preserve">The 10 should be divided by the cosine of 40, about 13.1.</w:t>
+        <w:t xml:space="preserve">No square root was needed, so b is 136.</w:t>
       </w:r>
     </w:p>
     <w:p>
@@ -4306,7 +4405,7 @@
         <w:t xml:space="preserve">D.  </w:t>
       </w:r>
       <w:r>
-        <w:t xml:space="preserve">The angle should be 50 degrees, with sine: about 7.7.</w:t>
+        <w:t xml:space="preserve">Side c is the hypotenuse, so subtract: b is 8.</w:t>
       </w:r>
     </w:p>
     <w:p>
@@ -4323,24 +4422,79 @@
         <w:spacing w:after="120" w:before="80" w:line="300"/>
       </w:pPr>
       <w:r>
-        <w:t xml:space="preserve">Side </w:t>
-      </w:r>
-      <w:r>
-        <w:rPr>
-          <w:i/>
-          <w:iCs/>
-        </w:rPr>
-        <w:t xml:space="preserve">a</w:t>
-      </w:r>
-      <w:r>
-        <w:t xml:space="preserve"> is opposite </w:t>
-      </w:r>
-      <w:r>
-        <w:rPr>
-          <w:i/>
-          <w:iCs/>
-        </w:rPr>
-        <w:t xml:space="preserve">A</w:t>
+        <w:t xml:space="preserve">The hypotenuse is </w:t>
+      </w:r>
+      <w:r>
+        <w:rPr>
+          <w:i/>
+          <w:iCs/>
+        </w:rPr>
+        <w:t xml:space="preserve">c=10</w:t>
+      </w:r>
+      <w:r>
+        <w:t xml:space="preserve">, and it must be the longest side, so </w:t>
+      </w:r>
+      <w:r>
+        <w:rPr>
+          <w:i/>
+          <w:iCs/>
+        </w:rPr>
+        <w:t xml:space="preserve">b</w:t>
+      </w:r>
+      <w:r>
+        <w:t xml:space="preserve"> cannot be 11.7. Subtract: </w:t>
+      </w:r>
+      <w:r>
+        <w:rPr>
+          <w:i/>
+          <w:iCs/>
+        </w:rPr>
+        <w:t xml:space="preserve">b</w:t>
+      </w:r>
+      <w:r>
+        <w:rPr>
+          <w:i/>
+          <w:iCs/>
+          <w:vertAlign w:val="superscript"/>
+        </w:rPr>
+        <w:t xml:space="preserve">2</w:t>
+      </w:r>
+      <w:r>
+        <w:rPr>
+          <w:i/>
+          <w:iCs/>
+        </w:rPr>
+        <w:t xml:space="preserve">=10</w:t>
+      </w:r>
+      <w:r>
+        <w:rPr>
+          <w:i/>
+          <w:iCs/>
+          <w:vertAlign w:val="superscript"/>
+        </w:rPr>
+        <w:t xml:space="preserve">2</w:t>
+      </w:r>
+      <w:r>
+        <w:rPr>
+          <w:i/>
+          <w:iCs/>
+        </w:rPr>
+        <w:t xml:space="preserve">−6</w:t>
+      </w:r>
+      <w:r>
+        <w:rPr>
+          <w:i/>
+          <w:iCs/>
+          <w:vertAlign w:val="superscript"/>
+        </w:rPr>
+        <w:t xml:space="preserve">2</w:t>
+      </w:r>
+      <w:r>
+        <w:rPr>
+          <w:i/>
+          <w:iCs/>
+        </w:rPr>
+        <w:t xml:space="preserve">=64</w:t>
       </w:r>
       <w:r>
         <w:t xml:space="preserve">, and </w:t>
@@ -4350,27 +4504,27 @@
           <w:i/>
           <w:iCs/>
         </w:rPr>
-        <w:t xml:space="preserve">c</w:t>
-      </w:r>
-      <w:r>
-        <w:t xml:space="preserve"> is the hypotenuse, so the ratio is sine: </w:t>
-      </w:r>
-      <w:r>
-        <w:rPr>
-          <w:i/>
-          <w:iCs/>
-        </w:rPr>
-        <w:t xml:space="preserve">a=10</w:t>
-      </w:r>
-      <w:r>
-        <w:t xml:space="preserve">sin</w:t>
-      </w:r>
-      <w:r>
-        <w:rPr>
-          <w:i/>
-          <w:iCs/>
-        </w:rPr>
-        <w:t xml:space="preserve"> 40</w:t>
+        <w:t xml:space="preserve">b=8</w:t>
+      </w:r>
+      <w:r>
+        <w:t xml:space="preserve">. Multiplying gives </w:t>
+      </w:r>
+      <w:r>
+        <w:rPr>
+          <w:i/>
+          <w:iCs/>
+        </w:rPr>
+        <w:t xml:space="preserve">√60≈ 7.7</w:t>
+      </w:r>
+      <w:r>
+        <w:t xml:space="preserve">, which is not the Pythagorean Theorem; and 136 is </w:t>
+      </w:r>
+      <w:r>
+        <w:rPr>
+          <w:i/>
+          <w:iCs/>
+        </w:rPr>
+        <w:t xml:space="preserve">b</w:t>
       </w:r>
       <w:r>
         <w:rPr>
@@ -4378,27 +4532,10 @@
           <w:iCs/>
           <w:vertAlign w:val="superscript"/>
         </w:rPr>
-        <w:t xml:space="preserve">°</w:t>
-      </w:r>
-      <w:r>
-        <w:rPr>
-          <w:i/>
-          <w:iCs/>
-        </w:rPr>
-        <w:t xml:space="preserve">≈ 6.4</w:t>
-      </w:r>
-      <w:r>
-        <w:t xml:space="preserve">. Cosine gives the adjacent side, </w:t>
-      </w:r>
-      <w:r>
-        <w:rPr>
-          <w:i/>
-          <w:iCs/>
-        </w:rPr>
-        <w:t xml:space="preserve">b≈ 7.7</w:t>
-      </w:r>
-      <w:r>
-        <w:t xml:space="preserve">. </w:t>
+        <w:t xml:space="preserve">2</w:t>
+      </w:r>
+      <w:r>
+        <w:t xml:space="preserve"> before taking the root, which is still the wrong sum. </w:t>
       </w:r>
       <w:r>
         <w:rPr>
@@ -4414,7 +4551,7 @@
           <w:i/>
           <w:iCs/>
         </w:rPr>
-        <w:t xml:space="preserve">a≈ 6.4</w:t>
+        <w:t xml:space="preserve">b=8</w:t>
       </w:r>
       <w:r>
         <w:rPr>
@@ -4430,12 +4567,12 @@
         <w:pageBreakBefore/>
       </w:pPr>
       <w:r>
-        <w:t xml:space="preserve">Example 14: Slip 2</w:t>
-      </w:r>
-    </w:p>
-    <w:p>
-      <w:pPr>
-        <w:spacing w:after="200" w:before="200"/>
+        <w:t xml:space="preserve">Example 15: Slip 3</w:t>
+      </w:r>
+    </w:p>
+    <w:p>
+      <w:pPr>
+        <w:spacing w:after="40" w:before="200"/>
         <w:jc w:val="center"/>
       </w:pPr>
       <w:r>
@@ -4445,7 +4582,29 @@
           <w:sz w:val="40"/>
           <w:szCs w:val="40"/>
         </w:rPr>
-        <w:t xml:space="preserve">b=√(6</w:t>
+        <w:t xml:space="preserve">c=13</w:t>
+      </w:r>
+    </w:p>
+    <w:p>
+      <w:pPr>
+        <w:spacing w:after="40" w:before="40"/>
+        <w:jc w:val="center"/>
+      </w:pPr>
+      <w:r>
+        <w:rPr>
+          <w:i/>
+          <w:iCs/>
+          <w:sz w:val="40"/>
+          <w:szCs w:val="40"/>
+        </w:rPr>
+        <w:t xml:space="preserve">A=</w:t>
+      </w:r>
+      <w:r>
+        <w:rPr>
+          <w:sz w:val="40"/>
+          <w:szCs w:val="40"/>
+        </w:rPr>
+        <w:t xml:space="preserve">tan</w:t>
       </w:r>
       <w:r>
         <w:rPr>
@@ -4455,7 +4614,7 @@
           <w:szCs w:val="40"/>
           <w:vertAlign w:val="superscript"/>
         </w:rPr>
-        <w:t xml:space="preserve">2</w:t>
+        <w:t xml:space="preserve">−1</w:t>
       </w:r>
       <w:r>
         <w:rPr>
@@ -4464,18 +4623,291 @@
           <w:sz w:val="40"/>
           <w:szCs w:val="40"/>
         </w:rPr>
-        <w:t xml:space="preserve">+10</w:t>
-      </w:r>
+        <w:t xml:space="preserve">(5/12)</w:t>
+      </w:r>
+    </w:p>
+    <w:p>
+      <w:pPr>
+        <w:spacing w:after="200" w:before="40"/>
+        <w:jc w:val="center"/>
+      </w:pPr>
       <w:r>
         <w:rPr>
           <w:i/>
           <w:iCs/>
           <w:sz w:val="40"/>
           <w:szCs w:val="40"/>
+        </w:rPr>
+        <w:t xml:space="preserve">≈ 22.6°</w:t>
+      </w:r>
+    </w:p>
+    <w:p>
+      <w:pPr>
+        <w:pStyle w:val="Heading3"/>
+        <w:keepNext/>
+      </w:pPr>
+      <w:r>
+        <w:t xml:space="preserve">Question</w:t>
+      </w:r>
+    </w:p>
+    <w:p>
+      <w:pPr>
+        <w:spacing w:after="120" w:before="80" w:line="300"/>
+      </w:pPr>
+      <w:r>
+        <w:t xml:space="preserve">In a right triangle, </w:t>
+      </w:r>
+      <w:r>
+        <w:rPr>
+          <w:i/>
+          <w:iCs/>
+        </w:rPr>
+        <w:t xml:space="preserve">C=90°</w:t>
+      </w:r>
+      <w:r>
+        <w:t xml:space="preserve">, </w:t>
+      </w:r>
+      <w:r>
+        <w:rPr>
+          <w:i/>
+          <w:iCs/>
+        </w:rPr>
+        <w:t xml:space="preserve">a=5</w:t>
+      </w:r>
+      <w:r>
+        <w:t xml:space="preserve">, and </w:t>
+      </w:r>
+      <w:r>
+        <w:rPr>
+          <w:i/>
+          <w:iCs/>
+        </w:rPr>
+        <w:t xml:space="preserve">b=12</w:t>
+      </w:r>
+      <w:r>
+        <w:t xml:space="preserve">. A student wrote these lines. What is the mistake, if any?</w:t>
+      </w:r>
+    </w:p>
+    <w:p>
+      <w:pPr>
+        <w:spacing w:after="40" w:before="20"/>
+        <w:ind w:left="360"/>
+      </w:pPr>
+      <w:r>
+        <w:rPr>
+          <w:b/>
+          <w:bCs/>
+        </w:rPr>
+        <w:t xml:space="preserve">A.  </w:t>
+      </w:r>
+      <w:r>
+        <w:t xml:space="preserve">There is no mistake.</w:t>
+      </w:r>
+    </w:p>
+    <w:p>
+      <w:pPr>
+        <w:spacing w:after="40" w:before="20"/>
+        <w:ind w:left="360"/>
+      </w:pPr>
+      <w:r>
+        <w:rPr>
+          <w:b/>
+          <w:bCs/>
+        </w:rPr>
+        <w:t xml:space="preserve">B.  </w:t>
+      </w:r>
+      <w:r>
+        <w:t xml:space="preserve">Angle A should use inverse sine of 5 over 12.</w:t>
+      </w:r>
+    </w:p>
+    <w:p>
+      <w:pPr>
+        <w:spacing w:after="40" w:before="20"/>
+        <w:ind w:left="360"/>
+      </w:pPr>
+      <w:r>
+        <w:rPr>
+          <w:b/>
+          <w:bCs/>
+        </w:rPr>
+        <w:t xml:space="preserve">C.  </w:t>
+      </w:r>
+      <w:r>
+        <w:t xml:space="preserve">The hypotenuse should be 17, from 5 plus 12.</w:t>
+      </w:r>
+    </w:p>
+    <w:p>
+      <w:pPr>
+        <w:spacing w:after="40" w:before="20"/>
+        <w:ind w:left="360"/>
+      </w:pPr>
+      <w:r>
+        <w:rPr>
+          <w:b/>
+          <w:bCs/>
+        </w:rPr>
+        <w:t xml:space="preserve">D.  </w:t>
+      </w:r>
+      <w:r>
+        <w:t xml:space="preserve">The ratio should be flipped to 12 over 5.</w:t>
+      </w:r>
+    </w:p>
+    <w:p>
+      <w:pPr>
+        <w:pStyle w:val="Heading3"/>
+        <w:keepNext/>
+      </w:pPr>
+      <w:r>
+        <w:t xml:space="preserve">Answer and reasoning</w:t>
+      </w:r>
+    </w:p>
+    <w:p>
+      <w:pPr>
+        <w:spacing w:after="120" w:before="80" w:line="300"/>
+      </w:pPr>
+      <w:r>
+        <w:rPr>
+          <w:i/>
+          <w:iCs/>
+        </w:rPr>
+        <w:t xml:space="preserve">5</w:t>
+      </w:r>
+      <w:r>
+        <w:rPr>
+          <w:i/>
+          <w:iCs/>
           <w:vertAlign w:val="superscript"/>
         </w:rPr>
         <w:t xml:space="preserve">2</w:t>
       </w:r>
+      <w:r>
+        <w:rPr>
+          <w:i/>
+          <w:iCs/>
+        </w:rPr>
+        <w:t xml:space="preserve">+12</w:t>
+      </w:r>
+      <w:r>
+        <w:rPr>
+          <w:i/>
+          <w:iCs/>
+          <w:vertAlign w:val="superscript"/>
+        </w:rPr>
+        <w:t xml:space="preserve">2</w:t>
+      </w:r>
+      <w:r>
+        <w:rPr>
+          <w:i/>
+          <w:iCs/>
+        </w:rPr>
+        <w:t xml:space="preserve">=169=13</w:t>
+      </w:r>
+      <w:r>
+        <w:rPr>
+          <w:i/>
+          <w:iCs/>
+          <w:vertAlign w:val="superscript"/>
+        </w:rPr>
+        <w:t xml:space="preserve">2</w:t>
+      </w:r>
+      <w:r>
+        <w:t xml:space="preserve">, so </w:t>
+      </w:r>
+      <w:r>
+        <w:rPr>
+          <w:i/>
+          <w:iCs/>
+        </w:rPr>
+        <w:t xml:space="preserve">c=13</w:t>
+      </w:r>
+      <w:r>
+        <w:t xml:space="preserve">. For angle </w:t>
+      </w:r>
+      <w:r>
+        <w:rPr>
+          <w:i/>
+          <w:iCs/>
+        </w:rPr>
+        <w:t xml:space="preserve">A</w:t>
+      </w:r>
+      <w:r>
+        <w:t xml:space="preserve">, side 5 is opposite and 12 is adjacent, so tangent is right: </w:t>
+      </w:r>
+      <w:r>
+        <w:rPr>
+          <w:i/>
+          <w:iCs/>
+        </w:rPr>
+        <w:t xml:space="preserve">A≈ 22.6°</w:t>
+      </w:r>
+      <w:r>
+        <w:t xml:space="preserve">, and </w:t>
+      </w:r>
+      <w:r>
+        <w:rPr>
+          <w:i/>
+          <w:iCs/>
+        </w:rPr>
+        <w:t xml:space="preserve">B≈ 67.4°</w:t>
+      </w:r>
+      <w:r>
+        <w:t xml:space="preserve">. Inverse sine would need the hypotenuse, 13, on the bottom, not 12; adding the sides is not the Pythagorean Theorem; and </w:t>
+      </w:r>
+      <w:r>
+        <w:rPr>
+          <w:i/>
+          <w:iCs/>
+        </w:rPr>
+        <w:t xml:space="preserve">12/5</w:t>
+      </w:r>
+      <w:r>
+        <w:t xml:space="preserve"> is </w:t>
+      </w:r>
+      <w:r>
+        <w:t xml:space="preserve">tan</w:t>
+      </w:r>
+      <w:r>
+        <w:rPr>
+          <w:i/>
+          <w:iCs/>
+        </w:rPr>
+        <w:t xml:space="preserve"> B</w:t>
+      </w:r>
+      <w:r>
+        <w:t xml:space="preserve">, which gives angle </w:t>
+      </w:r>
+      <w:r>
+        <w:rPr>
+          <w:i/>
+          <w:iCs/>
+        </w:rPr>
+        <w:t xml:space="preserve">B</w:t>
+      </w:r>
+      <w:r>
+        <w:t xml:space="preserve">. </w:t>
+      </w:r>
+      <w:r>
+        <w:rPr>
+          <w:b/>
+          <w:bCs/>
+        </w:rPr>
+        <w:t xml:space="preserve">There is no mistake.</w:t>
+      </w:r>
+    </w:p>
+    <w:p>
+      <w:pPr>
+        <w:pStyle w:val="Heading2"/>
+        <w:pageBreakBefore/>
+      </w:pPr>
+      <w:r>
+        <w:t xml:space="preserve">Example 16: Slip 4</w:t>
+      </w:r>
+    </w:p>
+    <w:p>
+      <w:pPr>
+        <w:spacing w:after="200" w:before="200"/>
+        <w:jc w:val="center"/>
+      </w:pPr>
       <w:r>
         <w:rPr>
           <w:i/>
@@ -4483,7 +4915,23 @@
           <w:sz w:val="40"/>
           <w:szCs w:val="40"/>
         </w:rPr>
-        <w:t xml:space="preserve">)≈ 11.7</w:t>
+        <w:t xml:space="preserve">a=10 </w:t>
+      </w:r>
+      <w:r>
+        <w:rPr>
+          <w:sz w:val="40"/>
+          <w:szCs w:val="40"/>
+        </w:rPr>
+        <w:t xml:space="preserve">sin</w:t>
+      </w:r>
+      <w:r>
+        <w:rPr>
+          <w:i/>
+          <w:iCs/>
+          <w:sz w:val="40"/>
+          <w:szCs w:val="40"/>
+        </w:rPr>
+        <w:t xml:space="preserve"> 30°≈ −9.9</w:t>
       </w:r>
     </w:p>
     <w:p>
@@ -4507,15 +4955,7 @@
           <w:i/>
           <w:iCs/>
         </w:rPr>
-        <w:t xml:space="preserve">C=90</w:t>
-      </w:r>
-      <w:r>
-        <w:rPr>
-          <w:i/>
-          <w:iCs/>
-          <w:vertAlign w:val="superscript"/>
-        </w:rPr>
-        <w:t xml:space="preserve">°</w:t>
+        <w:t xml:space="preserve">C=90°</w:t>
       </w:r>
       <w:r>
         <w:t xml:space="preserve">, </w:t>
@@ -4525,7 +4965,7 @@
           <w:i/>
           <w:iCs/>
         </w:rPr>
-        <w:t xml:space="preserve">a=6</w:t>
+        <w:t xml:space="preserve">A=30°</w:t>
       </w:r>
       <w:r>
         <w:t xml:space="preserve">, and </w:t>
@@ -4554,7 +4994,7 @@
         <w:t xml:space="preserve">A.  </w:t>
       </w:r>
       <w:r>
-        <w:t xml:space="preserve">The 6 and 10 should be multiplied first: about 7.7.</w:t>
+        <w:t xml:space="preserve">There is no mistake.</w:t>
       </w:r>
     </w:p>
     <w:p>
@@ -4570,7 +5010,7 @@
         <w:t xml:space="preserve">B.  </w:t>
       </w:r>
       <w:r>
-        <w:t xml:space="preserve">No square root was needed, so b is 136.</w:t>
+        <w:t xml:space="preserve">Side a needs cosine here: about 8.7.</w:t>
       </w:r>
     </w:p>
     <w:p>
@@ -4586,7 +5026,7 @@
         <w:t xml:space="preserve">C.  </w:t>
       </w:r>
       <w:r>
-        <w:t xml:space="preserve">Side c is the hypotenuse, so subtract: b is 8.</w:t>
+        <w:t xml:space="preserve">The 10 should be divided by the sine: a is 20.</w:t>
       </w:r>
     </w:p>
     <w:p>
@@ -4602,7 +5042,7 @@
         <w:t xml:space="preserve">D.  </w:t>
       </w:r>
       <w:r>
-        <w:t xml:space="preserve">There is no mistake.</w:t>
+        <w:t xml:space="preserve">The calculator is in radian mode; a is 5.</w:t>
       </w:r>
     </w:p>
     <w:p>
@@ -4619,92 +5059,50 @@
         <w:spacing w:after="120" w:before="80" w:line="300"/>
       </w:pPr>
       <w:r>
-        <w:t xml:space="preserve">The hypotenuse is </w:t>
-      </w:r>
-      <w:r>
-        <w:rPr>
-          <w:i/>
-          <w:iCs/>
-        </w:rPr>
-        <w:t xml:space="preserve">c=10</w:t>
-      </w:r>
-      <w:r>
-        <w:t xml:space="preserve">, and it must be the longest side, so </w:t>
-      </w:r>
-      <w:r>
-        <w:rPr>
-          <w:i/>
-          <w:iCs/>
-        </w:rPr>
-        <w:t xml:space="preserve">b</w:t>
-      </w:r>
-      <w:r>
-        <w:t xml:space="preserve"> cannot be 11.7. Subtract: </w:t>
-      </w:r>
-      <w:r>
-        <w:rPr>
-          <w:i/>
-          <w:iCs/>
-        </w:rPr>
-        <w:t xml:space="preserve">b</w:t>
-      </w:r>
-      <w:r>
-        <w:rPr>
-          <w:i/>
-          <w:iCs/>
-          <w:vertAlign w:val="superscript"/>
-        </w:rPr>
-        <w:t xml:space="preserve">2</w:t>
-      </w:r>
-      <w:r>
-        <w:rPr>
-          <w:i/>
-          <w:iCs/>
-        </w:rPr>
-        <w:t xml:space="preserve">=10</w:t>
-      </w:r>
-      <w:r>
-        <w:rPr>
-          <w:i/>
-          <w:iCs/>
-          <w:vertAlign w:val="superscript"/>
-        </w:rPr>
-        <w:t xml:space="preserve">2</w:t>
-      </w:r>
-      <w:r>
-        <w:rPr>
-          <w:i/>
-          <w:iCs/>
-        </w:rPr>
-        <w:t xml:space="preserve">−6</w:t>
-      </w:r>
-      <w:r>
-        <w:rPr>
-          <w:i/>
-          <w:iCs/>
-          <w:vertAlign w:val="superscript"/>
-        </w:rPr>
-        <w:t xml:space="preserve">2</w:t>
-      </w:r>
-      <w:r>
-        <w:rPr>
-          <w:i/>
-          <w:iCs/>
-        </w:rPr>
-        <w:t xml:space="preserve">=64</w:t>
-      </w:r>
-      <w:r>
-        <w:t xml:space="preserve">, and </w:t>
-      </w:r>
-      <w:r>
-        <w:rPr>
-          <w:i/>
-          <w:iCs/>
-        </w:rPr>
-        <w:t xml:space="preserve">b=8</w:t>
-      </w:r>
-      <w:r>
-        <w:t xml:space="preserve">. </w:t>
+        <w:t xml:space="preserve">The setup is right, but </w:t>
+      </w:r>
+      <w:r>
+        <w:t xml:space="preserve">sin</w:t>
+      </w:r>
+      <w:r>
+        <w:rPr>
+          <w:i/>
+          <w:iCs/>
+        </w:rPr>
+        <w:t xml:space="preserve"> 30°=0.5</w:t>
+      </w:r>
+      <w:r>
+        <w:t xml:space="preserve">, so </w:t>
+      </w:r>
+      <w:r>
+        <w:rPr>
+          <w:i/>
+          <w:iCs/>
+        </w:rPr>
+        <w:t xml:space="preserve">a=5</w:t>
+      </w:r>
+      <w:r>
+        <w:t xml:space="preserve">. A negative side length is a sign that the calculator was in radian mode and took the sine of 30 radians. Switch to degree mode. Cosine would give </w:t>
+      </w:r>
+      <w:r>
+        <w:rPr>
+          <w:i/>
+          <w:iCs/>
+        </w:rPr>
+        <w:t xml:space="preserve">b≈ 8.7</w:t>
+      </w:r>
+      <w:r>
+        <w:t xml:space="preserve">, the side next to </w:t>
+      </w:r>
+      <w:r>
+        <w:rPr>
+          <w:i/>
+          <w:iCs/>
+        </w:rPr>
+        <w:t xml:space="preserve">A</w:t>
+      </w:r>
+      <w:r>
+        <w:t xml:space="preserve">; and the hypotenuse is known here, so multiply by it, do not divide. </w:t>
       </w:r>
       <w:r>
         <w:rPr>
@@ -4720,7 +5118,7 @@
           <w:i/>
           <w:iCs/>
         </w:rPr>
-        <w:t xml:space="preserve">b=8</w:t>
+        <w:t xml:space="preserve">a=5</w:t>
       </w:r>
       <w:r>
         <w:rPr>
@@ -4736,7 +5134,7 @@
         <w:pageBreakBefore/>
       </w:pPr>
       <w:r>
-        <w:t xml:space="preserve">Example 15: Slip 3</w:t>
+        <w:t xml:space="preserve">Example 17: Slip 5</w:t>
       </w:r>
     </w:p>
     <w:p>
@@ -4751,12 +5149,12 @@
           <w:sz w:val="40"/>
           <w:szCs w:val="40"/>
         </w:rPr>
-        <w:t xml:space="preserve">c=13</w:t>
-      </w:r>
-    </w:p>
-    <w:p>
-      <w:pPr>
-        <w:spacing w:after="40" w:before="40"/>
+        <w:t xml:space="preserve">A≈ 28.1°</w:t>
+      </w:r>
+    </w:p>
+    <w:p>
+      <w:pPr>
+        <w:spacing w:after="200" w:before="40"/>
         <w:jc w:val="center"/>
       </w:pPr>
       <w:r>
@@ -4766,58 +5164,7 @@
           <w:sz w:val="40"/>
           <w:szCs w:val="40"/>
         </w:rPr>
-        <w:t xml:space="preserve">A=</w:t>
-      </w:r>
-      <w:r>
-        <w:rPr>
-          <w:sz w:val="40"/>
-          <w:szCs w:val="40"/>
-        </w:rPr>
-        <w:t xml:space="preserve">tan</w:t>
-      </w:r>
-      <w:r>
-        <w:rPr>
-          <w:i/>
-          <w:iCs/>
-          <w:sz w:val="40"/>
-          <w:szCs w:val="40"/>
-          <w:vertAlign w:val="superscript"/>
-        </w:rPr>
-        <w:t xml:space="preserve">−1</w:t>
-      </w:r>
-      <w:r>
-        <w:rPr>
-          <w:i/>
-          <w:iCs/>
-          <w:sz w:val="40"/>
-          <w:szCs w:val="40"/>
-        </w:rPr>
-        <w:t xml:space="preserve">(5/12)</w:t>
-      </w:r>
-    </w:p>
-    <w:p>
-      <w:pPr>
-        <w:spacing w:after="200" w:before="40"/>
-        <w:jc w:val="center"/>
-      </w:pPr>
-      <w:r>
-        <w:rPr>
-          <w:i/>
-          <w:iCs/>
-          <w:sz w:val="40"/>
-          <w:szCs w:val="40"/>
-        </w:rPr>
-        <w:t xml:space="preserve">≈ 22.6</w:t>
-      </w:r>
-      <w:r>
-        <w:rPr>
-          <w:i/>
-          <w:iCs/>
-          <w:sz w:val="40"/>
-          <w:szCs w:val="40"/>
-          <w:vertAlign w:val="superscript"/>
-        </w:rPr>
-        <w:t xml:space="preserve">°</w:t>
+        <w:t xml:space="preserve">B=180°−28.1°=151.9°</w:t>
       </w:r>
     </w:p>
     <w:p>
@@ -4841,15 +5188,7 @@
           <w:i/>
           <w:iCs/>
         </w:rPr>
-        <w:t xml:space="preserve">C=90</w:t>
-      </w:r>
-      <w:r>
-        <w:rPr>
-          <w:i/>
-          <w:iCs/>
-          <w:vertAlign w:val="superscript"/>
-        </w:rPr>
-        <w:t xml:space="preserve">°</w:t>
+        <w:t xml:space="preserve">C=90°</w:t>
       </w:r>
       <w:r>
         <w:t xml:space="preserve">, </w:t>
@@ -4859,7 +5198,7 @@
           <w:i/>
           <w:iCs/>
         </w:rPr>
-        <w:t xml:space="preserve">a=5</w:t>
+        <w:t xml:space="preserve">a=8</w:t>
       </w:r>
       <w:r>
         <w:t xml:space="preserve">, and </w:t>
@@ -4869,10 +5208,10 @@
           <w:i/>
           <w:iCs/>
         </w:rPr>
-        <w:t xml:space="preserve">b=12</w:t>
-      </w:r>
-      <w:r>
-        <w:t xml:space="preserve">. A student wrote these lines. What is the mistake, if any?</w:t>
+        <w:t xml:space="preserve">b=15</w:t>
+      </w:r>
+      <w:r>
+        <w:t xml:space="preserve">. A student found angle A, then wrote this for angle B. What is the mistake, if any?</w:t>
       </w:r>
     </w:p>
     <w:p>
@@ -4888,7 +5227,7 @@
         <w:t xml:space="preserve">A.  </w:t>
       </w:r>
       <w:r>
-        <w:t xml:space="preserve">Angle A should use inverse sine of 5 over 12.</w:t>
+        <w:t xml:space="preserve">There is no mistake.</w:t>
       </w:r>
     </w:p>
     <w:p>
@@ -4904,7 +5243,7 @@
         <w:t xml:space="preserve">B.  </w:t>
       </w:r>
       <w:r>
-        <w:t xml:space="preserve">The hypotenuse should be 17, from 5 plus 12.</w:t>
+        <w:t xml:space="preserve">The right angle uses 90°, so B is 90° − 28.1° ≈ 61.9°.</w:t>
       </w:r>
     </w:p>
     <w:p>
@@ -4920,7 +5259,7 @@
         <w:t xml:space="preserve">C.  </w:t>
       </w:r>
       <w:r>
-        <w:t xml:space="preserve">There is no mistake.</w:t>
+        <w:t xml:space="preserve">In a right triangle, the two acute angles are equal: 28.1°.</w:t>
       </w:r>
     </w:p>
     <w:p>
@@ -4936,7 +5275,7 @@
         <w:t xml:space="preserve">D.  </w:t>
       </w:r>
       <w:r>
-        <w:t xml:space="preserve">The ratio should be flipped to 12 over 5.</w:t>
+        <w:t xml:space="preserve">B should be 90° + 28.1°, which is 118.1°.</w:t>
       </w:r>
     </w:p>
     <w:p>
@@ -4953,601 +5292,46 @@
         <w:spacing w:after="120" w:before="80" w:line="300"/>
       </w:pPr>
       <w:r>
-        <w:rPr>
-          <w:i/>
-          <w:iCs/>
-        </w:rPr>
-        <w:t xml:space="preserve">5</w:t>
-      </w:r>
-      <w:r>
-        <w:rPr>
-          <w:i/>
-          <w:iCs/>
-          <w:vertAlign w:val="superscript"/>
-        </w:rPr>
-        <w:t xml:space="preserve">2</w:t>
-      </w:r>
-      <w:r>
-        <w:rPr>
-          <w:i/>
-          <w:iCs/>
-        </w:rPr>
-        <w:t xml:space="preserve">+12</w:t>
-      </w:r>
-      <w:r>
-        <w:rPr>
-          <w:i/>
-          <w:iCs/>
-          <w:vertAlign w:val="superscript"/>
-        </w:rPr>
-        <w:t xml:space="preserve">2</w:t>
-      </w:r>
-      <w:r>
-        <w:rPr>
-          <w:i/>
-          <w:iCs/>
-        </w:rPr>
-        <w:t xml:space="preserve">=169=13</w:t>
-      </w:r>
-      <w:r>
-        <w:rPr>
-          <w:i/>
-          <w:iCs/>
-          <w:vertAlign w:val="superscript"/>
-        </w:rPr>
-        <w:t xml:space="preserve">2</w:t>
-      </w:r>
-      <w:r>
-        <w:t xml:space="preserve">, so </w:t>
-      </w:r>
-      <w:r>
-        <w:rPr>
-          <w:i/>
-          <w:iCs/>
-        </w:rPr>
-        <w:t xml:space="preserve">c=13</w:t>
-      </w:r>
-      <w:r>
-        <w:t xml:space="preserve">. For angle </w:t>
-      </w:r>
-      <w:r>
-        <w:rPr>
-          <w:i/>
-          <w:iCs/>
-        </w:rPr>
-        <w:t xml:space="preserve">A</w:t>
-      </w:r>
-      <w:r>
-        <w:t xml:space="preserve">, side 5 is opposite and 12 is adjacent, so tangent is right: </w:t>
-      </w:r>
-      <w:r>
-        <w:rPr>
-          <w:i/>
-          <w:iCs/>
-        </w:rPr>
-        <w:t xml:space="preserve">A≈ 22.6</w:t>
-      </w:r>
-      <w:r>
-        <w:rPr>
-          <w:i/>
-          <w:iCs/>
-          <w:vertAlign w:val="superscript"/>
-        </w:rPr>
-        <w:t xml:space="preserve">°</w:t>
-      </w:r>
-      <w:r>
-        <w:t xml:space="preserve">, and </w:t>
-      </w:r>
-      <w:r>
-        <w:rPr>
-          <w:i/>
-          <w:iCs/>
-        </w:rPr>
-        <w:t xml:space="preserve">B≈ 67.4</w:t>
-      </w:r>
-      <w:r>
-        <w:rPr>
-          <w:i/>
-          <w:iCs/>
-          <w:vertAlign w:val="superscript"/>
-        </w:rPr>
-        <w:t xml:space="preserve">°</w:t>
-      </w:r>
-      <w:r>
-        <w:t xml:space="preserve">. </w:t>
-      </w:r>
-      <w:r>
-        <w:rPr>
-          <w:b/>
-          <w:bCs/>
-        </w:rPr>
-        <w:t xml:space="preserve">There is no mistake.</w:t>
-      </w:r>
-    </w:p>
-    <w:p>
-      <w:pPr>
-        <w:pStyle w:val="Heading2"/>
-        <w:pageBreakBefore/>
-      </w:pPr>
-      <w:r>
-        <w:t xml:space="preserve">Example 16: Slip 4</w:t>
-      </w:r>
-    </w:p>
-    <w:p>
-      <w:pPr>
-        <w:spacing w:after="200" w:before="200"/>
-        <w:jc w:val="center"/>
-      </w:pPr>
-      <w:r>
-        <w:rPr>
-          <w:i/>
-          <w:iCs/>
-          <w:sz w:val="40"/>
-          <w:szCs w:val="40"/>
-        </w:rPr>
-        <w:t xml:space="preserve">a=10</w:t>
-      </w:r>
-      <w:r>
-        <w:rPr>
-          <w:sz w:val="40"/>
-          <w:szCs w:val="40"/>
-        </w:rPr>
-        <w:t xml:space="preserve">sin</w:t>
-      </w:r>
-      <w:r>
-        <w:rPr>
-          <w:i/>
-          <w:iCs/>
-          <w:sz w:val="40"/>
-          <w:szCs w:val="40"/>
-        </w:rPr>
-        <w:t xml:space="preserve"> 30</w:t>
-      </w:r>
-      <w:r>
-        <w:rPr>
-          <w:i/>
-          <w:iCs/>
-          <w:sz w:val="40"/>
-          <w:szCs w:val="40"/>
-          <w:vertAlign w:val="superscript"/>
-        </w:rPr>
-        <w:t xml:space="preserve">°</w:t>
-      </w:r>
-      <w:r>
-        <w:rPr>
-          <w:i/>
-          <w:iCs/>
-          <w:sz w:val="40"/>
-          <w:szCs w:val="40"/>
-        </w:rPr>
-        <w:t xml:space="preserve">≈ −9.9</w:t>
-      </w:r>
-    </w:p>
-    <w:p>
-      <w:pPr>
-        <w:pStyle w:val="Heading3"/>
-        <w:keepNext/>
-      </w:pPr>
-      <w:r>
-        <w:t xml:space="preserve">Question</w:t>
-      </w:r>
-    </w:p>
-    <w:p>
-      <w:pPr>
-        <w:spacing w:after="120" w:before="80" w:line="300"/>
-      </w:pPr>
-      <w:r>
-        <w:t xml:space="preserve">In a right triangle, </w:t>
-      </w:r>
-      <w:r>
-        <w:rPr>
-          <w:i/>
-          <w:iCs/>
-        </w:rPr>
-        <w:t xml:space="preserve">C=90</w:t>
-      </w:r>
-      <w:r>
-        <w:rPr>
-          <w:i/>
-          <w:iCs/>
-          <w:vertAlign w:val="superscript"/>
-        </w:rPr>
-        <w:t xml:space="preserve">°</w:t>
-      </w:r>
-      <w:r>
-        <w:t xml:space="preserve">, </w:t>
-      </w:r>
-      <w:r>
-        <w:rPr>
-          <w:i/>
-          <w:iCs/>
-        </w:rPr>
-        <w:t xml:space="preserve">A=30</w:t>
-      </w:r>
-      <w:r>
-        <w:rPr>
-          <w:i/>
-          <w:iCs/>
-          <w:vertAlign w:val="superscript"/>
-        </w:rPr>
-        <w:t xml:space="preserve">°</w:t>
-      </w:r>
-      <w:r>
-        <w:t xml:space="preserve">, and </w:t>
-      </w:r>
-      <w:r>
-        <w:rPr>
-          <w:i/>
-          <w:iCs/>
-        </w:rPr>
-        <w:t xml:space="preserve">c=10</w:t>
-      </w:r>
-      <w:r>
-        <w:t xml:space="preserve">. A student wrote this line. What is the mistake, if any?</w:t>
-      </w:r>
-    </w:p>
-    <w:p>
-      <w:pPr>
-        <w:spacing w:after="40" w:before="20"/>
-        <w:ind w:left="360"/>
-      </w:pPr>
-      <w:r>
-        <w:rPr>
-          <w:b/>
-          <w:bCs/>
-        </w:rPr>
-        <w:t xml:space="preserve">A.  </w:t>
-      </w:r>
-      <w:r>
-        <w:t xml:space="preserve">Side a needs cosine here: about 8.7.</w:t>
-      </w:r>
-    </w:p>
-    <w:p>
-      <w:pPr>
-        <w:spacing w:after="40" w:before="20"/>
-        <w:ind w:left="360"/>
-      </w:pPr>
-      <w:r>
-        <w:rPr>
-          <w:b/>
-          <w:bCs/>
-        </w:rPr>
-        <w:t xml:space="preserve">B.  </w:t>
-      </w:r>
-      <w:r>
-        <w:t xml:space="preserve">There is no mistake.</w:t>
-      </w:r>
-    </w:p>
-    <w:p>
-      <w:pPr>
-        <w:spacing w:after="40" w:before="20"/>
-        <w:ind w:left="360"/>
-      </w:pPr>
-      <w:r>
-        <w:rPr>
-          <w:b/>
-          <w:bCs/>
-        </w:rPr>
-        <w:t xml:space="preserve">C.  </w:t>
-      </w:r>
-      <w:r>
-        <w:t xml:space="preserve">The 10 should be divided by the sine: a is 20.</w:t>
-      </w:r>
-    </w:p>
-    <w:p>
-      <w:pPr>
-        <w:spacing w:after="40" w:before="20"/>
-        <w:ind w:left="360"/>
-      </w:pPr>
-      <w:r>
-        <w:rPr>
-          <w:b/>
-          <w:bCs/>
-        </w:rPr>
-        <w:t xml:space="preserve">D.  </w:t>
-      </w:r>
-      <w:r>
-        <w:t xml:space="preserve">The calculator is in radian mode; a is 5.</w:t>
-      </w:r>
-    </w:p>
-    <w:p>
-      <w:pPr>
-        <w:pStyle w:val="Heading3"/>
-        <w:keepNext/>
-      </w:pPr>
-      <w:r>
-        <w:t xml:space="preserve">Answer and reasoning</w:t>
-      </w:r>
-    </w:p>
-    <w:p>
-      <w:pPr>
-        <w:spacing w:after="120" w:before="80" w:line="300"/>
-      </w:pPr>
-      <w:r>
-        <w:t xml:space="preserve">The setup is right, but </w:t>
-      </w:r>
-      <w:r>
-        <w:t xml:space="preserve">sin</w:t>
-      </w:r>
-      <w:r>
-        <w:rPr>
-          <w:i/>
-          <w:iCs/>
-        </w:rPr>
-        <w:t xml:space="preserve"> 30</w:t>
-      </w:r>
-      <w:r>
-        <w:rPr>
-          <w:i/>
-          <w:iCs/>
-          <w:vertAlign w:val="superscript"/>
-        </w:rPr>
-        <w:t xml:space="preserve">°</w:t>
-      </w:r>
-      <w:r>
-        <w:rPr>
-          <w:i/>
-          <w:iCs/>
-        </w:rPr>
-        <w:t xml:space="preserve">=0.5</w:t>
-      </w:r>
-      <w:r>
-        <w:t xml:space="preserve">, so </w:t>
-      </w:r>
-      <w:r>
-        <w:rPr>
-          <w:i/>
-          <w:iCs/>
-        </w:rPr>
-        <w:t xml:space="preserve">a=5</w:t>
-      </w:r>
-      <w:r>
-        <w:t xml:space="preserve">. A negative side length is a sign that the calculator was in radian mode and took the sine of 30 radians. Switch to degree mode. </w:t>
-      </w:r>
-      <w:r>
-        <w:rPr>
-          <w:b/>
-          <w:bCs/>
-        </w:rPr>
-        <w:t xml:space="preserve">The correct value is </w:t>
-      </w:r>
-      <w:r>
-        <w:rPr>
-          <w:b/>
-          <w:bCs/>
-          <w:i/>
-          <w:iCs/>
-        </w:rPr>
-        <w:t xml:space="preserve">a=5</w:t>
-      </w:r>
-      <w:r>
-        <w:rPr>
-          <w:b/>
-          <w:bCs/>
-        </w:rPr>
-        <w:t xml:space="preserve">.</w:t>
-      </w:r>
-    </w:p>
-    <w:p>
-      <w:pPr>
-        <w:pStyle w:val="Heading2"/>
-        <w:pageBreakBefore/>
-      </w:pPr>
-      <w:r>
-        <w:t xml:space="preserve">Example 17: Slip 5</w:t>
-      </w:r>
-    </w:p>
-    <w:p>
-      <w:pPr>
-        <w:spacing w:after="40" w:before="200"/>
-        <w:jc w:val="center"/>
-      </w:pPr>
-      <w:r>
-        <w:rPr>
-          <w:sz w:val="40"/>
-          <w:szCs w:val="40"/>
-        </w:rPr>
-        <w:t xml:space="preserve">tan</w:t>
-      </w:r>
-      <w:r>
-        <w:rPr>
-          <w:i/>
-          <w:iCs/>
-          <w:sz w:val="40"/>
-          <w:szCs w:val="40"/>
-        </w:rPr>
-        <w:t xml:space="preserve"> A=8/15</w:t>
-      </w:r>
-    </w:p>
-    <w:p>
-      <w:pPr>
-        <w:spacing w:after="200" w:before="40"/>
-        <w:jc w:val="center"/>
-      </w:pPr>
-      <w:r>
-        <w:rPr>
-          <w:i/>
-          <w:iCs/>
-          <w:sz w:val="40"/>
-          <w:szCs w:val="40"/>
-        </w:rPr>
-        <w:t xml:space="preserve">A=</w:t>
-      </w:r>
-      <w:r>
-        <w:rPr>
-          <w:sz w:val="40"/>
-          <w:szCs w:val="40"/>
-        </w:rPr>
-        <w:t xml:space="preserve">tan</w:t>
-      </w:r>
-      <w:r>
-        <w:rPr>
-          <w:i/>
-          <w:iCs/>
-          <w:sz w:val="40"/>
-          <w:szCs w:val="40"/>
-        </w:rPr>
-        <w:t xml:space="preserve">(8/15)≈ 0.01</w:t>
-      </w:r>
-    </w:p>
-    <w:p>
-      <w:pPr>
-        <w:pStyle w:val="Heading3"/>
-        <w:keepNext/>
-      </w:pPr>
-      <w:r>
-        <w:t xml:space="preserve">Question</w:t>
-      </w:r>
-    </w:p>
-    <w:p>
-      <w:pPr>
-        <w:spacing w:after="120" w:before="80" w:line="300"/>
-      </w:pPr>
-      <w:r>
-        <w:t xml:space="preserve">A student wrote these lines. What is the mistake, if any?</w:t>
-      </w:r>
-    </w:p>
-    <w:p>
-      <w:pPr>
-        <w:spacing w:after="40" w:before="20"/>
-        <w:ind w:left="360"/>
-      </w:pPr>
-      <w:r>
-        <w:rPr>
-          <w:b/>
-          <w:bCs/>
-        </w:rPr>
-        <w:t xml:space="preserve">A.  </w:t>
-      </w:r>
-      <w:r>
-        <w:t xml:space="preserve">To get the angle back, use inverse tangent: about 28.1°.</w:t>
-      </w:r>
-    </w:p>
-    <w:p>
-      <w:pPr>
-        <w:spacing w:after="40" w:before="20"/>
-        <w:ind w:left="360"/>
-      </w:pPr>
-      <w:r>
-        <w:rPr>
-          <w:b/>
-          <w:bCs/>
-        </w:rPr>
-        <w:t xml:space="preserve">B.  </w:t>
-      </w:r>
-      <w:r>
-        <w:t xml:space="preserve">The ratio should be flipped to 15 over 8, giving about 61.9°.</w:t>
-      </w:r>
-    </w:p>
-    <w:p>
-      <w:pPr>
-        <w:spacing w:after="40" w:before="20"/>
-        <w:ind w:left="360"/>
-      </w:pPr>
-      <w:r>
-        <w:rPr>
-          <w:b/>
-          <w:bCs/>
-        </w:rPr>
-        <w:t xml:space="preserve">C.  </w:t>
-      </w:r>
-      <w:r>
-        <w:t xml:space="preserve">There is no mistake.</w:t>
-      </w:r>
-    </w:p>
-    <w:p>
-      <w:pPr>
-        <w:spacing w:after="40" w:before="20"/>
-        <w:ind w:left="360"/>
-      </w:pPr>
-      <w:r>
-        <w:rPr>
-          <w:b/>
-          <w:bCs/>
-        </w:rPr>
-        <w:t xml:space="preserve">D.  </w:t>
-      </w:r>
-      <w:r>
-        <w:t xml:space="preserve">The answer should be given in radians instead of degrees.</w:t>
-      </w:r>
-    </w:p>
-    <w:p>
-      <w:pPr>
-        <w:pStyle w:val="Heading3"/>
-        <w:keepNext/>
-      </w:pPr>
-      <w:r>
-        <w:t xml:space="preserve">Answer and reasoning</w:t>
-      </w:r>
-    </w:p>
-    <w:p>
-      <w:pPr>
-        <w:spacing w:after="120" w:before="80" w:line="300"/>
-      </w:pPr>
-      <w:r>
-        <w:t xml:space="preserve">Tangent takes an angle and gives a ratio. Here the ratio is known and the angle is wanted, so use inverse tangent: </w:t>
-      </w:r>
-      <w:r>
-        <w:rPr>
-          <w:i/>
-          <w:iCs/>
-        </w:rPr>
-        <w:t xml:space="preserve">A=</w:t>
-      </w:r>
-      <w:r>
-        <w:t xml:space="preserve">tan</w:t>
-      </w:r>
-      <w:r>
-        <w:rPr>
-          <w:i/>
-          <w:iCs/>
-          <w:vertAlign w:val="superscript"/>
-        </w:rPr>
-        <w:t xml:space="preserve">−1</w:t>
-      </w:r>
-      <w:r>
-        <w:rPr>
-          <w:i/>
-          <w:iCs/>
-        </w:rPr>
-        <w:t xml:space="preserve">(8/15)≈ 28.1</w:t>
-      </w:r>
-      <w:r>
-        <w:rPr>
-          <w:i/>
-          <w:iCs/>
-          <w:vertAlign w:val="superscript"/>
-        </w:rPr>
-        <w:t xml:space="preserve">°</w:t>
-      </w:r>
-      <w:r>
-        <w:t xml:space="preserve">. </w:t>
-      </w:r>
-      <w:r>
-        <w:rPr>
-          <w:b/>
-          <w:bCs/>
-        </w:rPr>
-        <w:t xml:space="preserve">The correct value is </w:t>
-      </w:r>
-      <w:r>
-        <w:rPr>
-          <w:b/>
-          <w:bCs/>
-          <w:i/>
-          <w:iCs/>
-        </w:rPr>
-        <w:t xml:space="preserve">A≈ 28.1</w:t>
-      </w:r>
-      <w:r>
-        <w:rPr>
-          <w:b/>
-          <w:bCs/>
-          <w:i/>
-          <w:iCs/>
-          <w:vertAlign w:val="superscript"/>
-        </w:rPr>
-        <w:t xml:space="preserve">°</w:t>
+        <w:t xml:space="preserve">The three angles add to 180°, and </w:t>
+      </w:r>
+      <w:r>
+        <w:rPr>
+          <w:i/>
+          <w:iCs/>
+        </w:rPr>
+        <w:t xml:space="preserve">C</w:t>
+      </w:r>
+      <w:r>
+        <w:t xml:space="preserve"> already uses 90°, so </w:t>
+      </w:r>
+      <w:r>
+        <w:rPr>
+          <w:i/>
+          <w:iCs/>
+        </w:rPr>
+        <w:t xml:space="preserve">A+B=90°</w:t>
+      </w:r>
+      <w:r>
+        <w:t xml:space="preserve">: </w:t>
+      </w:r>
+      <w:r>
+        <w:rPr>
+          <w:i/>
+          <w:iCs/>
+        </w:rPr>
+        <w:t xml:space="preserve">B=90°−28.1°=61.9°</w:t>
+      </w:r>
+      <w:r>
+        <w:t xml:space="preserve">. An angle of 151.9° could not even fit in a triangle that already has a right angle. The acute angles are equal only when the legs are equal, and 8 is not 15; and adding to 90° makes another angle bigger than 90°, which is impossible too. </w:t>
+      </w:r>
+      <w:r>
+        <w:rPr>
+          <w:b/>
+          <w:bCs/>
+          <w:i/>
+          <w:iCs/>
+        </w:rPr>
+        <w:t xml:space="preserve">B≈ 61.9°</w:t>
       </w:r>
       <w:r>
         <w:rPr>

</xml_diff>